<commit_message>
Update documentation and diagrams
Co-authored-by: aisrv0048 <aisrv0048@qiyi.com>
</commit_message>
<xml_diff>
--- a/docs/智慧课程协同平台说明书.docx
+++ b/docs/智慧课程协同平台说明书.docx
@@ -15,7 +15,7 @@
         <w:rPr>
           <w:b/>
         </w:rPr>
-        <w:t>版本：v1.0</w:t>
+        <w:t>版本：v1.1</w:t>
         <w:br/>
       </w:r>
       <w:r>
@@ -51,7 +51,7 @@
     </w:p>
     <w:p>
       <w:r>
-        <w:t>本说明书系统化描述“智慧课程协同平台”项目的需求、详细设计与数据库模型，为开发、测试、验收及维护提供统一依据。</w:t>
+        <w:t>本说明书系统化描述“智慧课程协同平台”项目的需求、整体架构、模块设计、数据模型与实施计划，为开发、测试、运维与评审提供统一依据，并作为课程设计答辩材料的重要组成部分。</w:t>
       </w:r>
     </w:p>
     <w:p>
@@ -64,7 +64,7 @@
     </w:p>
     <w:p>
       <w:r>
-        <w:t>文档覆盖系统背景、用户画像、功能与非功能需求、架构设计、接口、数据模型、流程图与评审前准备事项，不包含源代码与部署脚本。</w:t>
+        <w:t>文档覆盖项目背景、用户画像、功能与非功能需求、系统架构、业务流程、接口协议、数据库设计、部署运维策略及测试计划，不包含源代码、运行日志与测试报告。</w:t>
       </w:r>
     </w:p>
     <w:p>
@@ -80,7 +80,7 @@
         <w:pStyle w:val="ListBullet"/>
       </w:pPr>
       <w:r>
-        <w:t>指导教师</w:t>
+        <w:t>指导教师与评审专家</w:t>
       </w:r>
     </w:p>
     <w:p>
@@ -96,7 +96,7 @@
         <w:pStyle w:val="ListBullet"/>
       </w:pPr>
       <w:r>
-        <w:t>测试与运维人员</w:t>
+        <w:t>测试与运维工程师</w:t>
       </w:r>
     </w:p>
     <w:p>
@@ -160,7 +160,7 @@
         <w:pStyle w:val="ListBullet"/>
       </w:pPr>
       <w:r>
-        <w:t>项目组会议纪要及决策记录</w:t>
+        <w:t>项目组会议纪要、原型与决策记录</w:t>
       </w:r>
     </w:p>
     <w:p>
@@ -209,6 +209,22 @@
       </w:pPr>
       <w:r>
         <w:t>SLA：Service Level Agreement，服务级别协议</w:t>
+      </w:r>
+    </w:p>
+    <w:p>
+      <w:pPr>
+        <w:pStyle w:val="ListBullet"/>
+      </w:pPr>
+      <w:r>
+        <w:t>SSO：Single Sign-On，单点登录</w:t>
+      </w:r>
+    </w:p>
+    <w:p>
+      <w:pPr>
+        <w:pStyle w:val="ListBullet"/>
+      </w:pPr>
+      <w:r>
+        <w:t>CI/CD：持续集成 / 持续交付</w:t>
       </w:r>
     </w:p>
     <w:p>
@@ -221,7 +237,7 @@
     </w:p>
     <w:p>
       <w:r>
-        <w:t>“智慧课程协同平台”旨在整合课程资源管理、作业流转、学习分析与多渠道通知，解决传统课程设计场景中信息分散、统计困难与反馈慢的问题。</w:t>
+        <w:t>“智慧课程协同平台”整合课程资源、作业流转、学习分析与多渠道通知，致力于解决传统课程设计场景中信息分散、统计困难与反馈周期长的问题。系统以云原生架构构建，强调高可用性、可扩展性与可维护性。</w:t>
       </w:r>
     </w:p>
     <w:p>
@@ -229,12 +245,12 @@
         <w:pStyle w:val="Heading2"/>
       </w:pPr>
       <w:r>
-        <w:t>背景与目标</w:t>
+        <w:t>1.1 建设目标</w:t>
       </w:r>
     </w:p>
     <w:p>
       <w:r>
-        <w:t>为高校课程设计提供统一门户，支撑教师布置任务、学生协作提交、管理员统计导出。目标包括：提高作业提交准时率 20%，缩短反馈周期 30%，提升教学互动体验。</w:t>
+        <w:t>构建统一的课程协同门户，使教师、学生与管理员在同一平台完成资源共享、作业管理、数据分析与通知推送，预期将作业准时提交率提升 20%，教师批阅效率提升 30%。</w:t>
       </w:r>
     </w:p>
     <w:p>
@@ -242,12 +258,12 @@
         <w:pStyle w:val="Heading2"/>
       </w:pPr>
       <w:r>
-        <w:t>核心价值</w:t>
+        <w:t>1.2 核心价值</w:t>
       </w:r>
     </w:p>
     <w:p>
       <w:r>
-        <w:t>一站式协同、实时数据洞察、跨端提醒、可配置策略。</w:t>
+        <w:t>提供一站式协作体验、实时数据洞察、跨端通知、可配置策略，并对接学校统一身份认证体系。</w:t>
       </w:r>
     </w:p>
     <w:p>
@@ -255,12 +271,12 @@
         <w:pStyle w:val="Heading2"/>
       </w:pPr>
       <w:r>
-        <w:t>架构概览</w:t>
+        <w:t>1.3 系统架构概览</w:t>
       </w:r>
     </w:p>
     <w:p>
       <w:r>
-        <w:t>前端采用 Vue 3 + Vite，后端 Spring Boot 微服务架构，PostgreSQL 持久化，Redis 缓存，RabbitMQ 通知，部署在学校私有云 Kubernetes 集群。</w:t>
+        <w:t>前端采用 Vue 3 + Vite，后端基于 Spring Boot 微服务体系，PostgreSQL 作为核心数据库，Redis 缓存热点数据，RabbitMQ 完成事件异步解耦，整套系统部署在学校私有云 Kubernetes 集群。</w:t>
       </w:r>
     </w:p>
     <w:p>
@@ -268,12 +284,12 @@
         <w:pStyle w:val="Heading2"/>
       </w:pPr>
       <w:r>
-        <w:t>发布计划</w:t>
+        <w:t>1.4 发布计划</w:t>
       </w:r>
     </w:p>
     <w:p>
       <w:r>
-        <w:t>Sprint1（第2周）完成认证与课程列表；Sprint2（第4周）上线资源管理与作业流程；Sprint3（第6周）提供学习分析与通知；第8周交付 MVP 及验收材料。</w:t>
+        <w:t>Sprint1（第2周）：完成认证、课程列表与基础数据。Sprint2（第4周）：交付资源管理与作业流程。Sprint3（第6周）：上线学习分析与通知中心。第8周举行课程验收与答辩。</w:t>
       </w:r>
     </w:p>
     <w:p>
@@ -289,7 +305,7 @@
         <w:pStyle w:val="ListBullet"/>
       </w:pPr>
       <w:r>
-        <w:t>学生：大二至大四，关注作业提醒、提交状态与反馈。</w:t>
+        <w:t>学生：大二至大四课程设计学生，每周登录 3-5 次，关注作业提醒、提交状态、成绩反馈与讨论互动。</w:t>
       </w:r>
     </w:p>
     <w:p>
@@ -297,7 +313,7 @@
         <w:pStyle w:val="ListBullet"/>
       </w:pPr>
       <w:r>
-        <w:t>教师：授课教师与助教，负责布置、批阅、统计成绩，需要跨终端访问。</w:t>
+        <w:t>教师：授课教师与助教，负责布置作业、批阅、统计成绩，需要移动端快速审批。</w:t>
       </w:r>
     </w:p>
     <w:p>
@@ -305,7 +321,7 @@
         <w:pStyle w:val="ListBullet"/>
       </w:pPr>
       <w:r>
-        <w:t>课程管理员：教学秘书，维护课程、导出报表，保障数据准确。</w:t>
+        <w:t>课程管理员：教学秘书，维护课程、处理选课、导出报表，关注数据准确性与权限控制。</w:t>
       </w:r>
     </w:p>
     <w:p>
@@ -313,7 +329,7 @@
         <w:pStyle w:val="ListBullet"/>
       </w:pPr>
       <w:r>
-        <w:t>痛点：线下通知零散、统计耗时、缺乏学习反馈；平台通过统一门户与仪表盘解决。</w:t>
+        <w:t>用户痛点：传统平台提醒不及时、作业统计繁琐、缺乏学习数据反馈，平台通过统一门户、工作流自动化与仪表盘可视化解决上述痛点。</w:t>
       </w:r>
     </w:p>
     <w:p>
@@ -329,7 +345,7 @@
         <w:pStyle w:val="ListBullet"/>
       </w:pPr>
       <w:r>
-        <w:t>编码规范：遵守学校命名与注释要求，前端遵循学院 UI 色板与组件规范。</w:t>
+        <w:t>开发规范：遵循学校命名规范与代码审查标准，前端遵循学院 UI 色板、组件使用与排版规范。</w:t>
       </w:r>
     </w:p>
     <w:p>
@@ -337,7 +353,7 @@
         <w:pStyle w:val="ListBullet"/>
       </w:pPr>
       <w:r>
-        <w:t>安全与隐私：数据传输全程 HTTPS，敏感字段加密存储，日志保留 180 天。</w:t>
+        <w:t>安全隐私：符合高校信息化安全标准，数据传输强制 HTTPS，敏感字段采用 AES-256 加密存储，所有访问日志保留 180 天。</w:t>
       </w:r>
     </w:p>
     <w:p>
@@ -345,7 +361,7 @@
         <w:pStyle w:val="ListBullet"/>
       </w:pPr>
       <w:r>
-        <w:t>可访问性：符合 WCAG 2.1 AA 级别，支持键盘导航、辅助阅读。</w:t>
+        <w:t>可访问性：对齐 WCAG 2.1 AA 要求，提供键盘导航、辅助标签与高对比度模式。</w:t>
       </w:r>
     </w:p>
     <w:p>
@@ -353,7 +369,15 @@
         <w:pStyle w:val="ListBullet"/>
       </w:pPr>
       <w:r>
-        <w:t>兼容性：Chrome/Firefox/Edge ≥110，Safari ≥15，移动端适配 iOS15 与 Android11。</w:t>
+        <w:t>兼容性：支持 Chrome/Firefox/Edge ≥110、Safari ≥15，移动端适配 iOS15、Android11。</w:t>
+      </w:r>
+    </w:p>
+    <w:p>
+      <w:pPr>
+        <w:pStyle w:val="ListBullet"/>
+      </w:pPr>
+      <w:r>
+        <w:t>接口规范：RESTful JSON 接口遵守 RFC 9110，使用 OpenAPI 3.0 描述并自动生成文档。</w:t>
       </w:r>
     </w:p>
     <w:p>
@@ -366,7 +390,7 @@
     </w:p>
     <w:p>
       <w:r>
-        <w:t>功能按模块划分如下：</w:t>
+        <w:t>系统核心功能按照六大模块划分如下。</w:t>
       </w:r>
     </w:p>
     <w:p>
@@ -438,7 +462,7 @@
         <w:pStyle w:val="ListBullet"/>
       </w:pPr>
       <w:r>
-        <w:t>角色管理：管理员可创建角色、配置菜单权限，采用 RBAC 模型。</w:t>
+        <w:t>角色管理：管理员按角色配置菜单与接口权限，支持自定义角色与权限继承。</w:t>
       </w:r>
     </w:p>
     <w:p>
@@ -446,7 +470,15 @@
         <w:pStyle w:val="ListBullet"/>
       </w:pPr>
       <w:r>
-        <w:t>用户同步：每日 2 点与教务系统同步课程成员，失败自动重试并告警。</w:t>
+        <w:t>用户同步：每日 02:00 调用教务系统 API，同步课程成员；失败自动重试并发送报警。</w:t>
+      </w:r>
+    </w:p>
+    <w:p>
+      <w:pPr>
+        <w:pStyle w:val="ListBullet"/>
+      </w:pPr>
+      <w:r>
+        <w:t>权限审计：记录用户关键访问行为，为安全审计提供依据。</w:t>
       </w:r>
     </w:p>
     <w:p>
@@ -462,7 +494,7 @@
         <w:pStyle w:val="ListBullet"/>
       </w:pPr>
       <w:r>
-        <w:t>课程空间创建：教师创建课程并配置班级、学期、标签，管理员审核后公开。</w:t>
+        <w:t>课程空间创建：教师创建课程并设置班级、学期、标签，管理员审核后公开。</w:t>
       </w:r>
     </w:p>
     <w:p>
@@ -470,7 +502,7 @@
         <w:pStyle w:val="ListBullet"/>
       </w:pPr>
       <w:r>
-        <w:t>资源上传与版本控制：支持视频/文档/PPT，单文件 ≤500MB，保留最近 5 个版本并可回滚。</w:t>
+        <w:t>资源上传与版本控制：单文件 ≤500MB，自动生成预览，保留最近 5 个版本并支持回滚。</w:t>
       </w:r>
     </w:p>
     <w:p>
@@ -478,7 +510,15 @@
         <w:pStyle w:val="ListBullet"/>
       </w:pPr>
       <w:r>
-        <w:t>标签检索：按标题、标签、上传者多条件检索，响应时间 ≤2 秒。</w:t>
+        <w:t>标签检索与收藏：支持多条件筛选、收藏与常用资源快捷访问。</w:t>
+      </w:r>
+    </w:p>
+    <w:p>
+      <w:pPr>
+        <w:pStyle w:val="ListBullet"/>
+      </w:pPr>
+      <w:r>
+        <w:t>资源权限：区分公共资源与班级独享资源，开放接口供 LMS 集成。</w:t>
       </w:r>
     </w:p>
     <w:p>
@@ -494,7 +534,7 @@
         <w:pStyle w:val="ListBullet"/>
       </w:pPr>
       <w:r>
-        <w:t>作业布置：设置题目、截止时间、评分标准，支持导入 Markdown 模板。</w:t>
+        <w:t>作业布置：配置题目、截止时间、评分 Rubric，支持从模板库导入。</w:t>
       </w:r>
     </w:p>
     <w:p>
@@ -502,7 +542,7 @@
         <w:pStyle w:val="ListBullet"/>
       </w:pPr>
       <w:r>
-        <w:t>学生提交：多附件上传、自动保存草稿，截止前允许多次提交。</w:t>
+        <w:t>学生提交：多附件上传、自动保存草稿，截止前允许覆盖提交并保留历史。</w:t>
       </w:r>
     </w:p>
     <w:p>
@@ -510,7 +550,7 @@
         <w:pStyle w:val="ListBullet"/>
       </w:pPr>
       <w:r>
-        <w:t>批阅与反馈：教师在线批注、评分、批量下载；发布点评即时通知。</w:t>
+        <w:t>批阅与反馈：教师在线批注、评分、批量下载；可引用 Rubric 快速评分。</w:t>
       </w:r>
     </w:p>
     <w:p>
@@ -518,7 +558,7 @@
         <w:pStyle w:val="ListBullet"/>
       </w:pPr>
       <w:r>
-        <w:t>迟交处理：自动标记超期提交，支持固定扣分、比例扣分或人工判定。</w:t>
+        <w:t>迟交处理：内置固定扣分、比例扣分、人工审批策略，并记录扣分原因。</w:t>
       </w:r>
     </w:p>
     <w:p>
@@ -534,7 +574,7 @@
         <w:pStyle w:val="ListBullet"/>
       </w:pPr>
       <w:r>
-        <w:t>班级仪表盘：显示提交率、平均分、知识点掌握热力图。</w:t>
+        <w:t>班级仪表盘：展示提交率、平均分、知识点掌握度热力图与滞后学生名单。</w:t>
       </w:r>
     </w:p>
     <w:p>
@@ -542,7 +582,7 @@
         <w:pStyle w:val="ListBullet"/>
       </w:pPr>
       <w:r>
-        <w:t>个人学习轨迹：展示成绩趋势、反馈记录、线上学习时长。</w:t>
+        <w:t>个人学习轨迹：展示成绩趋势、反馈历史、线上学习时长与活跃度。</w:t>
       </w:r>
     </w:p>
     <w:p>
@@ -550,7 +590,15 @@
         <w:pStyle w:val="ListBullet"/>
       </w:pPr>
       <w:r>
-        <w:t>导出报表：支持 CSV/PDF，生成时间 ≤10 秒。</w:t>
+        <w:t>导出报表：支持 CSV/PDF/Excel，生成时间 ≤10 秒，并可邮件发送。</w:t>
+      </w:r>
+    </w:p>
+    <w:p>
+      <w:pPr>
+        <w:pStyle w:val="ListBullet"/>
+      </w:pPr>
+      <w:r>
+        <w:t>指标自定义：教师可选择 KPI 指标，如提交及时率、优秀率、活跃度等。</w:t>
       </w:r>
     </w:p>
     <w:p>
@@ -566,7 +614,7 @@
         <w:pStyle w:val="ListBullet"/>
       </w:pPr>
       <w:r>
-        <w:t>多渠道通知：站内信、邮件、企业微信提醒截止 24 小时前发送。</w:t>
+        <w:t>多渠道通知：在截止前 24 小时与 1 小时自动推送站内信、邮件、企业微信。</w:t>
       </w:r>
     </w:p>
     <w:p>
@@ -574,7 +622,7 @@
         <w:pStyle w:val="ListBullet"/>
       </w:pPr>
       <w:r>
-        <w:t>讨论区：支持话题分类、富文本、引用、@ 功能。</w:t>
+        <w:t>讨论区：按话题组织讨论，支持富文本、引用、附件与 @ 功能。</w:t>
       </w:r>
     </w:p>
     <w:p>
@@ -582,7 +630,15 @@
         <w:pStyle w:val="ListBullet"/>
       </w:pPr>
       <w:r>
-        <w:t>FAQ 智能检索：基于 TF-IDF 推荐历史问题答案。</w:t>
+        <w:t>FAQ 智能检索：基于 TF-IDF 与关键词抽取推荐历史答案。</w:t>
+      </w:r>
+    </w:p>
+    <w:p>
+      <w:pPr>
+        <w:pStyle w:val="ListBullet"/>
+      </w:pPr>
+      <w:r>
+        <w:t>公告中心：管理员发布系统公告，支持定时发布与阅读统计。</w:t>
       </w:r>
     </w:p>
     <w:p>
@@ -598,7 +654,7 @@
         <w:pStyle w:val="ListBullet"/>
       </w:pPr>
       <w:r>
-        <w:t>健康监控：Prometheus + Grafana 采集与展示关键指标，异常触发告警。</w:t>
+        <w:t>健康监控：Prometheus + Grafana 全量接入，设置 CPU、内存、响应时间告警阈值。</w:t>
       </w:r>
     </w:p>
     <w:p>
@@ -606,7 +662,23 @@
         <w:pStyle w:val="ListBullet"/>
       </w:pPr>
       <w:r>
-        <w:t>日志审计：关键操作写入 Elasticsearch，支持追踪查询。</w:t>
+        <w:t>日志审计：关键操作写入 Elasticsearch，提供 Kibana 可视化检索。</w:t>
+      </w:r>
+    </w:p>
+    <w:p>
+      <w:pPr>
+        <w:pStyle w:val="ListBullet"/>
+      </w:pPr>
+      <w:r>
+        <w:t>配置中心：Spring Cloud Config 存储配置，支持灰度发布与回滚。</w:t>
+      </w:r>
+    </w:p>
+    <w:p>
+      <w:pPr>
+        <w:pStyle w:val="ListBullet"/>
+      </w:pPr>
+      <w:r>
+        <w:t>备份策略：数据库每日全量 + WAL 备份，对象存储开启版本控制。</w:t>
       </w:r>
     </w:p>
     <w:p>
@@ -671,7 +743,7 @@
         <w:pStyle w:val="ListBullet"/>
       </w:pPr>
       <w:r>
-        <w:t>统一蓝白配色与组件化设计，移动端采用响应式布局。</w:t>
+        <w:t>统一蓝白配色，主字体采用思源黑体，支持暗色模式。</w:t>
       </w:r>
     </w:p>
     <w:p>
@@ -679,7 +751,7 @@
         <w:pStyle w:val="ListBullet"/>
       </w:pPr>
       <w:r>
-        <w:t>关键操作路径不超过 3 步，按钮对比度≥4.5:1。</w:t>
+        <w:t>关键操作路径不超过 3 步，按钮对比度≥4.5:1，输入框提供即时校验提示。</w:t>
       </w:r>
     </w:p>
     <w:p>
@@ -687,7 +759,7 @@
         <w:pStyle w:val="ListBullet"/>
       </w:pPr>
       <w:r>
-        <w:t>提供新手引导与操作提示，首屏渲染 ≤2 秒。</w:t>
+        <w:t>提供新手引导、功能引导视频与操作手册下载，首屏渲染 ≤2 秒。</w:t>
       </w:r>
     </w:p>
     <w:p>
@@ -703,7 +775,7 @@
         <w:pStyle w:val="ListBullet"/>
       </w:pPr>
       <w:r>
-        <w:t>开发环境：JDK17、Node.js18、Vue3、Spring Boot3.2、PostgreSQL15。</w:t>
+        <w:t>开发环境：JDK17、Node.js18、Vue3、Spring Boot3.2、Gradle8、PostgreSQL15。</w:t>
       </w:r>
     </w:p>
     <w:p>
@@ -711,7 +783,7 @@
         <w:pStyle w:val="ListBullet"/>
       </w:pPr>
       <w:r>
-        <w:t>运行环境：Kubernetes1.29、Nginx、Redis7、RabbitMQ3.12。</w:t>
+        <w:t>运行环境：Kubernetes1.29（3 节点）、Nginx、Redis7、RabbitMQ3.12、Elastic Stack8。</w:t>
       </w:r>
     </w:p>
     <w:p>
@@ -719,7 +791,7 @@
         <w:pStyle w:val="ListBullet"/>
       </w:pPr>
       <w:r>
-        <w:t>部署流程：GitLab CI 持续集成，SonarQube 质量扫描。</w:t>
+        <w:t>部署流程：GitLab CI 触发构建 -&gt; 单元测试 -&gt; SonarQube 扫描 -&gt; Docker 镜像 -&gt; Helm 部署。</w:t>
       </w:r>
     </w:p>
     <w:p>
@@ -735,7 +807,7 @@
         <w:pStyle w:val="ListBullet"/>
       </w:pPr>
       <w:r>
-        <w:t>性能：并发 500 用户，95% 请求 ≤1.5 秒；作业导出 ≥100 份/分钟。</w:t>
+        <w:t>性能：并发 500 用户时 95% 请求 ≤1.5 秒；作业批量导出吞吐 ≥100 份/分钟。</w:t>
       </w:r>
     </w:p>
     <w:p>
@@ -743,7 +815,7 @@
         <w:pStyle w:val="ListBullet"/>
       </w:pPr>
       <w:r>
-        <w:t>可靠性：月可用性≥99.5%，故障恢复时间 ≤30 分钟。</w:t>
+        <w:t>可靠性：月可用性≥99.5%，支持蓝绿发布，故障平均恢复时间 ≤30 分钟。</w:t>
       </w:r>
     </w:p>
     <w:p>
@@ -751,7 +823,7 @@
         <w:pStyle w:val="ListBullet"/>
       </w:pPr>
       <w:r>
-        <w:t>安全性：OAuth2.0 登录，AES-256 静态加密，敏感操作双因素认证。</w:t>
+        <w:t>安全性：OAuth2.0 登录，AES-256 静态加密，敏感操作双因素认证，支持 RBAC 与审计。</w:t>
       </w:r>
     </w:p>
     <w:p>
@@ -759,7 +831,7 @@
         <w:pStyle w:val="ListBullet"/>
       </w:pPr>
       <w:r>
-        <w:t>可维护性：单元测试覆盖率≥70%，API 文档自动生成。</w:t>
+        <w:t>可维护性：单元测试覆盖率≥70%，集成测试覆盖核心流程≥50%，Swagger 自动生成接口文档。</w:t>
       </w:r>
     </w:p>
     <w:p>
@@ -767,7 +839,7 @@
         <w:pStyle w:val="ListBullet"/>
       </w:pPr>
       <w:r>
-        <w:t>可扩展性：微服务可独立扩容，缓存策略可配置。</w:t>
+        <w:t>可扩展性：微服务可横向扩容，缓存与队列策略可动态调整。</w:t>
       </w:r>
     </w:p>
     <w:p>
@@ -783,7 +855,7 @@
         <w:pStyle w:val="ListBullet"/>
       </w:pPr>
       <w:r>
-        <w:t>国际化支持中英文切换，时间与数字格式本地化。</w:t>
+        <w:t>国际化：支持中/英文切换，日期、数字、时区自动本地化。</w:t>
       </w:r>
     </w:p>
     <w:p>
@@ -791,7 +863,7 @@
         <w:pStyle w:val="ListBullet"/>
       </w:pPr>
       <w:r>
-        <w:t>提供 2 小时线上培训与用户手册/FAQ。</w:t>
+        <w:t>培训与支持：提供 2 小时线上培训、用户手册、FAQ 与工单系统。</w:t>
       </w:r>
     </w:p>
     <w:p>
@@ -799,7 +871,7 @@
         <w:pStyle w:val="ListBullet"/>
       </w:pPr>
       <w:r>
-        <w:t>符合学校数据治理与《个人信息保护法》要求。</w:t>
+        <w:t>合规性：遵守学校数据治理规范与《个人信息保护法》。</w:t>
       </w:r>
     </w:p>
     <w:p>
@@ -943,7 +1015,7 @@
     </w:p>
     <w:p>
       <w:r>
-        <w:t>系统采用前后端分离与微服务架构，通过 API 网关统一鉴权与路由，业务服务按领域拆分。部署在 Kubernetes 集群，配套 Prometheus/Grafana 监控。</w:t>
+        <w:t>平台采用前后端分离 + 微服务架构，通过 API 网关统一鉴权与流量管理，业务服务按领域拆分，所有服务通过消息队列与配置中心保持解耦，并接入统一监控体系。</w:t>
       </w:r>
     </w:p>
     <w:p>
@@ -1008,7 +1080,7 @@
         <w:pStyle w:val="ListBullet"/>
       </w:pPr>
       <w:r>
-        <w:t>职责：处理登录、JWT 签发、角色权限同步。</w:t>
+        <w:t>职责：处理登录、刷新 Token、角色权限同步与会话管理。</w:t>
       </w:r>
     </w:p>
     <w:p>
@@ -1016,7 +1088,7 @@
         <w:pStyle w:val="ListBullet"/>
       </w:pPr>
       <w:r>
-        <w:t>主要组件：AuthController、SSOClient、UserService、RoleService、TokenProvider。</w:t>
+        <w:t>核心组件：AuthController、SSOClient、UserService、RoleService、TokenProvider。</w:t>
       </w:r>
     </w:p>
     <w:p>
@@ -1024,7 +1096,7 @@
         <w:pStyle w:val="ListBullet"/>
       </w:pPr>
       <w:r>
-        <w:t>关键流程：验证凭证 -&gt; 查询用户与角色 -&gt; 生成 JWT/刷新令牌。</w:t>
+        <w:t>关键流程：验证凭证 -&gt; 查询用户、角色 -&gt; 生成 JWT 与刷新令牌，记录登录审计日志。</w:t>
       </w:r>
     </w:p>
     <w:p>
@@ -1040,7 +1112,7 @@
         <w:pStyle w:val="ListBullet"/>
       </w:pPr>
       <w:r>
-        <w:t>职责：课程元数据与资源管理。</w:t>
+        <w:t>职责：管理课程元数据、班级成员与课程公告。</w:t>
       </w:r>
     </w:p>
     <w:p>
@@ -1048,7 +1120,7 @@
         <w:pStyle w:val="ListBullet"/>
       </w:pPr>
       <w:r>
-        <w:t>主要组件：CourseController、ResourceController、CourseService、ResourceService、StorageClient。</w:t>
+        <w:t>核心组件：CourseController、CourseService、CourseRepository、AuditPublisher。</w:t>
       </w:r>
     </w:p>
     <w:p>
@@ -1056,7 +1128,39 @@
         <w:pStyle w:val="ListBullet"/>
       </w:pPr>
       <w:r>
-        <w:t>资源流程：上传对象 -&gt; 记录元数据 -&gt; 触发预览生成 -&gt; 更新版本信息。</w:t>
+        <w:t>设计要点：使用策略模式处理审批流程，支持与教务系统同步课程数据。</w:t>
+      </w:r>
+    </w:p>
+    <w:p>
+      <w:pPr>
+        <w:pStyle w:val="Heading3"/>
+      </w:pPr>
+      <w:r>
+        <w:t>资源服务（Resource Service）</w:t>
+      </w:r>
+    </w:p>
+    <w:p>
+      <w:pPr>
+        <w:pStyle w:val="ListBullet"/>
+      </w:pPr>
+      <w:r>
+        <w:t>职责：负责资源上传、版本控制、预览生成与访问权限。</w:t>
+      </w:r>
+    </w:p>
+    <w:p>
+      <w:pPr>
+        <w:pStyle w:val="ListBullet"/>
+      </w:pPr>
+      <w:r>
+        <w:t>核心组件：ResourceController、ResourceService、StorageClient（对接对象存储）、PreviewWorker。</w:t>
+      </w:r>
+    </w:p>
+    <w:p>
+      <w:pPr>
+        <w:pStyle w:val="ListBullet"/>
+      </w:pPr>
+      <w:r>
+        <w:t>设计要点：采用事件驱动生成预览，版本表记录历史元数据，权限与课程成员关联。</w:t>
       </w:r>
     </w:p>
     <w:p>
@@ -1072,7 +1176,7 @@
         <w:pStyle w:val="ListBullet"/>
       </w:pPr>
       <w:r>
-        <w:t>职责：作业布置、提交、批阅与迟交策略。</w:t>
+        <w:t>职责：作业布置、提交、批阅、迟交策略与成绩计算。</w:t>
       </w:r>
     </w:p>
     <w:p>
@@ -1080,7 +1184,7 @@
         <w:pStyle w:val="ListBullet"/>
       </w:pPr>
       <w:r>
-        <w:t>主要组件：AssignmentController、SubmissionService、ReviewService、LatePolicyEngine。</w:t>
+        <w:t>核心组件：AssignmentController、SubmissionService、ReviewService、LatePolicyEngine、RubricEvaluator。</w:t>
       </w:r>
     </w:p>
     <w:p>
@@ -1088,7 +1192,7 @@
         <w:pStyle w:val="ListBullet"/>
       </w:pPr>
       <w:r>
-        <w:t>策略：支持固定扣分、比例扣分、人工审核策略模式。</w:t>
+        <w:t>设计要点：迟交策略使用策略模式，RubricEvaluator 支持按标准项加权评分。</w:t>
       </w:r>
     </w:p>
     <w:p>
@@ -1104,7 +1208,7 @@
         <w:pStyle w:val="ListBullet"/>
       </w:pPr>
       <w:r>
-        <w:t>职责：学习数据聚合与报表导出。</w:t>
+        <w:t>职责：学习数据采集、指标计算、报表导出。</w:t>
       </w:r>
     </w:p>
     <w:p>
@@ -1112,7 +1216,7 @@
         <w:pStyle w:val="ListBullet"/>
       </w:pPr>
       <w:r>
-        <w:t>主要组件：AnalyticsScheduler、AnalyticsQueryService、ReportExporter。</w:t>
+        <w:t>核心组件：AnalyticsScheduler（ETL）、AnalyticsQueryService、DashboardBuilder、ReportExporter。</w:t>
       </w:r>
     </w:p>
     <w:p>
@@ -1120,7 +1224,7 @@
         <w:pStyle w:val="ListBullet"/>
       </w:pPr>
       <w:r>
-        <w:t>数据流：CDC 同步 -&gt; 定时聚合 -&gt; 提供仪表盘与报表。</w:t>
+        <w:t>设计要点：CDC 同步数据到分析库，定时聚合指标，缓存热点仪表盘。</w:t>
       </w:r>
     </w:p>
     <w:p>
@@ -1136,7 +1240,7 @@
         <w:pStyle w:val="ListBullet"/>
       </w:pPr>
       <w:r>
-        <w:t>职责：站内信、邮件、企业微信发送与模板管理。</w:t>
+        <w:t>职责：站内信、邮件、企业微信消息发送与模板管理。</w:t>
       </w:r>
     </w:p>
     <w:p>
@@ -1144,7 +1248,7 @@
         <w:pStyle w:val="ListBullet"/>
       </w:pPr>
       <w:r>
-        <w:t>主要组件：NotificationController、NotificationWorker、ChannelStrategy。</w:t>
+        <w:t>核心组件：NotificationController、NotificationWorker、ChannelStrategy（Mail/SMS/WeCom）、TemplateRepository。</w:t>
       </w:r>
     </w:p>
     <w:p>
@@ -1152,7 +1256,7 @@
         <w:pStyle w:val="ListBullet"/>
       </w:pPr>
       <w:r>
-        <w:t>流程：消息入队 -&gt; Worker 拉取 -&gt; 按渠道发送 -&gt; 记录状态。</w:t>
+        <w:t>设计要点：消息采用事件队列解耦，失败重试并记录状态。</w:t>
       </w:r>
     </w:p>
     <w:p>
@@ -1160,7 +1264,7 @@
         <w:pStyle w:val="Heading3"/>
       </w:pPr>
       <w:r>
-        <w:t>运维监控模块</w:t>
+        <w:t>运维监控模块（Ops Module）</w:t>
       </w:r>
     </w:p>
     <w:p>
@@ -1168,7 +1272,7 @@
         <w:pStyle w:val="ListBullet"/>
       </w:pPr>
       <w:r>
-        <w:t>职责：健康检查、指标暴露、审计日志。</w:t>
+        <w:t>职责：暴露健康检查、性能指标、审计日志。</w:t>
       </w:r>
     </w:p>
     <w:p>
@@ -1176,48 +1280,425 @@
         <w:pStyle w:val="ListBullet"/>
       </w:pPr>
       <w:r>
-        <w:t>组件：Spring Boot Actuator、Logback、Filebeat/Elasticsearch。</w:t>
+        <w:t>核心组件：Spring Boot Actuator、Logback、Filebeat、Elasticsearch、Grafana Dashboard。</w:t>
       </w:r>
     </w:p>
     <w:p>
+      <w:pPr>
+        <w:pStyle w:val="Heading2"/>
+      </w:pPr>
       <w:r>
-        <w:drawing>
-          <wp:inline xmlns:a="http://schemas.openxmlformats.org/drawingml/2006/main" xmlns:pic="http://schemas.openxmlformats.org/drawingml/2006/picture">
-            <wp:extent cx="5029200" cy="3560212"/>
-            <wp:docPr id="6" name="Picture 6"/>
-            <wp:cNvGraphicFramePr>
-              <a:graphicFrameLocks noChangeAspect="1"/>
-            </wp:cNvGraphicFramePr>
-            <a:graphic>
-              <a:graphicData uri="http://schemas.openxmlformats.org/drawingml/2006/picture">
-                <pic:pic>
-                  <pic:nvPicPr>
-                    <pic:cNvPr id="0" name="assignment_sequence.png"/>
-                    <pic:cNvPicPr/>
-                  </pic:nvPicPr>
-                  <pic:blipFill>
-                    <a:blip r:embed="rId11"/>
-                    <a:stretch>
-                      <a:fillRect/>
-                    </a:stretch>
-                  </pic:blipFill>
-                  <pic:spPr>
-                    <a:xfrm>
-                      <a:off x="0" y="0"/>
-                      <a:ext cx="5029200" cy="3560212"/>
-                    </a:xfrm>
-                    <a:prstGeom prst="rect"/>
-                  </pic:spPr>
-                </pic:pic>
-              </a:graphicData>
-            </a:graphic>
-          </wp:inline>
-        </w:drawing>
+        <w:t>6.3 组件接口与依赖</w:t>
+      </w:r>
+    </w:p>
+    <w:tbl>
+      <w:tblPr>
+        <w:tblStyle w:val="LightList-Accent1"/>
+        <w:tblW w:type="auto" w:w="0"/>
+        <w:tblLook w:firstColumn="1" w:firstRow="1" w:lastColumn="0" w:lastRow="0" w:noHBand="0" w:noVBand="1" w:val="04A0"/>
+      </w:tblPr>
+      <w:tblGrid>
+        <w:gridCol w:w="1728"/>
+        <w:gridCol w:w="1728"/>
+        <w:gridCol w:w="1728"/>
+        <w:gridCol w:w="1728"/>
+        <w:gridCol w:w="1728"/>
+      </w:tblGrid>
+      <w:tr>
+        <w:tc>
+          <w:tcPr>
+            <w:tcW w:type="dxa" w:w="1728"/>
+          </w:tcPr>
+          <w:p>
+            <w:r>
+              <w:t>调用方</w:t>
+            </w:r>
+          </w:p>
+        </w:tc>
+        <w:tc>
+          <w:tcPr>
+            <w:tcW w:type="dxa" w:w="1728"/>
+          </w:tcPr>
+          <w:p>
+            <w:r>
+              <w:t>被调方</w:t>
+            </w:r>
+          </w:p>
+        </w:tc>
+        <w:tc>
+          <w:tcPr>
+            <w:tcW w:type="dxa" w:w="1728"/>
+          </w:tcPr>
+          <w:p>
+            <w:r>
+              <w:t>协议</w:t>
+            </w:r>
+          </w:p>
+        </w:tc>
+        <w:tc>
+          <w:tcPr>
+            <w:tcW w:type="dxa" w:w="1728"/>
+          </w:tcPr>
+          <w:p>
+            <w:r>
+              <w:t>主要用途</w:t>
+            </w:r>
+          </w:p>
+        </w:tc>
+        <w:tc>
+          <w:tcPr>
+            <w:tcW w:type="dxa" w:w="1728"/>
+          </w:tcPr>
+          <w:p>
+            <w:r>
+              <w:t>安全控制</w:t>
+            </w:r>
+          </w:p>
+        </w:tc>
+      </w:tr>
+      <w:tr>
+        <w:tc>
+          <w:tcPr>
+            <w:tcW w:type="dxa" w:w="1728"/>
+          </w:tcPr>
+          <w:p>
+            <w:r>
+              <w:t>Web 前端</w:t>
+            </w:r>
+          </w:p>
+        </w:tc>
+        <w:tc>
+          <w:tcPr>
+            <w:tcW w:type="dxa" w:w="1728"/>
+          </w:tcPr>
+          <w:p>
+            <w:r>
+              <w:t>API 网关</w:t>
+            </w:r>
+          </w:p>
+        </w:tc>
+        <w:tc>
+          <w:tcPr>
+            <w:tcW w:type="dxa" w:w="1728"/>
+          </w:tcPr>
+          <w:p>
+            <w:r>
+              <w:t>HTTPS/REST</w:t>
+            </w:r>
+          </w:p>
+        </w:tc>
+        <w:tc>
+          <w:tcPr>
+            <w:tcW w:type="dxa" w:w="1728"/>
+          </w:tcPr>
+          <w:p>
+            <w:r>
+              <w:t>请求业务接口</w:t>
+            </w:r>
+          </w:p>
+        </w:tc>
+        <w:tc>
+          <w:tcPr>
+            <w:tcW w:type="dxa" w:w="1728"/>
+          </w:tcPr>
+          <w:p>
+            <w:r>
+              <w:t>JWT + HTTPS</w:t>
+            </w:r>
+          </w:p>
+        </w:tc>
+      </w:tr>
+      <w:tr>
+        <w:tc>
+          <w:tcPr>
+            <w:tcW w:type="dxa" w:w="1728"/>
+          </w:tcPr>
+          <w:p>
+            <w:r>
+              <w:t>API 网关</w:t>
+            </w:r>
+          </w:p>
+        </w:tc>
+        <w:tc>
+          <w:tcPr>
+            <w:tcW w:type="dxa" w:w="1728"/>
+          </w:tcPr>
+          <w:p>
+            <w:r>
+              <w:t>认证服务</w:t>
+            </w:r>
+          </w:p>
+        </w:tc>
+        <w:tc>
+          <w:tcPr>
+            <w:tcW w:type="dxa" w:w="1728"/>
+          </w:tcPr>
+          <w:p>
+            <w:r>
+              <w:t>HTTP</w:t>
+            </w:r>
+          </w:p>
+        </w:tc>
+        <w:tc>
+          <w:tcPr>
+            <w:tcW w:type="dxa" w:w="1728"/>
+          </w:tcPr>
+          <w:p>
+            <w:r>
+              <w:t>统一鉴权与 Token 校验</w:t>
+            </w:r>
+          </w:p>
+        </w:tc>
+        <w:tc>
+          <w:tcPr>
+            <w:tcW w:type="dxa" w:w="1728"/>
+          </w:tcPr>
+          <w:p>
+            <w:r>
+              <w:t>内部网络 + mTLS</w:t>
+            </w:r>
+          </w:p>
+        </w:tc>
+      </w:tr>
+      <w:tr>
+        <w:tc>
+          <w:tcPr>
+            <w:tcW w:type="dxa" w:w="1728"/>
+          </w:tcPr>
+          <w:p>
+            <w:r>
+              <w:t>课程服务</w:t>
+            </w:r>
+          </w:p>
+        </w:tc>
+        <w:tc>
+          <w:tcPr>
+            <w:tcW w:type="dxa" w:w="1728"/>
+          </w:tcPr>
+          <w:p>
+            <w:r>
+              <w:t>作业服务</w:t>
+            </w:r>
+          </w:p>
+        </w:tc>
+        <w:tc>
+          <w:tcPr>
+            <w:tcW w:type="dxa" w:w="1728"/>
+          </w:tcPr>
+          <w:p>
+            <w:r>
+              <w:t>gRPC</w:t>
+            </w:r>
+          </w:p>
+        </w:tc>
+        <w:tc>
+          <w:tcPr>
+            <w:tcW w:type="dxa" w:w="1728"/>
+          </w:tcPr>
+          <w:p>
+            <w:r>
+              <w:t>查询作业关联课程信息</w:t>
+            </w:r>
+          </w:p>
+        </w:tc>
+        <w:tc>
+          <w:tcPr>
+            <w:tcW w:type="dxa" w:w="1728"/>
+          </w:tcPr>
+          <w:p>
+            <w:r>
+              <w:t>Service Account + mTLS</w:t>
+            </w:r>
+          </w:p>
+        </w:tc>
+      </w:tr>
+      <w:tr>
+        <w:tc>
+          <w:tcPr>
+            <w:tcW w:type="dxa" w:w="1728"/>
+          </w:tcPr>
+          <w:p>
+            <w:r>
+              <w:t>作业服务</w:t>
+            </w:r>
+          </w:p>
+        </w:tc>
+        <w:tc>
+          <w:tcPr>
+            <w:tcW w:type="dxa" w:w="1728"/>
+          </w:tcPr>
+          <w:p>
+            <w:r>
+              <w:t>通知服务</w:t>
+            </w:r>
+          </w:p>
+        </w:tc>
+        <w:tc>
+          <w:tcPr>
+            <w:tcW w:type="dxa" w:w="1728"/>
+          </w:tcPr>
+          <w:p>
+            <w:r>
+              <w:t>AMQP</w:t>
+            </w:r>
+          </w:p>
+        </w:tc>
+        <w:tc>
+          <w:tcPr>
+            <w:tcW w:type="dxa" w:w="1728"/>
+          </w:tcPr>
+          <w:p>
+            <w:r>
+              <w:t>提交与批阅事件通知</w:t>
+            </w:r>
+          </w:p>
+        </w:tc>
+        <w:tc>
+          <w:tcPr>
+            <w:tcW w:type="dxa" w:w="1728"/>
+          </w:tcPr>
+          <w:p>
+            <w:r>
+              <w:t>签名消息 + 队列权限</w:t>
+            </w:r>
+          </w:p>
+        </w:tc>
+      </w:tr>
+      <w:tr>
+        <w:tc>
+          <w:tcPr>
+            <w:tcW w:type="dxa" w:w="1728"/>
+          </w:tcPr>
+          <w:p>
+            <w:r>
+              <w:t>分析服务</w:t>
+            </w:r>
+          </w:p>
+        </w:tc>
+        <w:tc>
+          <w:tcPr>
+            <w:tcW w:type="dxa" w:w="1728"/>
+          </w:tcPr>
+          <w:p>
+            <w:r>
+              <w:t>PostgreSQL CDC</w:t>
+            </w:r>
+          </w:p>
+        </w:tc>
+        <w:tc>
+          <w:tcPr>
+            <w:tcW w:type="dxa" w:w="1728"/>
+          </w:tcPr>
+          <w:p>
+            <w:r>
+              <w:t>Debezium</w:t>
+            </w:r>
+          </w:p>
+        </w:tc>
+        <w:tc>
+          <w:tcPr>
+            <w:tcW w:type="dxa" w:w="1728"/>
+          </w:tcPr>
+          <w:p>
+            <w:r>
+              <w:t>同步增量数据</w:t>
+            </w:r>
+          </w:p>
+        </w:tc>
+        <w:tc>
+          <w:tcPr>
+            <w:tcW w:type="dxa" w:w="1728"/>
+          </w:tcPr>
+          <w:p>
+            <w:r>
+              <w:t>只读账号 + 白名单</w:t>
+            </w:r>
+          </w:p>
+        </w:tc>
+      </w:tr>
+      <w:tr>
+        <w:tc>
+          <w:tcPr>
+            <w:tcW w:type="dxa" w:w="1728"/>
+          </w:tcPr>
+          <w:p>
+            <w:r>
+              <w:t>通知服务</w:t>
+            </w:r>
+          </w:p>
+        </w:tc>
+        <w:tc>
+          <w:tcPr>
+            <w:tcW w:type="dxa" w:w="1728"/>
+          </w:tcPr>
+          <w:p>
+            <w:r>
+              <w:t>企业微信</w:t>
+            </w:r>
+          </w:p>
+        </w:tc>
+        <w:tc>
+          <w:tcPr>
+            <w:tcW w:type="dxa" w:w="1728"/>
+          </w:tcPr>
+          <w:p>
+            <w:r>
+              <w:t>HTTPS API</w:t>
+            </w:r>
+          </w:p>
+        </w:tc>
+        <w:tc>
+          <w:tcPr>
+            <w:tcW w:type="dxa" w:w="1728"/>
+          </w:tcPr>
+          <w:p>
+            <w:r>
+              <w:t>推送提醒</w:t>
+            </w:r>
+          </w:p>
+        </w:tc>
+        <w:tc>
+          <w:tcPr>
+            <w:tcW w:type="dxa" w:w="1728"/>
+          </w:tcPr>
+          <w:p>
+            <w:r>
+              <w:t>企业密钥 + IP 白名单</w:t>
+            </w:r>
+          </w:p>
+        </w:tc>
+      </w:tr>
+    </w:tbl>
+    <w:p>
+      <w:pPr>
+        <w:pStyle w:val="Heading2"/>
+      </w:pPr>
+      <w:r>
+        <w:t>6.4 关键业务流程说明</w:t>
       </w:r>
     </w:p>
     <w:p>
+      <w:pPr>
+        <w:pStyle w:val="ListNumber"/>
+      </w:pPr>
       <w:r>
-        <w:t>图 6-2 作业提交流程时序图</w:t>
+        <w:t>作业提交流程：学生在截止时间前完成作业填写，系统提供草稿保存、附件校验与提交确认。提交成功后产生事件进入队列，通知教师及时批阅。</w:t>
+      </w:r>
+    </w:p>
+    <w:p>
+      <w:pPr>
+        <w:pStyle w:val="ListNumber"/>
+      </w:pPr>
+      <w:r>
+        <w:t>资源上传流程：教师上传文件后写入元数据，生成版本记录，并异步触发预览任务，预览完成前状态展示为“处理中”。</w:t>
+      </w:r>
+    </w:p>
+    <w:p>
+      <w:pPr>
+        <w:pStyle w:val="ListNumber"/>
+      </w:pPr>
+      <w:r>
+        <w:t>迟交扣分流程：超时提交触发策略引擎，根据课程配置选择固定扣分、比例扣分或人工审核策略，并同步到成绩单。</w:t>
       </w:r>
     </w:p>
     <w:p>
@@ -1225,7 +1706,7 @@
         <w:drawing>
           <wp:inline xmlns:a="http://schemas.openxmlformats.org/drawingml/2006/main" xmlns:pic="http://schemas.openxmlformats.org/drawingml/2006/picture">
             <wp:extent cx="5029200" cy="2931562"/>
-            <wp:docPr id="7" name="Picture 7"/>
+            <wp:docPr id="6" name="Picture 6"/>
             <wp:cNvGraphicFramePr>
               <a:graphicFrameLocks noChangeAspect="1"/>
             </wp:cNvGraphicFramePr>
@@ -1258,7 +1739,7 @@
     </w:p>
     <w:p>
       <w:r>
-        <w:t>图 6-3 资源上传流程时序图</w:t>
+        <w:t>图 6-2 资源上传流程时序图</w:t>
       </w:r>
     </w:p>
     <w:p>
@@ -1266,7 +1747,7 @@
         <w:drawing>
           <wp:inline xmlns:a="http://schemas.openxmlformats.org/drawingml/2006/main" xmlns:pic="http://schemas.openxmlformats.org/drawingml/2006/picture">
             <wp:extent cx="5029200" cy="9764559"/>
-            <wp:docPr id="8" name="Picture 8"/>
+            <wp:docPr id="7" name="Picture 7"/>
             <wp:cNvGraphicFramePr>
               <a:graphicFrameLocks noChangeAspect="1"/>
             </wp:cNvGraphicFramePr>
@@ -1299,7 +1780,7 @@
     </w:p>
     <w:p>
       <w:r>
-        <w:t>图 6-4 迟交扣分决策流程图</w:t>
+        <w:t>图 6-3 迟交扣分决策流程图</w:t>
       </w:r>
     </w:p>
     <w:p>
@@ -1307,597 +1788,87 @@
         <w:pStyle w:val="Heading2"/>
       </w:pPr>
       <w:r>
-        <w:t>6.3 API 设计概览</w:t>
+        <w:t>6.5 配置与参数设计</w:t>
       </w:r>
     </w:p>
-    <w:tbl>
-      <w:tblPr>
-        <w:tblW w:type="auto" w:w="0"/>
-        <w:tblLook w:firstColumn="1" w:firstRow="1" w:lastColumn="0" w:lastRow="0" w:noHBand="0" w:noVBand="1" w:val="04A0"/>
-      </w:tblPr>
-      <w:tblGrid>
-        <w:gridCol w:w="1728"/>
-        <w:gridCol w:w="1728"/>
-        <w:gridCol w:w="1728"/>
-        <w:gridCol w:w="1728"/>
-        <w:gridCol w:w="1728"/>
-      </w:tblGrid>
-      <w:tr>
-        <w:tc>
-          <w:tcPr>
-            <w:tcW w:type="dxa" w:w="1728"/>
-          </w:tcPr>
-          <w:p>
-            <w:r>
-              <w:t>模块</w:t>
-            </w:r>
-          </w:p>
-        </w:tc>
-        <w:tc>
-          <w:tcPr>
-            <w:tcW w:type="dxa" w:w="1728"/>
-          </w:tcPr>
-          <w:p>
-            <w:r>
-              <w:t>方法</w:t>
-            </w:r>
-          </w:p>
-        </w:tc>
-        <w:tc>
-          <w:tcPr>
-            <w:tcW w:type="dxa" w:w="1728"/>
-          </w:tcPr>
-          <w:p>
-            <w:r>
-              <w:t>路径</w:t>
-            </w:r>
-          </w:p>
-        </w:tc>
-        <w:tc>
-          <w:tcPr>
-            <w:tcW w:type="dxa" w:w="1728"/>
-          </w:tcPr>
-          <w:p>
-            <w:r>
-              <w:t>描述</w:t>
-            </w:r>
-          </w:p>
-        </w:tc>
-        <w:tc>
-          <w:tcPr>
-            <w:tcW w:type="dxa" w:w="1728"/>
-          </w:tcPr>
-          <w:p>
-            <w:r>
-              <w:t>权限</w:t>
-            </w:r>
-          </w:p>
-        </w:tc>
-      </w:tr>
-      <w:tr>
-        <w:tc>
-          <w:tcPr>
-            <w:tcW w:type="dxa" w:w="1728"/>
-          </w:tcPr>
-          <w:p>
-            <w:r>
-              <w:t>Auth</w:t>
-            </w:r>
-          </w:p>
-        </w:tc>
-        <w:tc>
-          <w:tcPr>
-            <w:tcW w:type="dxa" w:w="1728"/>
-          </w:tcPr>
-          <w:p>
-            <w:r>
-              <w:t>POST</w:t>
-            </w:r>
-          </w:p>
-        </w:tc>
-        <w:tc>
-          <w:tcPr>
-            <w:tcW w:type="dxa" w:w="1728"/>
-          </w:tcPr>
-          <w:p>
-            <w:r>
-              <w:t>/auth/login</w:t>
-            </w:r>
-          </w:p>
-        </w:tc>
-        <w:tc>
-          <w:tcPr>
-            <w:tcW w:type="dxa" w:w="1728"/>
-          </w:tcPr>
-          <w:p>
-            <w:r>
-              <w:t>用户登录获取 Token</w:t>
-            </w:r>
-          </w:p>
-        </w:tc>
-        <w:tc>
-          <w:tcPr>
-            <w:tcW w:type="dxa" w:w="1728"/>
-          </w:tcPr>
-          <w:p>
-            <w:r>
-              <w:t>匿名</w:t>
-            </w:r>
-          </w:p>
-        </w:tc>
-      </w:tr>
-      <w:tr>
-        <w:tc>
-          <w:tcPr>
-            <w:tcW w:type="dxa" w:w="1728"/>
-          </w:tcPr>
-          <w:p>
-            <w:r>
-              <w:t>Auth</w:t>
-            </w:r>
-          </w:p>
-        </w:tc>
-        <w:tc>
-          <w:tcPr>
-            <w:tcW w:type="dxa" w:w="1728"/>
-          </w:tcPr>
-          <w:p>
-            <w:r>
-              <w:t>POST</w:t>
-            </w:r>
-          </w:p>
-        </w:tc>
-        <w:tc>
-          <w:tcPr>
-            <w:tcW w:type="dxa" w:w="1728"/>
-          </w:tcPr>
-          <w:p>
-            <w:r>
-              <w:t>/auth/refresh</w:t>
-            </w:r>
-          </w:p>
-        </w:tc>
-        <w:tc>
-          <w:tcPr>
-            <w:tcW w:type="dxa" w:w="1728"/>
-          </w:tcPr>
-          <w:p>
-            <w:r>
-              <w:t>刷新 Token</w:t>
-            </w:r>
-          </w:p>
-        </w:tc>
-        <w:tc>
-          <w:tcPr>
-            <w:tcW w:type="dxa" w:w="1728"/>
-          </w:tcPr>
-          <w:p>
-            <w:r>
-              <w:t>登录用户</w:t>
-            </w:r>
-          </w:p>
-        </w:tc>
-      </w:tr>
-      <w:tr>
-        <w:tc>
-          <w:tcPr>
-            <w:tcW w:type="dxa" w:w="1728"/>
-          </w:tcPr>
-          <w:p>
-            <w:r>
-              <w:t>Course</w:t>
-            </w:r>
-          </w:p>
-        </w:tc>
-        <w:tc>
-          <w:tcPr>
-            <w:tcW w:type="dxa" w:w="1728"/>
-          </w:tcPr>
-          <w:p>
-            <w:r>
-              <w:t>POST</w:t>
-            </w:r>
-          </w:p>
-        </w:tc>
-        <w:tc>
-          <w:tcPr>
-            <w:tcW w:type="dxa" w:w="1728"/>
-          </w:tcPr>
-          <w:p>
-            <w:r>
-              <w:t>/courses</w:t>
-            </w:r>
-          </w:p>
-        </w:tc>
-        <w:tc>
-          <w:tcPr>
-            <w:tcW w:type="dxa" w:w="1728"/>
-          </w:tcPr>
-          <w:p>
-            <w:r>
-              <w:t>创建课程</w:t>
-            </w:r>
-          </w:p>
-        </w:tc>
-        <w:tc>
-          <w:tcPr>
-            <w:tcW w:type="dxa" w:w="1728"/>
-          </w:tcPr>
-          <w:p>
-            <w:r>
-              <w:t>教师/管理员</w:t>
-            </w:r>
-          </w:p>
-        </w:tc>
-      </w:tr>
-      <w:tr>
-        <w:tc>
-          <w:tcPr>
-            <w:tcW w:type="dxa" w:w="1728"/>
-          </w:tcPr>
-          <w:p>
-            <w:r>
-              <w:t>Course</w:t>
-            </w:r>
-          </w:p>
-        </w:tc>
-        <w:tc>
-          <w:tcPr>
-            <w:tcW w:type="dxa" w:w="1728"/>
-          </w:tcPr>
-          <w:p>
-            <w:r>
-              <w:t>GET</w:t>
-            </w:r>
-          </w:p>
-        </w:tc>
-        <w:tc>
-          <w:tcPr>
-            <w:tcW w:type="dxa" w:w="1728"/>
-          </w:tcPr>
-          <w:p>
-            <w:r>
-              <w:t>/courses/{id}</w:t>
-            </w:r>
-          </w:p>
-        </w:tc>
-        <w:tc>
-          <w:tcPr>
-            <w:tcW w:type="dxa" w:w="1728"/>
-          </w:tcPr>
-          <w:p>
-            <w:r>
-              <w:t>查询课程详情</w:t>
-            </w:r>
-          </w:p>
-        </w:tc>
-        <w:tc>
-          <w:tcPr>
-            <w:tcW w:type="dxa" w:w="1728"/>
-          </w:tcPr>
-          <w:p>
-            <w:r>
-              <w:t>课程成员</w:t>
-            </w:r>
-          </w:p>
-        </w:tc>
-      </w:tr>
-      <w:tr>
-        <w:tc>
-          <w:tcPr>
-            <w:tcW w:type="dxa" w:w="1728"/>
-          </w:tcPr>
-          <w:p>
-            <w:r>
-              <w:t>Resource</w:t>
-            </w:r>
-          </w:p>
-        </w:tc>
-        <w:tc>
-          <w:tcPr>
-            <w:tcW w:type="dxa" w:w="1728"/>
-          </w:tcPr>
-          <w:p>
-            <w:r>
-              <w:t>POST</w:t>
-            </w:r>
-          </w:p>
-        </w:tc>
-        <w:tc>
-          <w:tcPr>
-            <w:tcW w:type="dxa" w:w="1728"/>
-          </w:tcPr>
-          <w:p>
-            <w:r>
-              <w:t>/courses/{id}/resources</w:t>
-            </w:r>
-          </w:p>
-        </w:tc>
-        <w:tc>
-          <w:tcPr>
-            <w:tcW w:type="dxa" w:w="1728"/>
-          </w:tcPr>
-          <w:p>
-            <w:r>
-              <w:t>上传课程资源</w:t>
-            </w:r>
-          </w:p>
-        </w:tc>
-        <w:tc>
-          <w:tcPr>
-            <w:tcW w:type="dxa" w:w="1728"/>
-          </w:tcPr>
-          <w:p>
-            <w:r>
-              <w:t>教师</w:t>
-            </w:r>
-          </w:p>
-        </w:tc>
-      </w:tr>
-      <w:tr>
-        <w:tc>
-          <w:tcPr>
-            <w:tcW w:type="dxa" w:w="1728"/>
-          </w:tcPr>
-          <w:p>
-            <w:r>
-              <w:t>Assignment</w:t>
-            </w:r>
-          </w:p>
-        </w:tc>
-        <w:tc>
-          <w:tcPr>
-            <w:tcW w:type="dxa" w:w="1728"/>
-          </w:tcPr>
-          <w:p>
-            <w:r>
-              <w:t>POST</w:t>
-            </w:r>
-          </w:p>
-        </w:tc>
-        <w:tc>
-          <w:tcPr>
-            <w:tcW w:type="dxa" w:w="1728"/>
-          </w:tcPr>
-          <w:p>
-            <w:r>
-              <w:t>/courses/{id}/assignments</w:t>
-            </w:r>
-          </w:p>
-        </w:tc>
-        <w:tc>
-          <w:tcPr>
-            <w:tcW w:type="dxa" w:w="1728"/>
-          </w:tcPr>
-          <w:p>
-            <w:r>
-              <w:t>布置作业</w:t>
-            </w:r>
-          </w:p>
-        </w:tc>
-        <w:tc>
-          <w:tcPr>
-            <w:tcW w:type="dxa" w:w="1728"/>
-          </w:tcPr>
-          <w:p>
-            <w:r>
-              <w:t>教师</w:t>
-            </w:r>
-          </w:p>
-        </w:tc>
-      </w:tr>
-      <w:tr>
-        <w:tc>
-          <w:tcPr>
-            <w:tcW w:type="dxa" w:w="1728"/>
-          </w:tcPr>
-          <w:p>
-            <w:r>
-              <w:t>Assignment</w:t>
-            </w:r>
-          </w:p>
-        </w:tc>
-        <w:tc>
-          <w:tcPr>
-            <w:tcW w:type="dxa" w:w="1728"/>
-          </w:tcPr>
-          <w:p>
-            <w:r>
-              <w:t>POST</w:t>
-            </w:r>
-          </w:p>
-        </w:tc>
-        <w:tc>
-          <w:tcPr>
-            <w:tcW w:type="dxa" w:w="1728"/>
-          </w:tcPr>
-          <w:p>
-            <w:r>
-              <w:t>/assignments/{id}/submissions</w:t>
-            </w:r>
-          </w:p>
-        </w:tc>
-        <w:tc>
-          <w:tcPr>
-            <w:tcW w:type="dxa" w:w="1728"/>
-          </w:tcPr>
-          <w:p>
-            <w:r>
-              <w:t>提交作业</w:t>
-            </w:r>
-          </w:p>
-        </w:tc>
-        <w:tc>
-          <w:tcPr>
-            <w:tcW w:type="dxa" w:w="1728"/>
-          </w:tcPr>
-          <w:p>
-            <w:r>
-              <w:t>学生</w:t>
-            </w:r>
-          </w:p>
-        </w:tc>
-      </w:tr>
-      <w:tr>
-        <w:tc>
-          <w:tcPr>
-            <w:tcW w:type="dxa" w:w="1728"/>
-          </w:tcPr>
-          <w:p>
-            <w:r>
-              <w:t>Assignment</w:t>
-            </w:r>
-          </w:p>
-        </w:tc>
-        <w:tc>
-          <w:tcPr>
-            <w:tcW w:type="dxa" w:w="1728"/>
-          </w:tcPr>
-          <w:p>
-            <w:r>
-              <w:t>POST</w:t>
-            </w:r>
-          </w:p>
-        </w:tc>
-        <w:tc>
-          <w:tcPr>
-            <w:tcW w:type="dxa" w:w="1728"/>
-          </w:tcPr>
-          <w:p>
-            <w:r>
-              <w:t>/assignments/{id}/reviews</w:t>
-            </w:r>
-          </w:p>
-        </w:tc>
-        <w:tc>
-          <w:tcPr>
-            <w:tcW w:type="dxa" w:w="1728"/>
-          </w:tcPr>
-          <w:p>
-            <w:r>
-              <w:t>批阅与反馈</w:t>
-            </w:r>
-          </w:p>
-        </w:tc>
-        <w:tc>
-          <w:tcPr>
-            <w:tcW w:type="dxa" w:w="1728"/>
-          </w:tcPr>
-          <w:p>
-            <w:r>
-              <w:t>教师</w:t>
-            </w:r>
-          </w:p>
-        </w:tc>
-      </w:tr>
-      <w:tr>
-        <w:tc>
-          <w:tcPr>
-            <w:tcW w:type="dxa" w:w="1728"/>
-          </w:tcPr>
-          <w:p>
-            <w:r>
-              <w:t>Analytics</w:t>
-            </w:r>
-          </w:p>
-        </w:tc>
-        <w:tc>
-          <w:tcPr>
-            <w:tcW w:type="dxa" w:w="1728"/>
-          </w:tcPr>
-          <w:p>
-            <w:r>
-              <w:t>GET</w:t>
-            </w:r>
-          </w:p>
-        </w:tc>
-        <w:tc>
-          <w:tcPr>
-            <w:tcW w:type="dxa" w:w="1728"/>
-          </w:tcPr>
-          <w:p>
-            <w:r>
-              <w:t>/analytics/courses/{id}/dashboard</w:t>
-            </w:r>
-          </w:p>
-        </w:tc>
-        <w:tc>
-          <w:tcPr>
-            <w:tcW w:type="dxa" w:w="1728"/>
-          </w:tcPr>
-          <w:p>
-            <w:r>
-              <w:t>获取班级仪表盘</w:t>
-            </w:r>
-          </w:p>
-        </w:tc>
-        <w:tc>
-          <w:tcPr>
-            <w:tcW w:type="dxa" w:w="1728"/>
-          </w:tcPr>
-          <w:p>
-            <w:r>
-              <w:t>教师/管理员</w:t>
-            </w:r>
-          </w:p>
-        </w:tc>
-      </w:tr>
-      <w:tr>
-        <w:tc>
-          <w:tcPr>
-            <w:tcW w:type="dxa" w:w="1728"/>
-          </w:tcPr>
-          <w:p>
-            <w:r>
-              <w:t>Notification</w:t>
-            </w:r>
-          </w:p>
-        </w:tc>
-        <w:tc>
-          <w:tcPr>
-            <w:tcW w:type="dxa" w:w="1728"/>
-          </w:tcPr>
-          <w:p>
-            <w:r>
-              <w:t>POST</w:t>
-            </w:r>
-          </w:p>
-        </w:tc>
-        <w:tc>
-          <w:tcPr>
-            <w:tcW w:type="dxa" w:w="1728"/>
-          </w:tcPr>
-          <w:p>
-            <w:r>
-              <w:t>/notifications/send</w:t>
-            </w:r>
-          </w:p>
-        </w:tc>
-        <w:tc>
-          <w:tcPr>
-            <w:tcW w:type="dxa" w:w="1728"/>
-          </w:tcPr>
-          <w:p>
-            <w:r>
-              <w:t>发送自定义通知</w:t>
-            </w:r>
-          </w:p>
-        </w:tc>
-        <w:tc>
-          <w:tcPr>
-            <w:tcW w:type="dxa" w:w="1728"/>
-          </w:tcPr>
-          <w:p>
-            <w:r>
-              <w:t>管理员</w:t>
-            </w:r>
-          </w:p>
-        </w:tc>
-      </w:tr>
-    </w:tbl>
     <w:p>
+      <w:pPr>
+        <w:pStyle w:val="ListBullet"/>
+      </w:pPr>
       <w:r>
-        <w:t>所有 API 返回统一结构：{code, message, data, traceId}，鉴权采用 JWT。</w:t>
+        <w:t>使用 Spring Cloud Config 管理环境变量，区分 dev/test/prod 三套环境。</w:t>
+      </w:r>
+    </w:p>
+    <w:p>
+      <w:pPr>
+        <w:pStyle w:val="ListBullet"/>
+      </w:pPr>
+      <w:r>
+        <w:t>作业提交大小限制可在配置中心动态调整，默认 1GB。</w:t>
+      </w:r>
+    </w:p>
+    <w:p>
+      <w:pPr>
+        <w:pStyle w:val="ListBullet"/>
+      </w:pPr>
+      <w:r>
+        <w:t>通知发送频率采用限流参数（默认每分钟 200 封邮件/500 条站内信）。</w:t>
+      </w:r>
+    </w:p>
+    <w:p>
+      <w:pPr>
+        <w:pStyle w:val="ListBullet"/>
+      </w:pPr>
+      <w:r>
+        <w:t>缓存策略：用户权限缓存 5 分钟，课程概览缓存 2 分钟，仪表盘缓存 10 分钟。</w:t>
+      </w:r>
+    </w:p>
+    <w:p>
+      <w:pPr>
+        <w:pStyle w:val="Heading2"/>
+      </w:pPr>
+      <w:r>
+        <w:t>6.6 安全设计</w:t>
+      </w:r>
+    </w:p>
+    <w:p>
+      <w:pPr>
+        <w:pStyle w:val="ListBullet"/>
+      </w:pPr>
+      <w:r>
+        <w:t>统一身份认证与 JWT 签发，刷新令牌有效期 7 天，访问令牌 2 小时。</w:t>
+      </w:r>
+    </w:p>
+    <w:p>
+      <w:pPr>
+        <w:pStyle w:val="ListBullet"/>
+      </w:pPr>
+      <w:r>
+        <w:t>RBAC 权限树按课程与功能维度控制，关键接口需教师/管理员角色。</w:t>
+      </w:r>
+    </w:p>
+    <w:p>
+      <w:pPr>
+        <w:pStyle w:val="ListBullet"/>
+      </w:pPr>
+      <w:r>
+        <w:t>敏感操作（如成绩修改、数据导出）启用二次校验与审计日志。</w:t>
+      </w:r>
+    </w:p>
+    <w:p>
+      <w:pPr>
+        <w:pStyle w:val="ListBullet"/>
+      </w:pPr>
+      <w:r>
+        <w:t>静态数据加密：使用 PostgreSQL pgcrypto 对敏感字段加密。</w:t>
+      </w:r>
+    </w:p>
+    <w:p>
+      <w:pPr>
+        <w:pStyle w:val="ListBullet"/>
+      </w:pPr>
+      <w:r>
+        <w:t>网络安全：Kubernetes 命名空间隔离，服务间通信启用 mTLS。</w:t>
       </w:r>
     </w:p>
     <w:p>
@@ -1921,7 +1892,7 @@
         <w:drawing>
           <wp:inline xmlns:a="http://schemas.openxmlformats.org/drawingml/2006/main" xmlns:pic="http://schemas.openxmlformats.org/drawingml/2006/picture">
             <wp:extent cx="5486400" cy="1588537"/>
-            <wp:docPr id="9" name="Picture 9"/>
+            <wp:docPr id="8" name="Picture 8"/>
             <wp:cNvGraphicFramePr>
               <a:graphicFrameLocks noChangeAspect="1"/>
             </wp:cNvGraphicFramePr>
@@ -1962,7 +1933,7 @@
         <w:pStyle w:val="Heading2"/>
       </w:pPr>
       <w:r>
-        <w:t>7.2 主要数据表设计</w:t>
+        <w:t>7.2 数据字典（节选）</w:t>
       </w:r>
     </w:p>
     <w:p>
@@ -1970,185 +1941,1324 @@
         <w:pStyle w:val="Heading3"/>
       </w:pPr>
       <w:r>
-        <w:t>用户与权限相关表</w:t>
+        <w:t>assignment 表</w:t>
       </w:r>
     </w:p>
+    <w:tbl>
+      <w:tblPr>
+        <w:tblStyle w:val="LightGrid-Accent1"/>
+        <w:tblW w:type="auto" w:w="0"/>
+        <w:tblLook w:firstColumn="1" w:firstRow="1" w:lastColumn="0" w:lastRow="0" w:noHBand="0" w:noVBand="1" w:val="04A0"/>
+      </w:tblPr>
+      <w:tblGrid>
+        <w:gridCol w:w="2160"/>
+        <w:gridCol w:w="2160"/>
+        <w:gridCol w:w="2160"/>
+        <w:gridCol w:w="2160"/>
+      </w:tblGrid>
+      <w:tr>
+        <w:tc>
+          <w:tcPr>
+            <w:tcW w:type="dxa" w:w="2160"/>
+          </w:tcPr>
+          <w:p>
+            <w:r>
+              <w:t>字段名</w:t>
+            </w:r>
+          </w:p>
+        </w:tc>
+        <w:tc>
+          <w:tcPr>
+            <w:tcW w:type="dxa" w:w="2160"/>
+          </w:tcPr>
+          <w:p>
+            <w:r>
+              <w:t>类型</w:t>
+            </w:r>
+          </w:p>
+        </w:tc>
+        <w:tc>
+          <w:tcPr>
+            <w:tcW w:type="dxa" w:w="2160"/>
+          </w:tcPr>
+          <w:p>
+            <w:r>
+              <w:t>约束</w:t>
+            </w:r>
+          </w:p>
+        </w:tc>
+        <w:tc>
+          <w:tcPr>
+            <w:tcW w:type="dxa" w:w="2160"/>
+          </w:tcPr>
+          <w:p>
+            <w:r>
+              <w:t>说明</w:t>
+            </w:r>
+          </w:p>
+        </w:tc>
+      </w:tr>
+      <w:tr>
+        <w:tc>
+          <w:tcPr>
+            <w:tcW w:type="dxa" w:w="2160"/>
+          </w:tcPr>
+          <w:p>
+            <w:r>
+              <w:t>id</w:t>
+            </w:r>
+          </w:p>
+        </w:tc>
+        <w:tc>
+          <w:tcPr>
+            <w:tcW w:type="dxa" w:w="2160"/>
+          </w:tcPr>
+          <w:p>
+            <w:r>
+              <w:t>UUID</w:t>
+            </w:r>
+          </w:p>
+        </w:tc>
+        <w:tc>
+          <w:tcPr>
+            <w:tcW w:type="dxa" w:w="2160"/>
+          </w:tcPr>
+          <w:p>
+            <w:r>
+              <w:t>PK</w:t>
+            </w:r>
+          </w:p>
+        </w:tc>
+        <w:tc>
+          <w:tcPr>
+            <w:tcW w:type="dxa" w:w="2160"/>
+          </w:tcPr>
+          <w:p>
+            <w:r>
+              <w:t>唯一标识</w:t>
+            </w:r>
+          </w:p>
+        </w:tc>
+      </w:tr>
+      <w:tr>
+        <w:tc>
+          <w:tcPr>
+            <w:tcW w:type="dxa" w:w="2160"/>
+          </w:tcPr>
+          <w:p>
+            <w:r>
+              <w:t>course_id</w:t>
+            </w:r>
+          </w:p>
+        </w:tc>
+        <w:tc>
+          <w:tcPr>
+            <w:tcW w:type="dxa" w:w="2160"/>
+          </w:tcPr>
+          <w:p>
+            <w:r>
+              <w:t>UUID</w:t>
+            </w:r>
+          </w:p>
+        </w:tc>
+        <w:tc>
+          <w:tcPr>
+            <w:tcW w:type="dxa" w:w="2160"/>
+          </w:tcPr>
+          <w:p>
+            <w:r>
+              <w:t>FK -&gt; course.id</w:t>
+            </w:r>
+          </w:p>
+        </w:tc>
+        <w:tc>
+          <w:tcPr>
+            <w:tcW w:type="dxa" w:w="2160"/>
+          </w:tcPr>
+          <w:p>
+            <w:r>
+              <w:t>所属课程</w:t>
+            </w:r>
+          </w:p>
+        </w:tc>
+      </w:tr>
+      <w:tr>
+        <w:tc>
+          <w:tcPr>
+            <w:tcW w:type="dxa" w:w="2160"/>
+          </w:tcPr>
+          <w:p>
+            <w:r>
+              <w:t>title</w:t>
+            </w:r>
+          </w:p>
+        </w:tc>
+        <w:tc>
+          <w:tcPr>
+            <w:tcW w:type="dxa" w:w="2160"/>
+          </w:tcPr>
+          <w:p>
+            <w:r>
+              <w:t>VARCHAR(200)</w:t>
+            </w:r>
+          </w:p>
+        </w:tc>
+        <w:tc>
+          <w:tcPr>
+            <w:tcW w:type="dxa" w:w="2160"/>
+          </w:tcPr>
+          <w:p>
+            <w:r>
+              <w:t>NOT NULL</w:t>
+            </w:r>
+          </w:p>
+        </w:tc>
+        <w:tc>
+          <w:tcPr>
+            <w:tcW w:type="dxa" w:w="2160"/>
+          </w:tcPr>
+          <w:p>
+            <w:r>
+              <w:t>作业标题</w:t>
+            </w:r>
+          </w:p>
+        </w:tc>
+      </w:tr>
+      <w:tr>
+        <w:tc>
+          <w:tcPr>
+            <w:tcW w:type="dxa" w:w="2160"/>
+          </w:tcPr>
+          <w:p>
+            <w:r>
+              <w:t>description</w:t>
+            </w:r>
+          </w:p>
+        </w:tc>
+        <w:tc>
+          <w:tcPr>
+            <w:tcW w:type="dxa" w:w="2160"/>
+          </w:tcPr>
+          <w:p>
+            <w:r>
+              <w:t>TEXT</w:t>
+            </w:r>
+          </w:p>
+        </w:tc>
+        <w:tc>
+          <w:tcPr>
+            <w:tcW w:type="dxa" w:w="2160"/>
+          </w:tcPr>
+          <w:p>
+            <w:r>
+              <w:t>NULL</w:t>
+            </w:r>
+          </w:p>
+        </w:tc>
+        <w:tc>
+          <w:tcPr>
+            <w:tcW w:type="dxa" w:w="2160"/>
+          </w:tcPr>
+          <w:p>
+            <w:r>
+              <w:t>作业说明支持 Markdown</w:t>
+            </w:r>
+          </w:p>
+        </w:tc>
+      </w:tr>
+      <w:tr>
+        <w:tc>
+          <w:tcPr>
+            <w:tcW w:type="dxa" w:w="2160"/>
+          </w:tcPr>
+          <w:p>
+            <w:r>
+              <w:t>start_at</w:t>
+            </w:r>
+          </w:p>
+        </w:tc>
+        <w:tc>
+          <w:tcPr>
+            <w:tcW w:type="dxa" w:w="2160"/>
+          </w:tcPr>
+          <w:p>
+            <w:r>
+              <w:t>TIMESTAMP</w:t>
+            </w:r>
+          </w:p>
+        </w:tc>
+        <w:tc>
+          <w:tcPr>
+            <w:tcW w:type="dxa" w:w="2160"/>
+          </w:tcPr>
+          <w:p>
+            <w:r>
+              <w:t>NOT NULL</w:t>
+            </w:r>
+          </w:p>
+        </w:tc>
+        <w:tc>
+          <w:tcPr>
+            <w:tcW w:type="dxa" w:w="2160"/>
+          </w:tcPr>
+          <w:p>
+            <w:r>
+              <w:t>开放时间</w:t>
+            </w:r>
+          </w:p>
+        </w:tc>
+      </w:tr>
+      <w:tr>
+        <w:tc>
+          <w:tcPr>
+            <w:tcW w:type="dxa" w:w="2160"/>
+          </w:tcPr>
+          <w:p>
+            <w:r>
+              <w:t>due_at</w:t>
+            </w:r>
+          </w:p>
+        </w:tc>
+        <w:tc>
+          <w:tcPr>
+            <w:tcW w:type="dxa" w:w="2160"/>
+          </w:tcPr>
+          <w:p>
+            <w:r>
+              <w:t>TIMESTAMP</w:t>
+            </w:r>
+          </w:p>
+        </w:tc>
+        <w:tc>
+          <w:tcPr>
+            <w:tcW w:type="dxa" w:w="2160"/>
+          </w:tcPr>
+          <w:p>
+            <w:r>
+              <w:t>NOT NULL</w:t>
+            </w:r>
+          </w:p>
+        </w:tc>
+        <w:tc>
+          <w:tcPr>
+            <w:tcW w:type="dxa" w:w="2160"/>
+          </w:tcPr>
+          <w:p>
+            <w:r>
+              <w:t>截止时间</w:t>
+            </w:r>
+          </w:p>
+        </w:tc>
+      </w:tr>
+      <w:tr>
+        <w:tc>
+          <w:tcPr>
+            <w:tcW w:type="dxa" w:w="2160"/>
+          </w:tcPr>
+          <w:p>
+            <w:r>
+              <w:t>max_score</w:t>
+            </w:r>
+          </w:p>
+        </w:tc>
+        <w:tc>
+          <w:tcPr>
+            <w:tcW w:type="dxa" w:w="2160"/>
+          </w:tcPr>
+          <w:p>
+            <w:r>
+              <w:t>NUMERIC(5,2)</w:t>
+            </w:r>
+          </w:p>
+        </w:tc>
+        <w:tc>
+          <w:tcPr>
+            <w:tcW w:type="dxa" w:w="2160"/>
+          </w:tcPr>
+          <w:p>
+            <w:r>
+              <w:t>DEFAULT 100</w:t>
+            </w:r>
+          </w:p>
+        </w:tc>
+        <w:tc>
+          <w:tcPr>
+            <w:tcW w:type="dxa" w:w="2160"/>
+          </w:tcPr>
+          <w:p>
+            <w:r>
+              <w:t>满分</w:t>
+            </w:r>
+          </w:p>
+        </w:tc>
+      </w:tr>
+      <w:tr>
+        <w:tc>
+          <w:tcPr>
+            <w:tcW w:type="dxa" w:w="2160"/>
+          </w:tcPr>
+          <w:p>
+            <w:r>
+              <w:t>late_policy_id</w:t>
+            </w:r>
+          </w:p>
+        </w:tc>
+        <w:tc>
+          <w:tcPr>
+            <w:tcW w:type="dxa" w:w="2160"/>
+          </w:tcPr>
+          <w:p>
+            <w:r>
+              <w:t>UUID</w:t>
+            </w:r>
+          </w:p>
+        </w:tc>
+        <w:tc>
+          <w:tcPr>
+            <w:tcW w:type="dxa" w:w="2160"/>
+          </w:tcPr>
+          <w:p>
+            <w:r>
+              <w:t>FK -&gt; late_policy.id</w:t>
+            </w:r>
+          </w:p>
+        </w:tc>
+        <w:tc>
+          <w:tcPr>
+            <w:tcW w:type="dxa" w:w="2160"/>
+          </w:tcPr>
+          <w:p>
+            <w:r>
+              <w:t>迟交策略</w:t>
+            </w:r>
+          </w:p>
+        </w:tc>
+      </w:tr>
+      <w:tr>
+        <w:tc>
+          <w:tcPr>
+            <w:tcW w:type="dxa" w:w="2160"/>
+          </w:tcPr>
+          <w:p>
+            <w:r>
+              <w:t>created_by</w:t>
+            </w:r>
+          </w:p>
+        </w:tc>
+        <w:tc>
+          <w:tcPr>
+            <w:tcW w:type="dxa" w:w="2160"/>
+          </w:tcPr>
+          <w:p>
+            <w:r>
+              <w:t>UUID</w:t>
+            </w:r>
+          </w:p>
+        </w:tc>
+        <w:tc>
+          <w:tcPr>
+            <w:tcW w:type="dxa" w:w="2160"/>
+          </w:tcPr>
+          <w:p>
+            <w:r>
+              <w:t>FK -&gt; user.id</w:t>
+            </w:r>
+          </w:p>
+        </w:tc>
+        <w:tc>
+          <w:tcPr>
+            <w:tcW w:type="dxa" w:w="2160"/>
+          </w:tcPr>
+          <w:p>
+            <w:r>
+              <w:t>创建人</w:t>
+            </w:r>
+          </w:p>
+        </w:tc>
+      </w:tr>
+    </w:tbl>
     <w:p>
       <w:pPr>
-        <w:pStyle w:val="ListBullet"/>
+        <w:pStyle w:val="Heading3"/>
       </w:pPr>
       <w:r>
-        <w:t>user：用户基本信息（id, account, name, email, status, last_login_at）。</w:t>
+        <w:t>submission 表</w:t>
       </w:r>
     </w:p>
+    <w:tbl>
+      <w:tblPr>
+        <w:tblStyle w:val="LightGrid-Accent1"/>
+        <w:tblW w:type="auto" w:w="0"/>
+        <w:tblLook w:firstColumn="1" w:firstRow="1" w:lastColumn="0" w:lastRow="0" w:noHBand="0" w:noVBand="1" w:val="04A0"/>
+      </w:tblPr>
+      <w:tblGrid>
+        <w:gridCol w:w="2160"/>
+        <w:gridCol w:w="2160"/>
+        <w:gridCol w:w="2160"/>
+        <w:gridCol w:w="2160"/>
+      </w:tblGrid>
+      <w:tr>
+        <w:tc>
+          <w:tcPr>
+            <w:tcW w:type="dxa" w:w="2160"/>
+          </w:tcPr>
+          <w:p>
+            <w:r>
+              <w:t>字段名</w:t>
+            </w:r>
+          </w:p>
+        </w:tc>
+        <w:tc>
+          <w:tcPr>
+            <w:tcW w:type="dxa" w:w="2160"/>
+          </w:tcPr>
+          <w:p>
+            <w:r>
+              <w:t>类型</w:t>
+            </w:r>
+          </w:p>
+        </w:tc>
+        <w:tc>
+          <w:tcPr>
+            <w:tcW w:type="dxa" w:w="2160"/>
+          </w:tcPr>
+          <w:p>
+            <w:r>
+              <w:t>约束</w:t>
+            </w:r>
+          </w:p>
+        </w:tc>
+        <w:tc>
+          <w:tcPr>
+            <w:tcW w:type="dxa" w:w="2160"/>
+          </w:tcPr>
+          <w:p>
+            <w:r>
+              <w:t>说明</w:t>
+            </w:r>
+          </w:p>
+        </w:tc>
+      </w:tr>
+      <w:tr>
+        <w:tc>
+          <w:tcPr>
+            <w:tcW w:type="dxa" w:w="2160"/>
+          </w:tcPr>
+          <w:p>
+            <w:r>
+              <w:t>id</w:t>
+            </w:r>
+          </w:p>
+        </w:tc>
+        <w:tc>
+          <w:tcPr>
+            <w:tcW w:type="dxa" w:w="2160"/>
+          </w:tcPr>
+          <w:p>
+            <w:r>
+              <w:t>UUID</w:t>
+            </w:r>
+          </w:p>
+        </w:tc>
+        <w:tc>
+          <w:tcPr>
+            <w:tcW w:type="dxa" w:w="2160"/>
+          </w:tcPr>
+          <w:p>
+            <w:r>
+              <w:t>PK</w:t>
+            </w:r>
+          </w:p>
+        </w:tc>
+        <w:tc>
+          <w:tcPr>
+            <w:tcW w:type="dxa" w:w="2160"/>
+          </w:tcPr>
+          <w:p>
+            <w:r>
+              <w:t>唯一标识</w:t>
+            </w:r>
+          </w:p>
+        </w:tc>
+      </w:tr>
+      <w:tr>
+        <w:tc>
+          <w:tcPr>
+            <w:tcW w:type="dxa" w:w="2160"/>
+          </w:tcPr>
+          <w:p>
+            <w:r>
+              <w:t>assignment_id</w:t>
+            </w:r>
+          </w:p>
+        </w:tc>
+        <w:tc>
+          <w:tcPr>
+            <w:tcW w:type="dxa" w:w="2160"/>
+          </w:tcPr>
+          <w:p>
+            <w:r>
+              <w:t>UUID</w:t>
+            </w:r>
+          </w:p>
+        </w:tc>
+        <w:tc>
+          <w:tcPr>
+            <w:tcW w:type="dxa" w:w="2160"/>
+          </w:tcPr>
+          <w:p>
+            <w:r>
+              <w:t>FK</w:t>
+            </w:r>
+          </w:p>
+        </w:tc>
+        <w:tc>
+          <w:tcPr>
+            <w:tcW w:type="dxa" w:w="2160"/>
+          </w:tcPr>
+          <w:p>
+            <w:r>
+              <w:t>关联作业</w:t>
+            </w:r>
+          </w:p>
+        </w:tc>
+      </w:tr>
+      <w:tr>
+        <w:tc>
+          <w:tcPr>
+            <w:tcW w:type="dxa" w:w="2160"/>
+          </w:tcPr>
+          <w:p>
+            <w:r>
+              <w:t>student_id</w:t>
+            </w:r>
+          </w:p>
+        </w:tc>
+        <w:tc>
+          <w:tcPr>
+            <w:tcW w:type="dxa" w:w="2160"/>
+          </w:tcPr>
+          <w:p>
+            <w:r>
+              <w:t>UUID</w:t>
+            </w:r>
+          </w:p>
+        </w:tc>
+        <w:tc>
+          <w:tcPr>
+            <w:tcW w:type="dxa" w:w="2160"/>
+          </w:tcPr>
+          <w:p>
+            <w:r>
+              <w:t>FK -&gt; user.id</w:t>
+            </w:r>
+          </w:p>
+        </w:tc>
+        <w:tc>
+          <w:tcPr>
+            <w:tcW w:type="dxa" w:w="2160"/>
+          </w:tcPr>
+          <w:p>
+            <w:r>
+              <w:t>提交学生</w:t>
+            </w:r>
+          </w:p>
+        </w:tc>
+      </w:tr>
+      <w:tr>
+        <w:tc>
+          <w:tcPr>
+            <w:tcW w:type="dxa" w:w="2160"/>
+          </w:tcPr>
+          <w:p>
+            <w:r>
+              <w:t>submitted_at</w:t>
+            </w:r>
+          </w:p>
+        </w:tc>
+        <w:tc>
+          <w:tcPr>
+            <w:tcW w:type="dxa" w:w="2160"/>
+          </w:tcPr>
+          <w:p>
+            <w:r>
+              <w:t>TIMESTAMP</w:t>
+            </w:r>
+          </w:p>
+        </w:tc>
+        <w:tc>
+          <w:tcPr>
+            <w:tcW w:type="dxa" w:w="2160"/>
+          </w:tcPr>
+          <w:p>
+            <w:r>
+              <w:t>NULL</w:t>
+            </w:r>
+          </w:p>
+        </w:tc>
+        <w:tc>
+          <w:tcPr>
+            <w:tcW w:type="dxa" w:w="2160"/>
+          </w:tcPr>
+          <w:p>
+            <w:r>
+              <w:t>提交时间</w:t>
+            </w:r>
+          </w:p>
+        </w:tc>
+      </w:tr>
+      <w:tr>
+        <w:tc>
+          <w:tcPr>
+            <w:tcW w:type="dxa" w:w="2160"/>
+          </w:tcPr>
+          <w:p>
+            <w:r>
+              <w:t>status</w:t>
+            </w:r>
+          </w:p>
+        </w:tc>
+        <w:tc>
+          <w:tcPr>
+            <w:tcW w:type="dxa" w:w="2160"/>
+          </w:tcPr>
+          <w:p>
+            <w:r>
+              <w:t>VARCHAR(20)</w:t>
+            </w:r>
+          </w:p>
+        </w:tc>
+        <w:tc>
+          <w:tcPr>
+            <w:tcW w:type="dxa" w:w="2160"/>
+          </w:tcPr>
+          <w:p>
+            <w:r>
+              <w:t>CHECK(status IN ('DRAFT','SUBMITTED','LATE','RETURNED'))</w:t>
+            </w:r>
+          </w:p>
+        </w:tc>
+        <w:tc>
+          <w:tcPr>
+            <w:tcW w:type="dxa" w:w="2160"/>
+          </w:tcPr>
+          <w:p>
+            <w:r>
+              <w:t>提交状态</w:t>
+            </w:r>
+          </w:p>
+        </w:tc>
+      </w:tr>
+      <w:tr>
+        <w:tc>
+          <w:tcPr>
+            <w:tcW w:type="dxa" w:w="2160"/>
+          </w:tcPr>
+          <w:p>
+            <w:r>
+              <w:t>final_score</w:t>
+            </w:r>
+          </w:p>
+        </w:tc>
+        <w:tc>
+          <w:tcPr>
+            <w:tcW w:type="dxa" w:w="2160"/>
+          </w:tcPr>
+          <w:p>
+            <w:r>
+              <w:t>NUMERIC(5,2)</w:t>
+            </w:r>
+          </w:p>
+        </w:tc>
+        <w:tc>
+          <w:tcPr>
+            <w:tcW w:type="dxa" w:w="2160"/>
+          </w:tcPr>
+          <w:p>
+            <w:r>
+              <w:t>NULL</w:t>
+            </w:r>
+          </w:p>
+        </w:tc>
+        <w:tc>
+          <w:tcPr>
+            <w:tcW w:type="dxa" w:w="2160"/>
+          </w:tcPr>
+          <w:p>
+            <w:r>
+              <w:t>最终得分</w:t>
+            </w:r>
+          </w:p>
+        </w:tc>
+      </w:tr>
+      <w:tr>
+        <w:tc>
+          <w:tcPr>
+            <w:tcW w:type="dxa" w:w="2160"/>
+          </w:tcPr>
+          <w:p>
+            <w:r>
+              <w:t>penalty</w:t>
+            </w:r>
+          </w:p>
+        </w:tc>
+        <w:tc>
+          <w:tcPr>
+            <w:tcW w:type="dxa" w:w="2160"/>
+          </w:tcPr>
+          <w:p>
+            <w:r>
+              <w:t>NUMERIC(5,2)</w:t>
+            </w:r>
+          </w:p>
+        </w:tc>
+        <w:tc>
+          <w:tcPr>
+            <w:tcW w:type="dxa" w:w="2160"/>
+          </w:tcPr>
+          <w:p>
+            <w:r>
+              <w:t>DEFAULT 0</w:t>
+            </w:r>
+          </w:p>
+        </w:tc>
+        <w:tc>
+          <w:tcPr>
+            <w:tcW w:type="dxa" w:w="2160"/>
+          </w:tcPr>
+          <w:p>
+            <w:r>
+              <w:t>扣分</w:t>
+            </w:r>
+          </w:p>
+        </w:tc>
+      </w:tr>
+      <w:tr>
+        <w:tc>
+          <w:tcPr>
+            <w:tcW w:type="dxa" w:w="2160"/>
+          </w:tcPr>
+          <w:p>
+            <w:r>
+              <w:t>feedback</w:t>
+            </w:r>
+          </w:p>
+        </w:tc>
+        <w:tc>
+          <w:tcPr>
+            <w:tcW w:type="dxa" w:w="2160"/>
+          </w:tcPr>
+          <w:p>
+            <w:r>
+              <w:t>TEXT</w:t>
+            </w:r>
+          </w:p>
+        </w:tc>
+        <w:tc>
+          <w:tcPr>
+            <w:tcW w:type="dxa" w:w="2160"/>
+          </w:tcPr>
+          <w:p>
+            <w:r>
+              <w:t>NULL</w:t>
+            </w:r>
+          </w:p>
+        </w:tc>
+        <w:tc>
+          <w:tcPr>
+            <w:tcW w:type="dxa" w:w="2160"/>
+          </w:tcPr>
+          <w:p>
+            <w:r>
+              <w:t>教师整体反馈</w:t>
+            </w:r>
+          </w:p>
+        </w:tc>
+      </w:tr>
+      <w:tr>
+        <w:tc>
+          <w:tcPr>
+            <w:tcW w:type="dxa" w:w="2160"/>
+          </w:tcPr>
+          <w:p>
+            <w:r>
+              <w:t>version_no</w:t>
+            </w:r>
+          </w:p>
+        </w:tc>
+        <w:tc>
+          <w:tcPr>
+            <w:tcW w:type="dxa" w:w="2160"/>
+          </w:tcPr>
+          <w:p>
+            <w:r>
+              <w:t>INTEGER</w:t>
+            </w:r>
+          </w:p>
+        </w:tc>
+        <w:tc>
+          <w:tcPr>
+            <w:tcW w:type="dxa" w:w="2160"/>
+          </w:tcPr>
+          <w:p>
+            <w:r>
+              <w:t>DEFAULT 1</w:t>
+            </w:r>
+          </w:p>
+        </w:tc>
+        <w:tc>
+          <w:tcPr>
+            <w:tcW w:type="dxa" w:w="2160"/>
+          </w:tcPr>
+          <w:p>
+            <w:r>
+              <w:t>提交版本号</w:t>
+            </w:r>
+          </w:p>
+        </w:tc>
+      </w:tr>
+    </w:tbl>
     <w:p>
       <w:pPr>
-        <w:pStyle w:val="ListBullet"/>
+        <w:pStyle w:val="Heading3"/>
       </w:pPr>
       <w:r>
-        <w:t>role：角色定义（id, code, name, description）。</w:t>
+        <w:t>notice 表</w:t>
       </w:r>
     </w:p>
-    <w:p>
-      <w:pPr>
-        <w:pStyle w:val="ListBullet"/>
-      </w:pPr>
-      <w:r>
-        <w:t>permission：权限定义（id, code, name, resource, action）。</w:t>
-      </w:r>
-    </w:p>
-    <w:p>
-      <w:pPr>
-        <w:pStyle w:val="ListBullet"/>
-      </w:pPr>
-      <w:r>
-        <w:t>user_role：用户角色关联（user_id, role_id, created_at）。</w:t>
-      </w:r>
-    </w:p>
-    <w:p>
-      <w:pPr>
-        <w:pStyle w:val="ListBullet"/>
-      </w:pPr>
-      <w:r>
-        <w:t>role_permission：角色权限关联（role_id, permission_id）。</w:t>
-      </w:r>
-    </w:p>
-    <w:p>
-      <w:pPr>
-        <w:pStyle w:val="Heading3"/>
-      </w:pPr>
-      <w:r>
-        <w:t>课程与资源相关表</w:t>
-      </w:r>
-    </w:p>
-    <w:p>
-      <w:pPr>
-        <w:pStyle w:val="ListBullet"/>
-      </w:pPr>
-      <w:r>
-        <w:t>course：课程元数据（id, name, term, owner_id, status, visibility, created_at）。</w:t>
-      </w:r>
-    </w:p>
-    <w:p>
-      <w:pPr>
-        <w:pStyle w:val="ListBullet"/>
-      </w:pPr>
-      <w:r>
-        <w:t>course_member：课程成员（course_id, user_id, role, joined_at），组合主键。</w:t>
-      </w:r>
-    </w:p>
-    <w:p>
-      <w:pPr>
-        <w:pStyle w:val="ListBullet"/>
-      </w:pPr>
-      <w:r>
-        <w:t>resource：资源基本信息（id, course_id, title, type, current_version_id, tags, created_by, created_at）。</w:t>
-      </w:r>
-    </w:p>
-    <w:p>
-      <w:pPr>
-        <w:pStyle w:val="ListBullet"/>
-      </w:pPr>
-      <w:r>
-        <w:t>resource_version：资源版本（id, resource_id, storage_path, size, checksum, version_no, uploaded_at）。</w:t>
-      </w:r>
-    </w:p>
-    <w:p>
-      <w:pPr>
-        <w:pStyle w:val="ListBullet"/>
-      </w:pPr>
-      <w:r>
-        <w:t>preview：预览文件（id, resource_version_id, preview_path, preview_type, status）。</w:t>
-      </w:r>
-    </w:p>
-    <w:p>
-      <w:pPr>
-        <w:pStyle w:val="Heading3"/>
-      </w:pPr>
-      <w:r>
-        <w:t>作业与批阅相关表</w:t>
-      </w:r>
-    </w:p>
-    <w:p>
-      <w:pPr>
-        <w:pStyle w:val="ListBullet"/>
-      </w:pPr>
-      <w:r>
-        <w:t>assignment：作业配置（id, course_id, title, description, start_at, due_at, max_score, late_policy_id, created_by）。</w:t>
-      </w:r>
-    </w:p>
-    <w:p>
-      <w:pPr>
-        <w:pStyle w:val="ListBullet"/>
-      </w:pPr>
-      <w:r>
-        <w:t>late_policy：迟交策略（id, type, config_json）。</w:t>
-      </w:r>
-    </w:p>
-    <w:p>
-      <w:pPr>
-        <w:pStyle w:val="ListBullet"/>
-      </w:pPr>
-      <w:r>
-        <w:t>submission：作业提交（id, assignment_id, student_id, submitted_at, status, final_score, penalty）。</w:t>
-      </w:r>
-    </w:p>
-    <w:p>
-      <w:pPr>
-        <w:pStyle w:val="ListBullet"/>
-      </w:pPr>
-      <w:r>
-        <w:t>submission_file：提交附件（id, submission_id, file_path, file_name, size）。</w:t>
-      </w:r>
-    </w:p>
-    <w:p>
-      <w:pPr>
-        <w:pStyle w:val="ListBullet"/>
-      </w:pPr>
-      <w:r>
-        <w:t>review：批阅记录（id, submission_id, reviewer_id, score, feedback, created_at, published）。</w:t>
-      </w:r>
-    </w:p>
-    <w:p>
-      <w:pPr>
-        <w:pStyle w:val="Heading3"/>
-      </w:pPr>
-      <w:r>
-        <w:t>分析与通知相关表</w:t>
-      </w:r>
-    </w:p>
-    <w:p>
-      <w:pPr>
-        <w:pStyle w:val="ListBullet"/>
-      </w:pPr>
-      <w:r>
-        <w:t>dashboard_metric：班级指标（id, course_id, metric_date, submit_rate, average_score, late_count）。</w:t>
-      </w:r>
-    </w:p>
-    <w:p>
-      <w:pPr>
-        <w:pStyle w:val="ListBullet"/>
-      </w:pPr>
-      <w:r>
-        <w:t>student_metric：学生指标（id, student_id, course_id, assignment_count, completed_count, last_active）。</w:t>
-      </w:r>
-    </w:p>
-    <w:p>
-      <w:pPr>
-        <w:pStyle w:val="ListBullet"/>
-      </w:pPr>
-      <w:r>
-        <w:t>notice：通知记录（id, course_id, type, title, content, channel, status, scheduled_at, created_by）。</w:t>
-      </w:r>
-    </w:p>
-    <w:p>
-      <w:pPr>
-        <w:pStyle w:val="ListBullet"/>
-      </w:pPr>
-      <w:r>
-        <w:t>audit_log：审计日志（id, user_id, action, resource, payload, created_at, trace_id）。</w:t>
-      </w:r>
-    </w:p>
+    <w:tbl>
+      <w:tblPr>
+        <w:tblStyle w:val="LightGrid-Accent1"/>
+        <w:tblW w:type="auto" w:w="0"/>
+        <w:tblLook w:firstColumn="1" w:firstRow="1" w:lastColumn="0" w:lastRow="0" w:noHBand="0" w:noVBand="1" w:val="04A0"/>
+      </w:tblPr>
+      <w:tblGrid>
+        <w:gridCol w:w="2160"/>
+        <w:gridCol w:w="2160"/>
+        <w:gridCol w:w="2160"/>
+        <w:gridCol w:w="2160"/>
+      </w:tblGrid>
+      <w:tr>
+        <w:tc>
+          <w:tcPr>
+            <w:tcW w:type="dxa" w:w="2160"/>
+          </w:tcPr>
+          <w:p>
+            <w:r>
+              <w:t>字段名</w:t>
+            </w:r>
+          </w:p>
+        </w:tc>
+        <w:tc>
+          <w:tcPr>
+            <w:tcW w:type="dxa" w:w="2160"/>
+          </w:tcPr>
+          <w:p>
+            <w:r>
+              <w:t>类型</w:t>
+            </w:r>
+          </w:p>
+        </w:tc>
+        <w:tc>
+          <w:tcPr>
+            <w:tcW w:type="dxa" w:w="2160"/>
+          </w:tcPr>
+          <w:p>
+            <w:r>
+              <w:t>约束</w:t>
+            </w:r>
+          </w:p>
+        </w:tc>
+        <w:tc>
+          <w:tcPr>
+            <w:tcW w:type="dxa" w:w="2160"/>
+          </w:tcPr>
+          <w:p>
+            <w:r>
+              <w:t>说明</w:t>
+            </w:r>
+          </w:p>
+        </w:tc>
+      </w:tr>
+      <w:tr>
+        <w:tc>
+          <w:tcPr>
+            <w:tcW w:type="dxa" w:w="2160"/>
+          </w:tcPr>
+          <w:p>
+            <w:r>
+              <w:t>id</w:t>
+            </w:r>
+          </w:p>
+        </w:tc>
+        <w:tc>
+          <w:tcPr>
+            <w:tcW w:type="dxa" w:w="2160"/>
+          </w:tcPr>
+          <w:p>
+            <w:r>
+              <w:t>UUID</w:t>
+            </w:r>
+          </w:p>
+        </w:tc>
+        <w:tc>
+          <w:tcPr>
+            <w:tcW w:type="dxa" w:w="2160"/>
+          </w:tcPr>
+          <w:p>
+            <w:r>
+              <w:t>PK</w:t>
+            </w:r>
+          </w:p>
+        </w:tc>
+        <w:tc>
+          <w:tcPr>
+            <w:tcW w:type="dxa" w:w="2160"/>
+          </w:tcPr>
+          <w:p>
+            <w:r>
+              <w:t>唯一标识</w:t>
+            </w:r>
+          </w:p>
+        </w:tc>
+      </w:tr>
+      <w:tr>
+        <w:tc>
+          <w:tcPr>
+            <w:tcW w:type="dxa" w:w="2160"/>
+          </w:tcPr>
+          <w:p>
+            <w:r>
+              <w:t>course_id</w:t>
+            </w:r>
+          </w:p>
+        </w:tc>
+        <w:tc>
+          <w:tcPr>
+            <w:tcW w:type="dxa" w:w="2160"/>
+          </w:tcPr>
+          <w:p>
+            <w:r>
+              <w:t>UUID</w:t>
+            </w:r>
+          </w:p>
+        </w:tc>
+        <w:tc>
+          <w:tcPr>
+            <w:tcW w:type="dxa" w:w="2160"/>
+          </w:tcPr>
+          <w:p>
+            <w:r>
+              <w:t>FK -&gt; course.id</w:t>
+            </w:r>
+          </w:p>
+        </w:tc>
+        <w:tc>
+          <w:tcPr>
+            <w:tcW w:type="dxa" w:w="2160"/>
+          </w:tcPr>
+          <w:p>
+            <w:r>
+              <w:t>所属课程</w:t>
+            </w:r>
+          </w:p>
+        </w:tc>
+      </w:tr>
+      <w:tr>
+        <w:tc>
+          <w:tcPr>
+            <w:tcW w:type="dxa" w:w="2160"/>
+          </w:tcPr>
+          <w:p>
+            <w:r>
+              <w:t>type</w:t>
+            </w:r>
+          </w:p>
+        </w:tc>
+        <w:tc>
+          <w:tcPr>
+            <w:tcW w:type="dxa" w:w="2160"/>
+          </w:tcPr>
+          <w:p>
+            <w:r>
+              <w:t>VARCHAR(30)</w:t>
+            </w:r>
+          </w:p>
+        </w:tc>
+        <w:tc>
+          <w:tcPr>
+            <w:tcW w:type="dxa" w:w="2160"/>
+          </w:tcPr>
+          <w:p>
+            <w:r>
+              <w:t>CHECK(type IN ('ASSIGNMENT','ANNOUNCEMENT','SYSTEM'))</w:t>
+            </w:r>
+          </w:p>
+        </w:tc>
+        <w:tc>
+          <w:tcPr>
+            <w:tcW w:type="dxa" w:w="2160"/>
+          </w:tcPr>
+          <w:p>
+            <w:r>
+              <w:t>通知类型</w:t>
+            </w:r>
+          </w:p>
+        </w:tc>
+      </w:tr>
+      <w:tr>
+        <w:tc>
+          <w:tcPr>
+            <w:tcW w:type="dxa" w:w="2160"/>
+          </w:tcPr>
+          <w:p>
+            <w:r>
+              <w:t>title</w:t>
+            </w:r>
+          </w:p>
+        </w:tc>
+        <w:tc>
+          <w:tcPr>
+            <w:tcW w:type="dxa" w:w="2160"/>
+          </w:tcPr>
+          <w:p>
+            <w:r>
+              <w:t>VARCHAR(150)</w:t>
+            </w:r>
+          </w:p>
+        </w:tc>
+        <w:tc>
+          <w:tcPr>
+            <w:tcW w:type="dxa" w:w="2160"/>
+          </w:tcPr>
+          <w:p>
+            <w:r>
+              <w:t>NOT NULL</w:t>
+            </w:r>
+          </w:p>
+        </w:tc>
+        <w:tc>
+          <w:tcPr>
+            <w:tcW w:type="dxa" w:w="2160"/>
+          </w:tcPr>
+          <w:p>
+            <w:r>
+              <w:t>通知标题</w:t>
+            </w:r>
+          </w:p>
+        </w:tc>
+      </w:tr>
+      <w:tr>
+        <w:tc>
+          <w:tcPr>
+            <w:tcW w:type="dxa" w:w="2160"/>
+          </w:tcPr>
+          <w:p>
+            <w:r>
+              <w:t>content</w:t>
+            </w:r>
+          </w:p>
+        </w:tc>
+        <w:tc>
+          <w:tcPr>
+            <w:tcW w:type="dxa" w:w="2160"/>
+          </w:tcPr>
+          <w:p>
+            <w:r>
+              <w:t>TEXT</w:t>
+            </w:r>
+          </w:p>
+        </w:tc>
+        <w:tc>
+          <w:tcPr>
+            <w:tcW w:type="dxa" w:w="2160"/>
+          </w:tcPr>
+          <w:p>
+            <w:r>
+              <w:t>NOT NULL</w:t>
+            </w:r>
+          </w:p>
+        </w:tc>
+        <w:tc>
+          <w:tcPr>
+            <w:tcW w:type="dxa" w:w="2160"/>
+          </w:tcPr>
+          <w:p>
+            <w:r>
+              <w:t>通知内容</w:t>
+            </w:r>
+          </w:p>
+        </w:tc>
+      </w:tr>
+      <w:tr>
+        <w:tc>
+          <w:tcPr>
+            <w:tcW w:type="dxa" w:w="2160"/>
+          </w:tcPr>
+          <w:p>
+            <w:r>
+              <w:t>channel</w:t>
+            </w:r>
+          </w:p>
+        </w:tc>
+        <w:tc>
+          <w:tcPr>
+            <w:tcW w:type="dxa" w:w="2160"/>
+          </w:tcPr>
+          <w:p>
+            <w:r>
+              <w:t>VARCHAR(30)</w:t>
+            </w:r>
+          </w:p>
+        </w:tc>
+        <w:tc>
+          <w:tcPr>
+            <w:tcW w:type="dxa" w:w="2160"/>
+          </w:tcPr>
+          <w:p>
+            <w:r>
+              <w:t>CHECK(channel IN ('INBOX','EMAIL','WECOM'))</w:t>
+            </w:r>
+          </w:p>
+        </w:tc>
+        <w:tc>
+          <w:tcPr>
+            <w:tcW w:type="dxa" w:w="2160"/>
+          </w:tcPr>
+          <w:p>
+            <w:r>
+              <w:t>发送渠道</w:t>
+            </w:r>
+          </w:p>
+        </w:tc>
+      </w:tr>
+      <w:tr>
+        <w:tc>
+          <w:tcPr>
+            <w:tcW w:type="dxa" w:w="2160"/>
+          </w:tcPr>
+          <w:p>
+            <w:r>
+              <w:t>status</w:t>
+            </w:r>
+          </w:p>
+        </w:tc>
+        <w:tc>
+          <w:tcPr>
+            <w:tcW w:type="dxa" w:w="2160"/>
+          </w:tcPr>
+          <w:p>
+            <w:r>
+              <w:t>VARCHAR(20)</w:t>
+            </w:r>
+          </w:p>
+        </w:tc>
+        <w:tc>
+          <w:tcPr>
+            <w:tcW w:type="dxa" w:w="2160"/>
+          </w:tcPr>
+          <w:p>
+            <w:r>
+              <w:t>CHECK(status IN ('SCHEDULED','SENT','FAILED'))</w:t>
+            </w:r>
+          </w:p>
+        </w:tc>
+        <w:tc>
+          <w:tcPr>
+            <w:tcW w:type="dxa" w:w="2160"/>
+          </w:tcPr>
+          <w:p>
+            <w:r>
+              <w:t>状态</w:t>
+            </w:r>
+          </w:p>
+        </w:tc>
+      </w:tr>
+      <w:tr>
+        <w:tc>
+          <w:tcPr>
+            <w:tcW w:type="dxa" w:w="2160"/>
+          </w:tcPr>
+          <w:p>
+            <w:r>
+              <w:t>scheduled_at</w:t>
+            </w:r>
+          </w:p>
+        </w:tc>
+        <w:tc>
+          <w:tcPr>
+            <w:tcW w:type="dxa" w:w="2160"/>
+          </w:tcPr>
+          <w:p>
+            <w:r>
+              <w:t>TIMESTAMP</w:t>
+            </w:r>
+          </w:p>
+        </w:tc>
+        <w:tc>
+          <w:tcPr>
+            <w:tcW w:type="dxa" w:w="2160"/>
+          </w:tcPr>
+          <w:p>
+            <w:r>
+              <w:t>NULL</w:t>
+            </w:r>
+          </w:p>
+        </w:tc>
+        <w:tc>
+          <w:tcPr>
+            <w:tcW w:type="dxa" w:w="2160"/>
+          </w:tcPr>
+          <w:p>
+            <w:r>
+              <w:t>计划发送时间</w:t>
+            </w:r>
+          </w:p>
+        </w:tc>
+      </w:tr>
+      <w:tr>
+        <w:tc>
+          <w:tcPr>
+            <w:tcW w:type="dxa" w:w="2160"/>
+          </w:tcPr>
+          <w:p>
+            <w:r>
+              <w:t>created_by</w:t>
+            </w:r>
+          </w:p>
+        </w:tc>
+        <w:tc>
+          <w:tcPr>
+            <w:tcW w:type="dxa" w:w="2160"/>
+          </w:tcPr>
+          <w:p>
+            <w:r>
+              <w:t>UUID</w:t>
+            </w:r>
+          </w:p>
+        </w:tc>
+        <w:tc>
+          <w:tcPr>
+            <w:tcW w:type="dxa" w:w="2160"/>
+          </w:tcPr>
+          <w:p>
+            <w:r>
+              <w:t>FK -&gt; user.id</w:t>
+            </w:r>
+          </w:p>
+        </w:tc>
+        <w:tc>
+          <w:tcPr>
+            <w:tcW w:type="dxa" w:w="2160"/>
+          </w:tcPr>
+          <w:p>
+            <w:r>
+              <w:t>创建人</w:t>
+            </w:r>
+          </w:p>
+        </w:tc>
+      </w:tr>
+    </w:tbl>
     <w:p>
       <w:pPr>
         <w:pStyle w:val="Heading2"/>
@@ -2162,7 +3272,7 @@
         <w:pStyle w:val="ListBullet"/>
       </w:pPr>
       <w:r>
-        <w:t>外键策略：按场景设置 ON DELETE CASCADE/SET NULL，成绩等关键数据仅管理员可删除。</w:t>
+        <w:t>外键策略：课程删除触发层级逻辑检查，防止误删；成绩相关表禁止级联删除。</w:t>
       </w:r>
     </w:p>
     <w:p>
@@ -2170,7 +3280,7 @@
         <w:pStyle w:val="ListBullet"/>
       </w:pPr>
       <w:r>
-        <w:t>索引策略：submission(assignment_id, student_id)、resource(course_id, type)、audit_log(trace_id)、notice(status, scheduled_at) 等复合索引。</w:t>
+        <w:t>索引策略：submission(assignment_id, student_id)、resource(course_id, type)、audit_log(trace_id)、notice(status, scheduled_at)。</w:t>
       </w:r>
     </w:p>
     <w:p>
@@ -2178,7 +3288,7 @@
         <w:pStyle w:val="ListBullet"/>
       </w:pPr>
       <w:r>
-        <w:t>分区策略：audit_log 按月分区，dashboard_metric 按课程与日期分区。</w:t>
+        <w:t>分区策略：audit_log 按月分区，dashboard_metric 按课程与日期分区，支持快速归档。</w:t>
       </w:r>
     </w:p>
     <w:p>
@@ -2186,7 +3296,7 @@
         <w:pStyle w:val="ListBullet"/>
       </w:pPr>
       <w:r>
-        <w:t>缓存策略：热门课程信息与权限树缓存在 Redis，TTL 5 分钟。</w:t>
+        <w:t>缓存策略：用户权限与课程概览缓存在 Redis，采用双写失效模式。</w:t>
       </w:r>
     </w:p>
     <w:p>
@@ -2194,7 +3304,7 @@
         <w:pStyle w:val="ListBullet"/>
       </w:pPr>
       <w:r>
-        <w:t>备份策略：PostgreSQL 使用 WAL + 每日全量快照，对象存储开启版本控制。</w:t>
+        <w:t>备份策略：PostgreSQL 使用 WAL + 每日全量快照，对象存储开启版本控制并复制到异地。</w:t>
       </w:r>
     </w:p>
     <w:p>
@@ -2202,15 +3312,334 @@
         <w:pStyle w:val="Heading1"/>
       </w:pPr>
       <w:r>
-        <w:t>8. Sprint1 启动前准备</w:t>
+        <w:t>8. 部署与运维计划</w:t>
       </w:r>
     </w:p>
     <w:p>
       <w:pPr>
+        <w:pStyle w:val="ListBullet"/>
+      </w:pPr>
+      <w:r>
+        <w:t>Kubernetes 部署：各服务以 Deployment 形式部署 2 副本，使用 HPA 按 CPU/内存自动扩缩容。</w:t>
+      </w:r>
+    </w:p>
+    <w:p>
+      <w:pPr>
+        <w:pStyle w:val="ListBullet"/>
+      </w:pPr>
+      <w:r>
+        <w:t>CI/CD 流程：提交代码后触发单元测试、静态扫描、镜像构建，审批后自动部署至测试环境，再通过 Helm 升级到生产。</w:t>
+      </w:r>
+    </w:p>
+    <w:p>
+      <w:pPr>
+        <w:pStyle w:val="ListBullet"/>
+      </w:pPr>
+      <w:r>
+        <w:t>环境配置：dev/test 共用 PostgreSQL 集群的不同 schema，prod 独立集群并启用主从复制。</w:t>
+      </w:r>
+    </w:p>
+    <w:p>
+      <w:pPr>
+        <w:pStyle w:val="ListBullet"/>
+      </w:pPr>
+      <w:r>
+        <w:t>监控告警：Prometheus 监控性能与业务指标，Grafana 设置告警规则，通过企业微信机器人推送。</w:t>
+      </w:r>
+    </w:p>
+    <w:p>
+      <w:pPr>
+        <w:pStyle w:val="Heading1"/>
+      </w:pPr>
+      <w:r>
+        <w:t>9. 测试与质量保证计划</w:t>
+      </w:r>
+    </w:p>
+    <w:p>
+      <w:pPr>
+        <w:pStyle w:val="ListBullet"/>
+      </w:pPr>
+      <w:r>
+        <w:t>测试范围：覆盖认证、课程、作业、通知、分析模块，重点验证核心业务流程与异常场景。</w:t>
+      </w:r>
+    </w:p>
+    <w:p>
+      <w:pPr>
+        <w:pStyle w:val="ListBullet"/>
+      </w:pPr>
+      <w:r>
+        <w:t>测试类型：单元测试、接口测试、UI 自动化测试、性能测试、安全测试。</w:t>
+      </w:r>
+    </w:p>
+    <w:p>
+      <w:pPr>
+        <w:pStyle w:val="ListBullet"/>
+      </w:pPr>
+      <w:r>
+        <w:t>测试环境：与生产一致的 Kubernetes 集群，使用匿名脱敏数据。</w:t>
+      </w:r>
+    </w:p>
+    <w:p>
+      <w:pPr>
+        <w:pStyle w:val="ListBullet"/>
+      </w:pPr>
+      <w:r>
+        <w:t>测试指标：单元测试覆盖率≥70%，关键接口响应在 SLA 内，性能测试满足 500 并发指标，无高危安全漏洞。</w:t>
+      </w:r>
+    </w:p>
+    <w:p>
+      <w:pPr>
+        <w:pStyle w:val="ListBullet"/>
+      </w:pPr>
+      <w:r>
+        <w:t>交付物：测试计划、测试用例、测试报告、缺陷列表与修复记录。</w:t>
+      </w:r>
+    </w:p>
+    <w:p>
+      <w:pPr>
+        <w:pStyle w:val="Heading1"/>
+      </w:pPr>
+      <w:r>
+        <w:t>10. 风险与缓解措施</w:t>
+      </w:r>
+    </w:p>
+    <w:tbl>
+      <w:tblPr>
+        <w:tblStyle w:val="MediumShading1-Accent1"/>
+        <w:tblW w:type="auto" w:w="0"/>
+        <w:tblLook w:firstColumn="1" w:firstRow="1" w:lastColumn="0" w:lastRow="0" w:noHBand="0" w:noVBand="1" w:val="04A0"/>
+      </w:tblPr>
+      <w:tblGrid>
+        <w:gridCol w:w="2160"/>
+        <w:gridCol w:w="2160"/>
+        <w:gridCol w:w="2160"/>
+        <w:gridCol w:w="2160"/>
+      </w:tblGrid>
+      <w:tr>
+        <w:tc>
+          <w:tcPr>
+            <w:tcW w:type="dxa" w:w="2160"/>
+          </w:tcPr>
+          <w:p>
+            <w:r>
+              <w:t>风险描述</w:t>
+            </w:r>
+          </w:p>
+        </w:tc>
+        <w:tc>
+          <w:tcPr>
+            <w:tcW w:type="dxa" w:w="2160"/>
+          </w:tcPr>
+          <w:p>
+            <w:r>
+              <w:t>影响</w:t>
+            </w:r>
+          </w:p>
+        </w:tc>
+        <w:tc>
+          <w:tcPr>
+            <w:tcW w:type="dxa" w:w="2160"/>
+          </w:tcPr>
+          <w:p>
+            <w:r>
+              <w:t>可能性</w:t>
+            </w:r>
+          </w:p>
+        </w:tc>
+        <w:tc>
+          <w:tcPr>
+            <w:tcW w:type="dxa" w:w="2160"/>
+          </w:tcPr>
+          <w:p>
+            <w:r>
+              <w:t>缓解措施</w:t>
+            </w:r>
+          </w:p>
+        </w:tc>
+      </w:tr>
+      <w:tr>
+        <w:tc>
+          <w:tcPr>
+            <w:tcW w:type="dxa" w:w="2160"/>
+          </w:tcPr>
+          <w:p>
+            <w:r>
+              <w:t>教务系统接口变动</w:t>
+            </w:r>
+          </w:p>
+        </w:tc>
+        <w:tc>
+          <w:tcPr>
+            <w:tcW w:type="dxa" w:w="2160"/>
+          </w:tcPr>
+          <w:p>
+            <w:r>
+              <w:t>影响用户同步与权限控制</w:t>
+            </w:r>
+          </w:p>
+        </w:tc>
+        <w:tc>
+          <w:tcPr>
+            <w:tcW w:type="dxa" w:w="2160"/>
+          </w:tcPr>
+          <w:p>
+            <w:r>
+              <w:t>中</w:t>
+            </w:r>
+          </w:p>
+        </w:tc>
+        <w:tc>
+          <w:tcPr>
+            <w:tcW w:type="dxa" w:w="2160"/>
+          </w:tcPr>
+          <w:p>
+            <w:r>
+              <w:t>与教务中心保持沟通，封装适配层并提前准备 Mock。</w:t>
+            </w:r>
+          </w:p>
+        </w:tc>
+      </w:tr>
+      <w:tr>
+        <w:tc>
+          <w:tcPr>
+            <w:tcW w:type="dxa" w:w="2160"/>
+          </w:tcPr>
+          <w:p>
+            <w:r>
+              <w:t>高并发导致响应延迟</w:t>
+            </w:r>
+          </w:p>
+        </w:tc>
+        <w:tc>
+          <w:tcPr>
+            <w:tcW w:type="dxa" w:w="2160"/>
+          </w:tcPr>
+          <w:p>
+            <w:r>
+              <w:t>影响学生提交体验</w:t>
+            </w:r>
+          </w:p>
+        </w:tc>
+        <w:tc>
+          <w:tcPr>
+            <w:tcW w:type="dxa" w:w="2160"/>
+          </w:tcPr>
+          <w:p>
+            <w:r>
+              <w:t>低</w:t>
+            </w:r>
+          </w:p>
+        </w:tc>
+        <w:tc>
+          <w:tcPr>
+            <w:tcW w:type="dxa" w:w="2160"/>
+          </w:tcPr>
+          <w:p>
+            <w:r>
+              <w:t>使用缓存与队列，配置弹性扩容与性能压测。</w:t>
+            </w:r>
+          </w:p>
+        </w:tc>
+      </w:tr>
+      <w:tr>
+        <w:tc>
+          <w:tcPr>
+            <w:tcW w:type="dxa" w:w="2160"/>
+          </w:tcPr>
+          <w:p>
+            <w:r>
+              <w:t>通知渠道异常</w:t>
+            </w:r>
+          </w:p>
+        </w:tc>
+        <w:tc>
+          <w:tcPr>
+            <w:tcW w:type="dxa" w:w="2160"/>
+          </w:tcPr>
+          <w:p>
+            <w:r>
+              <w:t>提醒未送达</w:t>
+            </w:r>
+          </w:p>
+        </w:tc>
+        <w:tc>
+          <w:tcPr>
+            <w:tcW w:type="dxa" w:w="2160"/>
+          </w:tcPr>
+          <w:p>
+            <w:r>
+              <w:t>中</w:t>
+            </w:r>
+          </w:p>
+        </w:tc>
+        <w:tc>
+          <w:tcPr>
+            <w:tcW w:type="dxa" w:w="2160"/>
+          </w:tcPr>
+          <w:p>
+            <w:r>
+              <w:t>多渠道冗余与失败重试，异常告警并人工补发。</w:t>
+            </w:r>
+          </w:p>
+        </w:tc>
+      </w:tr>
+      <w:tr>
+        <w:tc>
+          <w:tcPr>
+            <w:tcW w:type="dxa" w:w="2160"/>
+          </w:tcPr>
+          <w:p>
+            <w:r>
+              <w:t>数据泄露风险</w:t>
+            </w:r>
+          </w:p>
+        </w:tc>
+        <w:tc>
+          <w:tcPr>
+            <w:tcW w:type="dxa" w:w="2160"/>
+          </w:tcPr>
+          <w:p>
+            <w:r>
+              <w:t>敏感信息外泄</w:t>
+            </w:r>
+          </w:p>
+        </w:tc>
+        <w:tc>
+          <w:tcPr>
+            <w:tcW w:type="dxa" w:w="2160"/>
+          </w:tcPr>
+          <w:p>
+            <w:r>
+              <w:t>低</w:t>
+            </w:r>
+          </w:p>
+        </w:tc>
+        <w:tc>
+          <w:tcPr>
+            <w:tcW w:type="dxa" w:w="2160"/>
+          </w:tcPr>
+          <w:p>
+            <w:r>
+              <w:t>加强权限审计、加密存储与入侵检测。</w:t>
+            </w:r>
+          </w:p>
+        </w:tc>
+      </w:tr>
+    </w:tbl>
+    <w:p>
+      <w:pPr>
+        <w:pStyle w:val="Heading1"/>
+      </w:pPr>
+      <w:r>
+        <w:t>11. Sprint1 启动前准备</w:t>
+      </w:r>
+    </w:p>
+    <w:p>
+      <w:pPr>
         <w:pStyle w:val="Heading2"/>
       </w:pPr>
       <w:r>
-        <w:t>8.1 原型走查计划</w:t>
+        <w:t>11.1 原型走查计划</w:t>
       </w:r>
     </w:p>
     <w:p>
@@ -2234,7 +3663,7 @@
         <w:pStyle w:val="ListBullet"/>
       </w:pPr>
       <w:r>
-        <w:t>材料：高保真原型、交互说明、验收标准清单。</w:t>
+        <w:t>资料：高保真原型、操作说明、验收标准清单。</w:t>
       </w:r>
     </w:p>
     <w:p>
@@ -2242,7 +3671,7 @@
         <w:pStyle w:val="ListBullet"/>
       </w:pPr>
       <w:r>
-        <w:t>流程：演示 -&gt; 角色体验 -&gt; 问题记录 -&gt; 输出《原型评审纪要》。</w:t>
+        <w:t>流程：演示 -&gt; 角色体验 -&gt; 记录问题 -&gt; 输出《原型评审纪要》。</w:t>
       </w:r>
     </w:p>
     <w:p>
@@ -2250,7 +3679,7 @@
         <w:pStyle w:val="ListBullet"/>
       </w:pPr>
       <w:r>
-        <w:t>成功标准：必备流程确认，问题有责任人和解决时间。</w:t>
+        <w:t>成功标准：所有必备流程获得确认，问题分配责任人和解决时间。</w:t>
       </w:r>
     </w:p>
     <w:p>
@@ -2258,7 +3687,7 @@
         <w:pStyle w:val="Heading2"/>
       </w:pPr>
       <w:r>
-        <w:t>8.2 API 设计评审</w:t>
+        <w:t>11.2 API 设计评审</w:t>
       </w:r>
     </w:p>
     <w:p>
@@ -2266,7 +3695,7 @@
         <w:pStyle w:val="ListBullet"/>
       </w:pPr>
       <w:r>
-        <w:t>目标：锁定 Sprint1 API 字段、错误码、鉴权策略与限流规范。</w:t>
+        <w:t>目标：锁定 Sprint1 范围内的接口字段、错误码、鉴权策略与限流规范。</w:t>
       </w:r>
     </w:p>
     <w:p>
@@ -2282,7 +3711,7 @@
         <w:pStyle w:val="ListBullet"/>
       </w:pPr>
       <w:r>
-        <w:t>材料：OpenAPI 规范、接口 Mock、鉴权方案、限流策略。</w:t>
+        <w:t>资料：OpenAPI 规范、接口 Mock、鉴权方案、限流参数提案。</w:t>
       </w:r>
     </w:p>
     <w:p>
@@ -2298,12 +3727,12 @@
         <w:pStyle w:val="ListBullet"/>
       </w:pPr>
       <w:r>
-        <w:t>成功标准：形成评审纪要，OpenAPI 文档版本 v1.0.0-sprint1。</w:t>
+        <w:t>成功标准：形成评审纪要，OpenAPI 文档版本 v1.0.0-sprint1 并归档。</w:t>
       </w:r>
     </w:p>
     <w:p>
       <w:r>
-        <w:t>所有准备工作完成后，可正式进入 Sprint1 开发。</w:t>
+        <w:t>完成原型走查与 API 评审后，即可进入 Sprint1 开发阶段，并依据本说明书进行设计实现。</w:t>
       </w:r>
     </w:p>
     <w:sectPr>
@@ -2679,6 +4108,9 @@
     <w:name w:val="Normal"/>
     <w:qFormat/>
     <w:rsid w:val="00FC693F"/>
+    <w:rPr>
+      <w:rFonts w:ascii="SimSun" w:hAnsi="SimSun" w:eastAsia="宋体"/>
+    </w:rPr>
   </w:style>
   <w:style w:type="paragraph" w:styleId="Header">
     <w:name w:val="header"/>

</xml_diff>

<commit_message>
Refactor: Update architecture and sequence diagrams
Co-authored-by: aisrv0048 <aisrv0048@qiyi.com>
</commit_message>
<xml_diff>
--- a/docs/智慧课程协同平台说明书.docx
+++ b/docs/智慧课程协同平台说明书.docx
@@ -15,7 +15,7 @@
         <w:rPr>
           <w:b/>
         </w:rPr>
-        <w:t>版本：v1.1</w:t>
+        <w:t>版本：v1.2</w:t>
         <w:br/>
       </w:r>
       <w:r>
@@ -51,7 +51,7 @@
     </w:p>
     <w:p>
       <w:r>
-        <w:t>本说明书系统化描述“智慧课程协同平台”项目的需求、整体架构、模块设计、数据模型与实施计划，为开发、测试、运维与评审提供统一依据，并作为课程设计答辩材料的重要组成部分。</w:t>
+        <w:t>本说明书系统化描述“智慧课程协同平台”项目的业务需求、整体架构、模块设计、数据模型与实施计划，为开发、测试、运维、评审提供统一依据，并作为课程设计答辩材料的核心文档。</w:t>
       </w:r>
     </w:p>
     <w:p>
@@ -64,7 +64,7 @@
     </w:p>
     <w:p>
       <w:r>
-        <w:t>文档覆盖项目背景、用户画像、功能与非功能需求、系统架构、业务流程、接口协议、数据库设计、部署运维策略及测试计划，不包含源代码、运行日志与测试报告。</w:t>
+        <w:t>内容涵盖项目背景、用户画像、功能与非功能需求、系统架构、业务流程、接口协议、数据库设计、部署运维策略、测试计划与风险控制，不包含源代码、运行日志与完整测试报告。</w:t>
       </w:r>
     </w:p>
     <w:p>
@@ -237,7 +237,7 @@
     </w:p>
     <w:p>
       <w:r>
-        <w:t>“智慧课程协同平台”整合课程资源、作业流转、学习分析与多渠道通知，致力于解决传统课程设计场景中信息分散、统计困难与反馈周期长的问题。系统以云原生架构构建，强调高可用性、可扩展性与可维护性。</w:t>
+        <w:t>“智慧课程协同平台”整合课程资源、作业流转、学习分析与多渠道通知，解决传统课程设计场景中信息分散、统计困难与反馈缓慢的问题。平台采用云原生方案，强调高可用、可扩展、可观测与安全合规。</w:t>
       </w:r>
     </w:p>
     <w:p>
@@ -250,7 +250,7 @@
     </w:p>
     <w:p>
       <w:r>
-        <w:t>构建统一的课程协同门户，使教师、学生与管理员在同一平台完成资源共享、作业管理、数据分析与通知推送，预期将作业准时提交率提升 20%，教师批阅效率提升 30%。</w:t>
+        <w:t>构建统一的课程协同门户，使教师、学生、管理员在同一平台完成资源共享、作业管理、数据分析与通知推送，预期作业准时提交率提升 20%，教师批阅效率提升 30%，管理员报表生成时间缩短 40%。</w:t>
       </w:r>
     </w:p>
     <w:p>
@@ -263,7 +263,7 @@
     </w:p>
     <w:p>
       <w:r>
-        <w:t>提供一站式协作体验、实时数据洞察、跨端通知、可配置策略，并对接学校统一身份认证体系。</w:t>
+        <w:t>一站式协作体验、实时数据洞察、跨端通知、可配置策略，并与学校统一身份认证、对象存储和消息平台对接。</w:t>
       </w:r>
     </w:p>
     <w:p>
@@ -276,7 +276,7 @@
     </w:p>
     <w:p>
       <w:r>
-        <w:t>前端采用 Vue 3 + Vite，后端基于 Spring Boot 微服务体系，PostgreSQL 作为核心数据库，Redis 缓存热点数据，RabbitMQ 完成事件异步解耦，整套系统部署在学校私有云 Kubernetes 集群。</w:t>
+        <w:t>终端通过 CDN 与 WAF 接入 Ingress，API 网关统一路由至认证、课程、作业、资源、通知、分析与运维服务。基础设施包含 PostgreSQL 集群、Redis、RabbitMQ、对象存储、Elasticsearch、配置中心以及 Prometheus/Grafana/Loki 可观测体系。</w:t>
       </w:r>
     </w:p>
     <w:p>
@@ -289,7 +289,7 @@
     </w:p>
     <w:p>
       <w:r>
-        <w:t>Sprint1（第2周）：完成认证、课程列表与基础数据。Sprint2（第4周）：交付资源管理与作业流程。Sprint3（第6周）：上线学习分析与通知中心。第8周举行课程验收与答辩。</w:t>
+        <w:t>Sprint1（第2周）交付认证、课程列表与基础数据；Sprint2（第4周）上线资源管理、作业流程与迟交策略；Sprint3（第6周）提供学习分析、通知中心、讨论区；第8周完成验收与答辩材料。</w:t>
       </w:r>
     </w:p>
     <w:p>
@@ -313,7 +313,7 @@
         <w:pStyle w:val="ListBullet"/>
       </w:pPr>
       <w:r>
-        <w:t>教师：授课教师与助教，负责布置作业、批阅、统计成绩，需要移动端快速审批。</w:t>
+        <w:t>教师：授课教师与助教，负责布置作业、批阅评分、发布公告、分析学习数据，需要移动端快速审批。</w:t>
       </w:r>
     </w:p>
     <w:p>
@@ -321,7 +321,7 @@
         <w:pStyle w:val="ListBullet"/>
       </w:pPr>
       <w:r>
-        <w:t>课程管理员：教学秘书，维护课程、处理选课、导出报表，关注数据准确性与权限控制。</w:t>
+        <w:t>课程管理员：教学秘书，维护课程结构、处理选课、导出报表，关注数据准确性与权限控制。</w:t>
       </w:r>
     </w:p>
     <w:p>
@@ -329,7 +329,15 @@
         <w:pStyle w:val="ListBullet"/>
       </w:pPr>
       <w:r>
-        <w:t>用户痛点：传统平台提醒不及时、作业统计繁琐、缺乏学习数据反馈，平台通过统一门户、工作流自动化与仪表盘可视化解决上述痛点。</w:t>
+        <w:t>技术支持：信息化中心运维人员，负责监控系统运行状态、处理告警、协助排障。</w:t>
+      </w:r>
+    </w:p>
+    <w:p>
+      <w:pPr>
+        <w:pStyle w:val="ListBullet"/>
+      </w:pPr>
+      <w:r>
+        <w:t>核心痛点：传统平台提醒不及时、统计繁琐、缺乏数据反馈；本平台通过统一门户、自动化工作流与仪表盘可视化予以解决。</w:t>
       </w:r>
     </w:p>
     <w:p>
@@ -345,7 +353,7 @@
         <w:pStyle w:val="ListBullet"/>
       </w:pPr>
       <w:r>
-        <w:t>开发规范：遵循学校命名规范与代码审查标准，前端遵循学院 UI 色板、组件使用与排版规范。</w:t>
+        <w:t>开发规范：遵循学校命名规范与代码审查标准，前端遵守学院 UI 色板、组件使用与排版要求。</w:t>
       </w:r>
     </w:p>
     <w:p>
@@ -353,7 +361,7 @@
         <w:pStyle w:val="ListBullet"/>
       </w:pPr>
       <w:r>
-        <w:t>安全隐私：符合高校信息化安全标准，数据传输强制 HTTPS，敏感字段采用 AES-256 加密存储，所有访问日志保留 180 天。</w:t>
+        <w:t>安全隐私：符合高校信息化安全标准，接入 WAF 防护，数据传输 HTTPS，敏感字段 AES-256 加密，日志保留 180 天。</w:t>
       </w:r>
     </w:p>
     <w:p>
@@ -361,7 +369,7 @@
         <w:pStyle w:val="ListBullet"/>
       </w:pPr>
       <w:r>
-        <w:t>可访问性：对齐 WCAG 2.1 AA 要求，提供键盘导航、辅助标签与高对比度模式。</w:t>
+        <w:t>可访问性：对齐 WCAG 2.1 AA 要求，提供键盘导航、ARIA 标签、高对比度模式与字幕视频。</w:t>
       </w:r>
     </w:p>
     <w:p>
@@ -377,7 +385,7 @@
         <w:pStyle w:val="ListBullet"/>
       </w:pPr>
       <w:r>
-        <w:t>接口规范：RESTful JSON 接口遵守 RFC 9110，使用 OpenAPI 3.0 描述并自动生成文档。</w:t>
+        <w:t>接口规范：RESTful JSON 接口遵守 RFC 9110，OpenAPI 3.0 自动生成文档并输出 Mock 数据。</w:t>
       </w:r>
     </w:p>
     <w:p>
@@ -390,7 +398,7 @@
     </w:p>
     <w:p>
       <w:r>
-        <w:t>系统核心功能按照六大模块划分如下。</w:t>
+        <w:t>系统核心功能划分如下：</w:t>
       </w:r>
     </w:p>
     <w:p>
@@ -454,7 +462,7 @@
         <w:pStyle w:val="ListBullet"/>
       </w:pPr>
       <w:r>
-        <w:t>统一登录：支持学校 SSO 与平台账号，失败 5 次锁定 30 分钟，返回 JWT 与刷新令牌。</w:t>
+        <w:t>统一登录：支持学校 SSO 与平台账号，失败 5 次锁定 30 分钟，签发 JWT 与刷新令牌。</w:t>
       </w:r>
     </w:p>
     <w:p>
@@ -462,7 +470,7 @@
         <w:pStyle w:val="ListBullet"/>
       </w:pPr>
       <w:r>
-        <w:t>角色管理：管理员按角色配置菜单与接口权限，支持自定义角色与权限继承。</w:t>
+        <w:t>角色管理：管理员配置菜单、接口、数据权限，支持角色继承与批量授权。</w:t>
       </w:r>
     </w:p>
     <w:p>
@@ -470,7 +478,7 @@
         <w:pStyle w:val="ListBullet"/>
       </w:pPr>
       <w:r>
-        <w:t>用户同步：每日 02:00 调用教务系统 API，同步课程成员；失败自动重试并发送报警。</w:t>
+        <w:t>用户同步：每日 02:00 调用教务 API，同步课程成员、角色与班级；失败自动重试并推送告警。</w:t>
       </w:r>
     </w:p>
     <w:p>
@@ -478,7 +486,7 @@
         <w:pStyle w:val="ListBullet"/>
       </w:pPr>
       <w:r>
-        <w:t>权限审计：记录用户关键访问行为，为安全审计提供依据。</w:t>
+        <w:t>权限审计：关键访问行为写入审计日志，提供追溯查询。</w:t>
       </w:r>
     </w:p>
     <w:p>
@@ -494,7 +502,7 @@
         <w:pStyle w:val="ListBullet"/>
       </w:pPr>
       <w:r>
-        <w:t>课程空间创建：教师创建课程并设置班级、学期、标签，管理员审核后公开。</w:t>
+        <w:t>课程空间创建：教师创建课程并设置班级、学期、标签，管理员审批后公开。</w:t>
       </w:r>
     </w:p>
     <w:p>
@@ -502,7 +510,7 @@
         <w:pStyle w:val="ListBullet"/>
       </w:pPr>
       <w:r>
-        <w:t>资源上传与版本控制：单文件 ≤500MB，自动生成预览，保留最近 5 个版本并支持回滚。</w:t>
+        <w:t>资源上传与版本控制：分片上传、秒传校验、病毒扫描、自动生成预览，保留最近 5 个版本并可回滚。</w:t>
       </w:r>
     </w:p>
     <w:p>
@@ -510,7 +518,7 @@
         <w:pStyle w:val="ListBullet"/>
       </w:pPr>
       <w:r>
-        <w:t>标签检索与收藏：支持多条件筛选、收藏与常用资源快捷访问。</w:t>
+        <w:t>资源检索与收藏：按标签、关键字、上传者多条件筛选，支持收藏夹与历史记录。</w:t>
       </w:r>
     </w:p>
     <w:p>
@@ -518,7 +526,7 @@
         <w:pStyle w:val="ListBullet"/>
       </w:pPr>
       <w:r>
-        <w:t>资源权限：区分公共资源与班级独享资源，开放接口供 LMS 集成。</w:t>
+        <w:t>资源权限：区分公共/班级资源，自定义访问范围，并可导出共享链接。</w:t>
       </w:r>
     </w:p>
     <w:p>
@@ -534,7 +542,7 @@
         <w:pStyle w:val="ListBullet"/>
       </w:pPr>
       <w:r>
-        <w:t>作业布置：配置题目、截止时间、评分 Rubric，支持从模板库导入。</w:t>
+        <w:t>作业布置：配置题目、截止时间、评分 Rubric、参考资料与重复提交策略。</w:t>
       </w:r>
     </w:p>
     <w:p>
@@ -542,7 +550,7 @@
         <w:pStyle w:val="ListBullet"/>
       </w:pPr>
       <w:r>
-        <w:t>学生提交：多附件上传、自动保存草稿，截止前允许覆盖提交并保留历史。</w:t>
+        <w:t>学生提交：多附件上传、自动保存草稿、在线编辑器支持 Markdown/代码高亮，提交前进行表单校验。</w:t>
       </w:r>
     </w:p>
     <w:p>
@@ -550,7 +558,7 @@
         <w:pStyle w:val="ListBullet"/>
       </w:pPr>
       <w:r>
-        <w:t>批阅与反馈：教师在线批注、评分、批量下载；可引用 Rubric 快速评分。</w:t>
+        <w:t>批阅与反馈：教师在线批注、Rubric 评分、批量下载，支持音频/视频反馈。</w:t>
       </w:r>
     </w:p>
     <w:p>
@@ -558,7 +566,7 @@
         <w:pStyle w:val="ListBullet"/>
       </w:pPr>
       <w:r>
-        <w:t>迟交处理：内置固定扣分、比例扣分、人工审批策略，并记录扣分原因。</w:t>
+        <w:t>迟交处理：策略模式支持固定扣分、比例扣分、人工审批，并在成绩单与通知中体现。</w:t>
       </w:r>
     </w:p>
     <w:p>
@@ -574,7 +582,7 @@
         <w:pStyle w:val="ListBullet"/>
       </w:pPr>
       <w:r>
-        <w:t>班级仪表盘：展示提交率、平均分、知识点掌握度热力图与滞后学生名单。</w:t>
+        <w:t>班级仪表盘：展示提交率、平均分、知识点掌握度热力图、滞后学生名单。</w:t>
       </w:r>
     </w:p>
     <w:p>
@@ -582,7 +590,7 @@
         <w:pStyle w:val="ListBullet"/>
       </w:pPr>
       <w:r>
-        <w:t>个人学习轨迹：展示成绩趋势、反馈历史、线上学习时长与活跃度。</w:t>
+        <w:t>个人学习轨迹：展示成绩趋势、反馈历史、学习时长与活跃度评分。</w:t>
       </w:r>
     </w:p>
     <w:p>
@@ -590,7 +598,7 @@
         <w:pStyle w:val="ListBullet"/>
       </w:pPr>
       <w:r>
-        <w:t>导出报表：支持 CSV/PDF/Excel，生成时间 ≤10 秒，并可邮件发送。</w:t>
+        <w:t>自定义 KPI：教师可挑选指标如及时率、优秀率、讨论活跃度并生成报告。</w:t>
       </w:r>
     </w:p>
     <w:p>
@@ -598,7 +606,7 @@
         <w:pStyle w:val="ListBullet"/>
       </w:pPr>
       <w:r>
-        <w:t>指标自定义：教师可选择 KPI 指标，如提交及时率、优秀率、活跃度等。</w:t>
+        <w:t>报表导出：支持 CSV/PDF/Excel，生成时间 ≤10 秒，允许定时生成并邮件发送。</w:t>
       </w:r>
     </w:p>
     <w:p>
@@ -614,7 +622,7 @@
         <w:pStyle w:val="ListBullet"/>
       </w:pPr>
       <w:r>
-        <w:t>多渠道通知：在截止前 24 小时与 1 小时自动推送站内信、邮件、企业微信。</w:t>
+        <w:t>多渠道通知：站内信、邮件、企业微信、短信，支持发送策略和节流。</w:t>
       </w:r>
     </w:p>
     <w:p>
@@ -622,7 +630,7 @@
         <w:pStyle w:val="ListBullet"/>
       </w:pPr>
       <w:r>
-        <w:t>讨论区：按话题组织讨论，支持富文本、引用、附件与 @ 功能。</w:t>
+        <w:t>讨论区：按话题组织，支持富文本、附件、引用、置顶与敏感词过滤。</w:t>
       </w:r>
     </w:p>
     <w:p>
@@ -630,7 +638,7 @@
         <w:pStyle w:val="ListBullet"/>
       </w:pPr>
       <w:r>
-        <w:t>FAQ 智能检索：基于 TF-IDF 与关键词抽取推荐历史答案。</w:t>
+        <w:t>FAQ 知识库：自动索引历史问题，提供智能推荐与标签管理。</w:t>
       </w:r>
     </w:p>
     <w:p>
@@ -638,7 +646,7 @@
         <w:pStyle w:val="ListBullet"/>
       </w:pPr>
       <w:r>
-        <w:t>公告中心：管理员发布系统公告，支持定时发布与阅读统计。</w:t>
+        <w:t>公告中心：管理员定时发布公告，记录阅读统计。</w:t>
       </w:r>
     </w:p>
     <w:p>
@@ -654,7 +662,7 @@
         <w:pStyle w:val="ListBullet"/>
       </w:pPr>
       <w:r>
-        <w:t>健康监控：Prometheus + Grafana 全量接入，设置 CPU、内存、响应时间告警阈值。</w:t>
+        <w:t>健康监控：Prometheus + Grafana + Loki，采集性能指标、日志、业务指标并设置告警。</w:t>
       </w:r>
     </w:p>
     <w:p>
@@ -662,7 +670,7 @@
         <w:pStyle w:val="ListBullet"/>
       </w:pPr>
       <w:r>
-        <w:t>日志审计：关键操作写入 Elasticsearch，提供 Kibana 可视化检索。</w:t>
+        <w:t>日志审计：关键操作写入 Elasticsearch，在 Kibana 中可视化检索。</w:t>
       </w:r>
     </w:p>
     <w:p>
@@ -670,7 +678,7 @@
         <w:pStyle w:val="ListBullet"/>
       </w:pPr>
       <w:r>
-        <w:t>配置中心：Spring Cloud Config 存储配置，支持灰度发布与回滚。</w:t>
+        <w:t>配置中心：Spring Cloud Config 动态下发配置，支持灰度与回滚。</w:t>
       </w:r>
     </w:p>
     <w:p>
@@ -678,14 +686,14 @@
         <w:pStyle w:val="ListBullet"/>
       </w:pPr>
       <w:r>
-        <w:t>备份策略：数据库每日全量 + WAL 备份，对象存储开启版本控制。</w:t>
+        <w:t>备份与容灾：数据库 WAL + 日常全量备份，对象存储版本控制并异地复制。</w:t>
       </w:r>
     </w:p>
     <w:p>
       <w:r>
         <w:drawing>
           <wp:inline xmlns:a="http://schemas.openxmlformats.org/drawingml/2006/main" xmlns:pic="http://schemas.openxmlformats.org/drawingml/2006/picture">
-            <wp:extent cx="5029200" cy="14493699"/>
+            <wp:extent cx="5029200" cy="22020859"/>
             <wp:docPr id="1" name="Picture 1"/>
             <wp:cNvGraphicFramePr>
               <a:graphicFrameLocks noChangeAspect="1"/>
@@ -706,7 +714,7 @@
                   <pic:spPr>
                     <a:xfrm>
                       <a:off x="0" y="0"/>
-                      <a:ext cx="5029200" cy="14493699"/>
+                      <a:ext cx="5029200" cy="22020859"/>
                     </a:xfrm>
                     <a:prstGeom prst="rect"/>
                   </pic:spPr>
@@ -743,7 +751,7 @@
         <w:pStyle w:val="ListBullet"/>
       </w:pPr>
       <w:r>
-        <w:t>统一蓝白配色，主字体采用思源黑体，支持暗色模式。</w:t>
+        <w:t>统一蓝白配色，主字体思源黑体，提供暗色模式与字号调整。</w:t>
       </w:r>
     </w:p>
     <w:p>
@@ -751,7 +759,7 @@
         <w:pStyle w:val="ListBullet"/>
       </w:pPr>
       <w:r>
-        <w:t>关键操作路径不超过 3 步，按钮对比度≥4.5:1，输入框提供即时校验提示。</w:t>
+        <w:t>关键任务路径不超过 3 步，按钮对比度≥4.5:1，字段实时校验并提供语音提示。</w:t>
       </w:r>
     </w:p>
     <w:p>
@@ -759,7 +767,7 @@
         <w:pStyle w:val="ListBullet"/>
       </w:pPr>
       <w:r>
-        <w:t>提供新手引导、功能引导视频与操作手册下载，首屏渲染 ≤2 秒。</w:t>
+        <w:t>提供新手引导、操作视频与在线帮助中心，首屏渲染 ≤2 秒。</w:t>
       </w:r>
     </w:p>
     <w:p>
@@ -783,7 +791,7 @@
         <w:pStyle w:val="ListBullet"/>
       </w:pPr>
       <w:r>
-        <w:t>运行环境：Kubernetes1.29（3 节点）、Nginx、Redis7、RabbitMQ3.12、Elastic Stack8。</w:t>
+        <w:t>运行环境：Kubernetes1.29（三节点）、Nginx Ingress、Redis7、RabbitMQ3.12、Elastic Stack8。</w:t>
       </w:r>
     </w:p>
     <w:p>
@@ -791,7 +799,7 @@
         <w:pStyle w:val="ListBullet"/>
       </w:pPr>
       <w:r>
-        <w:t>部署流程：GitLab CI 触发构建 -&gt; 单元测试 -&gt; SonarQube 扫描 -&gt; Docker 镜像 -&gt; Helm 部署。</w:t>
+        <w:t>部署流程：GitLab CI -&gt; 单元测试 -&gt; SonarQube -&gt; Docker 镜像 -&gt; Helm 部署，支持蓝绿/金丝雀发布。</w:t>
       </w:r>
     </w:p>
     <w:p>
@@ -807,7 +815,7 @@
         <w:pStyle w:val="ListBullet"/>
       </w:pPr>
       <w:r>
-        <w:t>性能：并发 500 用户时 95% 请求 ≤1.5 秒；作业批量导出吞吐 ≥100 份/分钟。</w:t>
+        <w:t>性能：并发 500 用户时 95% 请求 ≤1.5 秒；作业导出吞吐 ≥100 份/分钟；对象存储下载成功率 ≥99.9%。</w:t>
       </w:r>
     </w:p>
     <w:p>
@@ -815,7 +823,7 @@
         <w:pStyle w:val="ListBullet"/>
       </w:pPr>
       <w:r>
-        <w:t>可靠性：月可用性≥99.5%，支持蓝绿发布，故障平均恢复时间 ≤30 分钟。</w:t>
+        <w:t>可靠性：月可用性≥99.5%，关键服务双副本，故障平均恢复时间 ≤30 分钟。</w:t>
       </w:r>
     </w:p>
     <w:p>
@@ -823,7 +831,7 @@
         <w:pStyle w:val="ListBullet"/>
       </w:pPr>
       <w:r>
-        <w:t>安全性：OAuth2.0 登录，AES-256 静态加密，敏感操作双因素认证，支持 RBAC 与审计。</w:t>
+        <w:t>安全性：OAuth2.0 + JWT 鉴权，敏感操作双因素认证，WAF + API 限流策略防护。</w:t>
       </w:r>
     </w:p>
     <w:p>
@@ -831,7 +839,7 @@
         <w:pStyle w:val="ListBullet"/>
       </w:pPr>
       <w:r>
-        <w:t>可维护性：单元测试覆盖率≥70%，集成测试覆盖核心流程≥50%，Swagger 自动生成接口文档。</w:t>
+        <w:t>可维护性：单元测试覆盖率≥70%，集成测试覆盖核心流程≥50%，Swagger/OpenAPI 自动更新。</w:t>
       </w:r>
     </w:p>
     <w:p>
@@ -839,7 +847,7 @@
         <w:pStyle w:val="ListBullet"/>
       </w:pPr>
       <w:r>
-        <w:t>可扩展性：微服务可横向扩容，缓存与队列策略可动态调整。</w:t>
+        <w:t>可扩展性：微服务可横向扩容，缓存、队列、搜索索引均支持弹性调整。</w:t>
       </w:r>
     </w:p>
     <w:p>
@@ -863,7 +871,7 @@
         <w:pStyle w:val="ListBullet"/>
       </w:pPr>
       <w:r>
-        <w:t>培训与支持：提供 2 小时线上培训、用户手册、FAQ 与工单系统。</w:t>
+        <w:t>培训与支持：提供 2 小时线上培训、用户手册、FAQ、工单系统。</w:t>
       </w:r>
     </w:p>
     <w:p>
@@ -871,14 +879,14 @@
         <w:pStyle w:val="ListBullet"/>
       </w:pPr>
       <w:r>
-        <w:t>合规性：遵守学校数据治理规范与《个人信息保护法》。</w:t>
+        <w:t>合规性：遵守学校数据治理、个人信息保护法与网络安全法。</w:t>
       </w:r>
     </w:p>
     <w:p>
       <w:r>
         <w:drawing>
           <wp:inline xmlns:a="http://schemas.openxmlformats.org/drawingml/2006/main" xmlns:pic="http://schemas.openxmlformats.org/drawingml/2006/picture">
-            <wp:extent cx="5029200" cy="21808235"/>
+            <wp:extent cx="5029200" cy="34735008"/>
             <wp:docPr id="2" name="Picture 2"/>
             <wp:cNvGraphicFramePr>
               <a:graphicFrameLocks noChangeAspect="1"/>
@@ -899,7 +907,7 @@
                   <pic:spPr>
                     <a:xfrm>
                       <a:off x="0" y="0"/>
-                      <a:ext cx="5029200" cy="21808235"/>
+                      <a:ext cx="5029200" cy="34735008"/>
                     </a:xfrm>
                     <a:prstGeom prst="rect"/>
                   </pic:spPr>
@@ -919,7 +927,7 @@
       <w:r>
         <w:drawing>
           <wp:inline xmlns:a="http://schemas.openxmlformats.org/drawingml/2006/main" xmlns:pic="http://schemas.openxmlformats.org/drawingml/2006/picture">
-            <wp:extent cx="5029200" cy="3560212"/>
+            <wp:extent cx="5029200" cy="3765485"/>
             <wp:docPr id="3" name="Picture 3"/>
             <wp:cNvGraphicFramePr>
               <a:graphicFrameLocks noChangeAspect="1"/>
@@ -940,7 +948,7 @@
                   <pic:spPr>
                     <a:xfrm>
                       <a:off x="0" y="0"/>
-                      <a:ext cx="5029200" cy="3560212"/>
+                      <a:ext cx="5029200" cy="3765485"/>
                     </a:xfrm>
                     <a:prstGeom prst="rect"/>
                   </pic:spPr>
@@ -960,7 +968,7 @@
       <w:r>
         <w:drawing>
           <wp:inline xmlns:a="http://schemas.openxmlformats.org/drawingml/2006/main" xmlns:pic="http://schemas.openxmlformats.org/drawingml/2006/picture">
-            <wp:extent cx="5029200" cy="5074392"/>
+            <wp:extent cx="5029200" cy="3348523"/>
             <wp:docPr id="4" name="Picture 4"/>
             <wp:cNvGraphicFramePr>
               <a:graphicFrameLocks noChangeAspect="1"/>
@@ -981,7 +989,7 @@
                   <pic:spPr>
                     <a:xfrm>
                       <a:off x="0" y="0"/>
-                      <a:ext cx="5029200" cy="5074392"/>
+                      <a:ext cx="5029200" cy="3348523"/>
                     </a:xfrm>
                     <a:prstGeom prst="rect"/>
                   </pic:spPr>
@@ -1015,14 +1023,14 @@
     </w:p>
     <w:p>
       <w:r>
-        <w:t>平台采用前后端分离 + 微服务架构，通过 API 网关统一鉴权与流量管理，业务服务按领域拆分，所有服务通过消息队列与配置中心保持解耦，并接入统一监控体系。</w:t>
+        <w:t>平台采用前后端分离 + 微服务架构，终端请求经 CDN、WAF、Ingress 进入 API 网关。业务服务按领域拆分，配置中心统一下发配置，消息队列与对象存储解耦异步任务，可观测平台（Prometheus/Grafana/Loki）提供全链路监控。</w:t>
       </w:r>
     </w:p>
     <w:p>
       <w:r>
         <w:drawing>
           <wp:inline xmlns:a="http://schemas.openxmlformats.org/drawingml/2006/main" xmlns:pic="http://schemas.openxmlformats.org/drawingml/2006/picture">
-            <wp:extent cx="5486400" cy="2379306"/>
+            <wp:extent cx="5486400" cy="4072812"/>
             <wp:docPr id="5" name="Picture 5"/>
             <wp:cNvGraphicFramePr>
               <a:graphicFrameLocks noChangeAspect="1"/>
@@ -1043,7 +1051,7 @@
                   <pic:spPr>
                     <a:xfrm>
                       <a:off x="0" y="0"/>
-                      <a:ext cx="5486400" cy="2379306"/>
+                      <a:ext cx="5486400" cy="4072812"/>
                     </a:xfrm>
                     <a:prstGeom prst="rect"/>
                   </pic:spPr>
@@ -1080,7 +1088,7 @@
         <w:pStyle w:val="ListBullet"/>
       </w:pPr>
       <w:r>
-        <w:t>职责：处理登录、刷新 Token、角色权限同步与会话管理。</w:t>
+        <w:t>职责：处理登录、刷新 Token、角色权限同步、审计记录。</w:t>
       </w:r>
     </w:p>
     <w:p>
@@ -1088,7 +1096,7 @@
         <w:pStyle w:val="ListBullet"/>
       </w:pPr>
       <w:r>
-        <w:t>核心组件：AuthController、SSOClient、UserService、RoleService、TokenProvider。</w:t>
+        <w:t>组件：AuthController、SSOClient、UserService、RoleService、TokenProvider、AuditPublisher。</w:t>
       </w:r>
     </w:p>
     <w:p>
@@ -1096,7 +1104,7 @@
         <w:pStyle w:val="ListBullet"/>
       </w:pPr>
       <w:r>
-        <w:t>关键流程：验证凭证 -&gt; 查询用户、角色 -&gt; 生成 JWT 与刷新令牌，记录登录审计日志。</w:t>
+        <w:t>流程：校验凭证 -&gt; 查询用户角色 -&gt; 生成 JWT -&gt; 写入 Redis 会话 -&gt; 发布审计事件。</w:t>
       </w:r>
     </w:p>
     <w:p>
@@ -1112,7 +1120,7 @@
         <w:pStyle w:val="ListBullet"/>
       </w:pPr>
       <w:r>
-        <w:t>职责：管理课程元数据、班级成员与课程公告。</w:t>
+        <w:t>职责：管理课程结构、成员、公告与标签。</w:t>
       </w:r>
     </w:p>
     <w:p>
@@ -1120,7 +1128,7 @@
         <w:pStyle w:val="ListBullet"/>
       </w:pPr>
       <w:r>
-        <w:t>核心组件：CourseController、CourseService、CourseRepository、AuditPublisher。</w:t>
+        <w:t>组件：CourseController、CourseService、CourseRepository、ApprovalWorkflow、AuditPublisher。</w:t>
       </w:r>
     </w:p>
     <w:p>
@@ -1128,7 +1136,7 @@
         <w:pStyle w:val="ListBullet"/>
       </w:pPr>
       <w:r>
-        <w:t>设计要点：使用策略模式处理审批流程，支持与教务系统同步课程数据。</w:t>
+        <w:t>要点：审批流程使用状态机封装，支持教务同步与审批记录留痕。</w:t>
       </w:r>
     </w:p>
     <w:p>
@@ -1144,7 +1152,7 @@
         <w:pStyle w:val="ListBullet"/>
       </w:pPr>
       <w:r>
-        <w:t>职责：负责资源上传、版本控制、预览生成与访问权限。</w:t>
+        <w:t>职责：资源上传、版本管理、预览生成、病毒扫描、搜索索引。</w:t>
       </w:r>
     </w:p>
     <w:p>
@@ -1152,7 +1160,7 @@
         <w:pStyle w:val="ListBullet"/>
       </w:pPr>
       <w:r>
-        <w:t>核心组件：ResourceController、ResourceService、StorageClient（对接对象存储）、PreviewWorker。</w:t>
+        <w:t>组件：ResourceController、ResourceService、StorageClient、VirusScanWorker、PreviewWorker、IndexSync。</w:t>
       </w:r>
     </w:p>
     <w:p>
@@ -1160,7 +1168,7 @@
         <w:pStyle w:val="ListBullet"/>
       </w:pPr>
       <w:r>
-        <w:t>设计要点：采用事件驱动生成预览，版本表记录历史元数据，权限与课程成员关联。</w:t>
+        <w:t>要点：上传采用预签名 URL 与分片，扫描失败时自动隔离文件并提示管理员。</w:t>
       </w:r>
     </w:p>
     <w:p>
@@ -1176,7 +1184,7 @@
         <w:pStyle w:val="ListBullet"/>
       </w:pPr>
       <w:r>
-        <w:t>职责：作业布置、提交、批阅、迟交策略与成绩计算。</w:t>
+        <w:t>职责：作业布置、提交、Rubric、迟交策略、成绩计算。</w:t>
       </w:r>
     </w:p>
     <w:p>
@@ -1184,7 +1192,7 @@
         <w:pStyle w:val="ListBullet"/>
       </w:pPr>
       <w:r>
-        <w:t>核心组件：AssignmentController、SubmissionService、ReviewService、LatePolicyEngine、RubricEvaluator。</w:t>
+        <w:t>组件：AssignmentController、SubmissionService、ReviewService、LatePolicyEngine、RubricEvaluator、EventPublisher。</w:t>
       </w:r>
     </w:p>
     <w:p>
@@ -1192,7 +1200,7 @@
         <w:pStyle w:val="ListBullet"/>
       </w:pPr>
       <w:r>
-        <w:t>设计要点：迟交策略使用策略模式，RubricEvaluator 支持按标准项加权评分。</w:t>
+        <w:t>要点：RubricEvaluator 支持按维度权重评分，LatePolicyEngine 策略可热更新。</w:t>
       </w:r>
     </w:p>
     <w:p>
@@ -1208,7 +1216,7 @@
         <w:pStyle w:val="ListBullet"/>
       </w:pPr>
       <w:r>
-        <w:t>职责：学习数据采集、指标计算、报表导出。</w:t>
+        <w:t>职责：数据采集、指标计算、报表导出、仪表盘缓存。</w:t>
       </w:r>
     </w:p>
     <w:p>
@@ -1216,7 +1224,7 @@
         <w:pStyle w:val="ListBullet"/>
       </w:pPr>
       <w:r>
-        <w:t>核心组件：AnalyticsScheduler（ETL）、AnalyticsQueryService、DashboardBuilder、ReportExporter。</w:t>
+        <w:t>组件：AnalyticsScheduler、CDCConsumer、AnalyticsQueryService、DashboardBuilder、ReportExporter。</w:t>
       </w:r>
     </w:p>
     <w:p>
@@ -1224,7 +1232,7 @@
         <w:pStyle w:val="ListBullet"/>
       </w:pPr>
       <w:r>
-        <w:t>设计要点：CDC 同步数据到分析库，定时聚合指标，缓存热点仪表盘。</w:t>
+        <w:t>要点：通过 Debezium 捕获数据库变更，定时聚合指标并写入数据仓库。</w:t>
       </w:r>
     </w:p>
     <w:p>
@@ -1240,7 +1248,7 @@
         <w:pStyle w:val="ListBullet"/>
       </w:pPr>
       <w:r>
-        <w:t>职责：站内信、邮件、企业微信消息发送与模板管理。</w:t>
+        <w:t>职责：站内信、邮件、企业微信、短信发送与模版管理。</w:t>
       </w:r>
     </w:p>
     <w:p>
@@ -1248,7 +1256,7 @@
         <w:pStyle w:val="ListBullet"/>
       </w:pPr>
       <w:r>
-        <w:t>核心组件：NotificationController、NotificationWorker、ChannelStrategy（Mail/SMS/WeCom）、TemplateRepository。</w:t>
+        <w:t>组件：NotificationController、NotificationWorker、ChannelStrategy、TemplateRepository、RateLimiter。</w:t>
       </w:r>
     </w:p>
     <w:p>
@@ -1256,7 +1264,7 @@
         <w:pStyle w:val="ListBullet"/>
       </w:pPr>
       <w:r>
-        <w:t>设计要点：消息采用事件队列解耦，失败重试并记录状态。</w:t>
+        <w:t>要点：事件驱动 + 限流保护，高优先级消息支持快速重试与人工补发。</w:t>
       </w:r>
     </w:p>
     <w:p>
@@ -1272,7 +1280,7 @@
         <w:pStyle w:val="ListBullet"/>
       </w:pPr>
       <w:r>
-        <w:t>职责：暴露健康检查、性能指标、审计日志。</w:t>
+        <w:t>职责：暴露健康检查、指标、日志，联动告警渠道。</w:t>
       </w:r>
     </w:p>
     <w:p>
@@ -1280,7 +1288,89 @@
         <w:pStyle w:val="ListBullet"/>
       </w:pPr>
       <w:r>
-        <w:t>核心组件：Spring Boot Actuator、Logback、Filebeat、Elasticsearch、Grafana Dashboard。</w:t>
+        <w:t>组件：Spring Boot Actuator、MetricsCollector、Logback、Filebeat/Loki、AlertManagerConnector。</w:t>
+      </w:r>
+    </w:p>
+    <w:p>
+      <w:r>
+        <w:drawing>
+          <wp:inline xmlns:a="http://schemas.openxmlformats.org/drawingml/2006/main" xmlns:pic="http://schemas.openxmlformats.org/drawingml/2006/picture">
+            <wp:extent cx="5029200" cy="3444745"/>
+            <wp:docPr id="6" name="Picture 6"/>
+            <wp:cNvGraphicFramePr>
+              <a:graphicFrameLocks noChangeAspect="1"/>
+            </wp:cNvGraphicFramePr>
+            <a:graphic>
+              <a:graphicData uri="http://schemas.openxmlformats.org/drawingml/2006/picture">
+                <pic:pic>
+                  <pic:nvPicPr>
+                    <pic:cNvPr id="0" name="resource_upload_sequence.png"/>
+                    <pic:cNvPicPr/>
+                  </pic:nvPicPr>
+                  <pic:blipFill>
+                    <a:blip r:embed="rId14"/>
+                    <a:stretch>
+                      <a:fillRect/>
+                    </a:stretch>
+                  </pic:blipFill>
+                  <pic:spPr>
+                    <a:xfrm>
+                      <a:off x="0" y="0"/>
+                      <a:ext cx="5029200" cy="3444745"/>
+                    </a:xfrm>
+                    <a:prstGeom prst="rect"/>
+                  </pic:spPr>
+                </pic:pic>
+              </a:graphicData>
+            </a:graphic>
+          </wp:inline>
+        </w:drawing>
+      </w:r>
+    </w:p>
+    <w:p>
+      <w:r>
+        <w:t>图 6-2 资源上传流程时序图</w:t>
+      </w:r>
+    </w:p>
+    <w:p>
+      <w:r>
+        <w:drawing>
+          <wp:inline xmlns:a="http://schemas.openxmlformats.org/drawingml/2006/main" xmlns:pic="http://schemas.openxmlformats.org/drawingml/2006/picture">
+            <wp:extent cx="5029200" cy="13373299"/>
+            <wp:docPr id="7" name="Picture 7"/>
+            <wp:cNvGraphicFramePr>
+              <a:graphicFrameLocks noChangeAspect="1"/>
+            </wp:cNvGraphicFramePr>
+            <a:graphic>
+              <a:graphicData uri="http://schemas.openxmlformats.org/drawingml/2006/picture">
+                <pic:pic>
+                  <pic:nvPicPr>
+                    <pic:cNvPr id="0" name="late_policy_flow.png"/>
+                    <pic:cNvPicPr/>
+                  </pic:nvPicPr>
+                  <pic:blipFill>
+                    <a:blip r:embed="rId15"/>
+                    <a:stretch>
+                      <a:fillRect/>
+                    </a:stretch>
+                  </pic:blipFill>
+                  <pic:spPr>
+                    <a:xfrm>
+                      <a:off x="0" y="0"/>
+                      <a:ext cx="5029200" cy="13373299"/>
+                    </a:xfrm>
+                    <a:prstGeom prst="rect"/>
+                  </pic:spPr>
+                </pic:pic>
+              </a:graphicData>
+            </a:graphic>
+          </wp:inline>
+        </w:drawing>
+      </w:r>
+    </w:p>
+    <w:p>
+      <w:r>
+        <w:t>图 6-3 迟交扣分决策流程图</w:t>
       </w:r>
     </w:p>
     <w:p>
@@ -1393,7 +1483,59 @@
           </w:tcPr>
           <w:p>
             <w:r>
-              <w:t>请求业务接口</w:t>
+              <w:t>访问业务接口</w:t>
+            </w:r>
+          </w:p>
+        </w:tc>
+        <w:tc>
+          <w:tcPr>
+            <w:tcW w:type="dxa" w:w="1728"/>
+          </w:tcPr>
+          <w:p>
+            <w:r>
+              <w:t>JWT + HTTPS</w:t>
+            </w:r>
+          </w:p>
+        </w:tc>
+      </w:tr>
+      <w:tr>
+        <w:tc>
+          <w:tcPr>
+            <w:tcW w:type="dxa" w:w="1728"/>
+          </w:tcPr>
+          <w:p>
+            <w:r>
+              <w:t>移动端 H5</w:t>
+            </w:r>
+          </w:p>
+        </w:tc>
+        <w:tc>
+          <w:tcPr>
+            <w:tcW w:type="dxa" w:w="1728"/>
+          </w:tcPr>
+          <w:p>
+            <w:r>
+              <w:t>API 网关</w:t>
+            </w:r>
+          </w:p>
+        </w:tc>
+        <w:tc>
+          <w:tcPr>
+            <w:tcW w:type="dxa" w:w="1728"/>
+          </w:tcPr>
+          <w:p>
+            <w:r>
+              <w:t>HTTPS/REST</w:t>
+            </w:r>
+          </w:p>
+        </w:tc>
+        <w:tc>
+          <w:tcPr>
+            <w:tcW w:type="dxa" w:w="1728"/>
+          </w:tcPr>
+          <w:p>
+            <w:r>
+              <w:t>移动访问</w:t>
             </w:r>
           </w:p>
         </w:tc>
@@ -1435,7 +1577,7 @@
           </w:tcPr>
           <w:p>
             <w:r>
-              <w:t>HTTP</w:t>
+              <w:t>HTTP/gRPC</w:t>
             </w:r>
           </w:p>
         </w:tc>
@@ -1445,7 +1587,7 @@
           </w:tcPr>
           <w:p>
             <w:r>
-              <w:t>统一鉴权与 Token 校验</w:t>
+              <w:t>鉴权与 Token 校验</w:t>
             </w:r>
           </w:p>
         </w:tc>
@@ -1455,7 +1597,7 @@
           </w:tcPr>
           <w:p>
             <w:r>
-              <w:t>内部网络 + mTLS</w:t>
+              <w:t>mTLS + 白名单</w:t>
             </w:r>
           </w:p>
         </w:tc>
@@ -1467,7 +1609,7 @@
           </w:tcPr>
           <w:p>
             <w:r>
-              <w:t>课程服务</w:t>
+              <w:t>资源服务</w:t>
             </w:r>
           </w:p>
         </w:tc>
@@ -1477,7 +1619,7 @@
           </w:tcPr>
           <w:p>
             <w:r>
-              <w:t>作业服务</w:t>
+              <w:t>对象存储</w:t>
             </w:r>
           </w:p>
         </w:tc>
@@ -1487,7 +1629,7 @@
           </w:tcPr>
           <w:p>
             <w:r>
-              <w:t>gRPC</w:t>
+              <w:t>HTTPS/S3</w:t>
             </w:r>
           </w:p>
         </w:tc>
@@ -1497,7 +1639,7 @@
           </w:tcPr>
           <w:p>
             <w:r>
-              <w:t>查询作业关联课程信息</w:t>
+              <w:t>文件上传与预览</w:t>
             </w:r>
           </w:p>
         </w:tc>
@@ -1507,7 +1649,7 @@
           </w:tcPr>
           <w:p>
             <w:r>
-              <w:t>Service Account + mTLS</w:t>
+              <w:t>预签名 URL + 防盗链</w:t>
             </w:r>
           </w:p>
         </w:tc>
@@ -1549,7 +1691,7 @@
           </w:tcPr>
           <w:p>
             <w:r>
-              <w:t>提交与批阅事件通知</w:t>
+              <w:t>作业事件通知</w:t>
             </w:r>
           </w:p>
         </w:tc>
@@ -1571,6 +1713,16 @@
           </w:tcPr>
           <w:p>
             <w:r>
+              <w:t>作业服务</w:t>
+            </w:r>
+          </w:p>
+        </w:tc>
+        <w:tc>
+          <w:tcPr>
+            <w:tcW w:type="dxa" w:w="1728"/>
+          </w:tcPr>
+          <w:p>
+            <w:r>
               <w:t>分析服务</w:t>
             </w:r>
           </w:p>
@@ -1581,7 +1733,7 @@
           </w:tcPr>
           <w:p>
             <w:r>
-              <w:t>PostgreSQL CDC</w:t>
+              <w:t>Kafka</w:t>
             </w:r>
           </w:p>
         </w:tc>
@@ -1591,7 +1743,7 @@
           </w:tcPr>
           <w:p>
             <w:r>
-              <w:t>Debezium</w:t>
+              <w:t>指标事件推送</w:t>
             </w:r>
           </w:p>
         </w:tc>
@@ -1601,17 +1753,7 @@
           </w:tcPr>
           <w:p>
             <w:r>
-              <w:t>同步增量数据</w:t>
-            </w:r>
-          </w:p>
-        </w:tc>
-        <w:tc>
-          <w:tcPr>
-            <w:tcW w:type="dxa" w:w="1728"/>
-          </w:tcPr>
-          <w:p>
-            <w:r>
-              <w:t>只读账号 + 白名单</w:t>
+              <w:t>SASL + ACL 控制</w:t>
             </w:r>
           </w:p>
         </w:tc>
@@ -1623,7 +1765,7 @@
           </w:tcPr>
           <w:p>
             <w:r>
-              <w:t>通知服务</w:t>
+              <w:t>运维监控</w:t>
             </w:r>
           </w:p>
         </w:tc>
@@ -1633,7 +1775,7 @@
           </w:tcPr>
           <w:p>
             <w:r>
-              <w:t>企业微信</w:t>
+              <w:t>AlertManager</w:t>
             </w:r>
           </w:p>
         </w:tc>
@@ -1643,7 +1785,7 @@
           </w:tcPr>
           <w:p>
             <w:r>
-              <w:t>HTTPS API</w:t>
+              <w:t>HTTP</w:t>
             </w:r>
           </w:p>
         </w:tc>
@@ -1653,7 +1795,7 @@
           </w:tcPr>
           <w:p>
             <w:r>
-              <w:t>推送提醒</w:t>
+              <w:t>发送告警</w:t>
             </w:r>
           </w:p>
         </w:tc>
@@ -1663,212 +1805,15 @@
           </w:tcPr>
           <w:p>
             <w:r>
-              <w:t>企业密钥 + IP 白名单</w:t>
+              <w:t>Webhook 签名</w:t>
             </w:r>
           </w:p>
         </w:tc>
       </w:tr>
     </w:tbl>
     <w:p>
-      <w:pPr>
-        <w:pStyle w:val="Heading2"/>
-      </w:pPr>
       <w:r>
-        <w:t>6.4 关键业务流程说明</w:t>
-      </w:r>
-    </w:p>
-    <w:p>
-      <w:pPr>
-        <w:pStyle w:val="ListNumber"/>
-      </w:pPr>
-      <w:r>
-        <w:t>作业提交流程：学生在截止时间前完成作业填写，系统提供草稿保存、附件校验与提交确认。提交成功后产生事件进入队列，通知教师及时批阅。</w:t>
-      </w:r>
-    </w:p>
-    <w:p>
-      <w:pPr>
-        <w:pStyle w:val="ListNumber"/>
-      </w:pPr>
-      <w:r>
-        <w:t>资源上传流程：教师上传文件后写入元数据，生成版本记录，并异步触发预览任务，预览完成前状态展示为“处理中”。</w:t>
-      </w:r>
-    </w:p>
-    <w:p>
-      <w:pPr>
-        <w:pStyle w:val="ListNumber"/>
-      </w:pPr>
-      <w:r>
-        <w:t>迟交扣分流程：超时提交触发策略引擎，根据课程配置选择固定扣分、比例扣分或人工审核策略，并同步到成绩单。</w:t>
-      </w:r>
-    </w:p>
-    <w:p>
-      <w:r>
-        <w:drawing>
-          <wp:inline xmlns:a="http://schemas.openxmlformats.org/drawingml/2006/main" xmlns:pic="http://schemas.openxmlformats.org/drawingml/2006/picture">
-            <wp:extent cx="5029200" cy="2931562"/>
-            <wp:docPr id="6" name="Picture 6"/>
-            <wp:cNvGraphicFramePr>
-              <a:graphicFrameLocks noChangeAspect="1"/>
-            </wp:cNvGraphicFramePr>
-            <a:graphic>
-              <a:graphicData uri="http://schemas.openxmlformats.org/drawingml/2006/picture">
-                <pic:pic>
-                  <pic:nvPicPr>
-                    <pic:cNvPr id="0" name="resource_upload_sequence.png"/>
-                    <pic:cNvPicPr/>
-                  </pic:nvPicPr>
-                  <pic:blipFill>
-                    <a:blip r:embed="rId14"/>
-                    <a:stretch>
-                      <a:fillRect/>
-                    </a:stretch>
-                  </pic:blipFill>
-                  <pic:spPr>
-                    <a:xfrm>
-                      <a:off x="0" y="0"/>
-                      <a:ext cx="5029200" cy="2931562"/>
-                    </a:xfrm>
-                    <a:prstGeom prst="rect"/>
-                  </pic:spPr>
-                </pic:pic>
-              </a:graphicData>
-            </a:graphic>
-          </wp:inline>
-        </w:drawing>
-      </w:r>
-    </w:p>
-    <w:p>
-      <w:r>
-        <w:t>图 6-2 资源上传流程时序图</w:t>
-      </w:r>
-    </w:p>
-    <w:p>
-      <w:r>
-        <w:drawing>
-          <wp:inline xmlns:a="http://schemas.openxmlformats.org/drawingml/2006/main" xmlns:pic="http://schemas.openxmlformats.org/drawingml/2006/picture">
-            <wp:extent cx="5029200" cy="9764559"/>
-            <wp:docPr id="7" name="Picture 7"/>
-            <wp:cNvGraphicFramePr>
-              <a:graphicFrameLocks noChangeAspect="1"/>
-            </wp:cNvGraphicFramePr>
-            <a:graphic>
-              <a:graphicData uri="http://schemas.openxmlformats.org/drawingml/2006/picture">
-                <pic:pic>
-                  <pic:nvPicPr>
-                    <pic:cNvPr id="0" name="late_policy_flow.png"/>
-                    <pic:cNvPicPr/>
-                  </pic:nvPicPr>
-                  <pic:blipFill>
-                    <a:blip r:embed="rId15"/>
-                    <a:stretch>
-                      <a:fillRect/>
-                    </a:stretch>
-                  </pic:blipFill>
-                  <pic:spPr>
-                    <a:xfrm>
-                      <a:off x="0" y="0"/>
-                      <a:ext cx="5029200" cy="9764559"/>
-                    </a:xfrm>
-                    <a:prstGeom prst="rect"/>
-                  </pic:spPr>
-                </pic:pic>
-              </a:graphicData>
-            </a:graphic>
-          </wp:inline>
-        </w:drawing>
-      </w:r>
-    </w:p>
-    <w:p>
-      <w:r>
-        <w:t>图 6-3 迟交扣分决策流程图</w:t>
-      </w:r>
-    </w:p>
-    <w:p>
-      <w:pPr>
-        <w:pStyle w:val="Heading2"/>
-      </w:pPr>
-      <w:r>
-        <w:t>6.5 配置与参数设计</w:t>
-      </w:r>
-    </w:p>
-    <w:p>
-      <w:pPr>
-        <w:pStyle w:val="ListBullet"/>
-      </w:pPr>
-      <w:r>
-        <w:t>使用 Spring Cloud Config 管理环境变量，区分 dev/test/prod 三套环境。</w:t>
-      </w:r>
-    </w:p>
-    <w:p>
-      <w:pPr>
-        <w:pStyle w:val="ListBullet"/>
-      </w:pPr>
-      <w:r>
-        <w:t>作业提交大小限制可在配置中心动态调整，默认 1GB。</w:t>
-      </w:r>
-    </w:p>
-    <w:p>
-      <w:pPr>
-        <w:pStyle w:val="ListBullet"/>
-      </w:pPr>
-      <w:r>
-        <w:t>通知发送频率采用限流参数（默认每分钟 200 封邮件/500 条站内信）。</w:t>
-      </w:r>
-    </w:p>
-    <w:p>
-      <w:pPr>
-        <w:pStyle w:val="ListBullet"/>
-      </w:pPr>
-      <w:r>
-        <w:t>缓存策略：用户权限缓存 5 分钟，课程概览缓存 2 分钟，仪表盘缓存 10 分钟。</w:t>
-      </w:r>
-    </w:p>
-    <w:p>
-      <w:pPr>
-        <w:pStyle w:val="Heading2"/>
-      </w:pPr>
-      <w:r>
-        <w:t>6.6 安全设计</w:t>
-      </w:r>
-    </w:p>
-    <w:p>
-      <w:pPr>
-        <w:pStyle w:val="ListBullet"/>
-      </w:pPr>
-      <w:r>
-        <w:t>统一身份认证与 JWT 签发，刷新令牌有效期 7 天，访问令牌 2 小时。</w:t>
-      </w:r>
-    </w:p>
-    <w:p>
-      <w:pPr>
-        <w:pStyle w:val="ListBullet"/>
-      </w:pPr>
-      <w:r>
-        <w:t>RBAC 权限树按课程与功能维度控制，关键接口需教师/管理员角色。</w:t>
-      </w:r>
-    </w:p>
-    <w:p>
-      <w:pPr>
-        <w:pStyle w:val="ListBullet"/>
-      </w:pPr>
-      <w:r>
-        <w:t>敏感操作（如成绩修改、数据导出）启用二次校验与审计日志。</w:t>
-      </w:r>
-    </w:p>
-    <w:p>
-      <w:pPr>
-        <w:pStyle w:val="ListBullet"/>
-      </w:pPr>
-      <w:r>
-        <w:t>静态数据加密：使用 PostgreSQL pgcrypto 对敏感字段加密。</w:t>
-      </w:r>
-    </w:p>
-    <w:p>
-      <w:pPr>
-        <w:pStyle w:val="ListBullet"/>
-      </w:pPr>
-      <w:r>
-        <w:t>网络安全：Kubernetes 命名空间隔离，服务间通信启用 mTLS。</w:t>
+        <w:t>所有接口返回统一结构 {code, message, data, traceId}，并配合限流、重试与熔断策略。</w:t>
       </w:r>
     </w:p>
     <w:p>
@@ -1891,7 +1836,7 @@
       <w:r>
         <w:drawing>
           <wp:inline xmlns:a="http://schemas.openxmlformats.org/drawingml/2006/main" xmlns:pic="http://schemas.openxmlformats.org/drawingml/2006/picture">
-            <wp:extent cx="5486400" cy="1588537"/>
+            <wp:extent cx="5486400" cy="1126671"/>
             <wp:docPr id="8" name="Picture 8"/>
             <wp:cNvGraphicFramePr>
               <a:graphicFrameLocks noChangeAspect="1"/>
@@ -1912,7 +1857,7 @@
                   <pic:spPr>
                     <a:xfrm>
                       <a:off x="0" y="0"/>
-                      <a:ext cx="5486400" cy="1588537"/>
+                      <a:ext cx="5486400" cy="1126671"/>
                     </a:xfrm>
                     <a:prstGeom prst="rect"/>
                   </pic:spPr>
@@ -1926,14 +1871,6 @@
     <w:p>
       <w:r>
         <w:t>图 7-1 数据库 ER 图</w:t>
-      </w:r>
-    </w:p>
-    <w:p>
-      <w:pPr>
-        <w:pStyle w:val="Heading2"/>
-      </w:pPr>
-      <w:r>
-        <w:t>7.2 数据字典（节选）</w:t>
       </w:r>
     </w:p>
     <w:p>
@@ -2161,7 +2098,7 @@
           </w:tcPr>
           <w:p>
             <w:r>
-              <w:t>作业说明支持 Markdown</w:t>
+              <w:t>作业说明，支持 Markdown</w:t>
             </w:r>
           </w:p>
         </w:tc>
@@ -2330,6 +2267,48 @@
           <w:p>
             <w:r>
               <w:t>迟交策略</w:t>
+            </w:r>
+          </w:p>
+        </w:tc>
+      </w:tr>
+      <w:tr>
+        <w:tc>
+          <w:tcPr>
+            <w:tcW w:type="dxa" w:w="2160"/>
+          </w:tcPr>
+          <w:p>
+            <w:r>
+              <w:t>rubric_id</w:t>
+            </w:r>
+          </w:p>
+        </w:tc>
+        <w:tc>
+          <w:tcPr>
+            <w:tcW w:type="dxa" w:w="2160"/>
+          </w:tcPr>
+          <w:p>
+            <w:r>
+              <w:t>UUID</w:t>
+            </w:r>
+          </w:p>
+        </w:tc>
+        <w:tc>
+          <w:tcPr>
+            <w:tcW w:type="dxa" w:w="2160"/>
+          </w:tcPr>
+          <w:p>
+            <w:r>
+              <w:t>FK -&gt; rubric.id</w:t>
+            </w:r>
+          </w:p>
+        </w:tc>
+        <w:tc>
+          <w:tcPr>
+            <w:tcW w:type="dxa" w:w="2160"/>
+          </w:tcPr>
+          <w:p>
+            <w:r>
+              <w:t>评分 Rubric</w:t>
             </w:r>
           </w:p>
         </w:tc>
@@ -2770,7 +2749,7 @@
           </w:tcPr>
           <w:p>
             <w:r>
-              <w:t>教师整体反馈</w:t>
+              <w:t>整体反馈</w:t>
             </w:r>
           </w:p>
         </w:tc>
@@ -2813,6 +2792,48 @@
           <w:p>
             <w:r>
               <w:t>提交版本号</w:t>
+            </w:r>
+          </w:p>
+        </w:tc>
+      </w:tr>
+      <w:tr>
+        <w:tc>
+          <w:tcPr>
+            <w:tcW w:type="dxa" w:w="2160"/>
+          </w:tcPr>
+          <w:p>
+            <w:r>
+              <w:t>editor_snapshot</w:t>
+            </w:r>
+          </w:p>
+        </w:tc>
+        <w:tc>
+          <w:tcPr>
+            <w:tcW w:type="dxa" w:w="2160"/>
+          </w:tcPr>
+          <w:p>
+            <w:r>
+              <w:t>JSONB</w:t>
+            </w:r>
+          </w:p>
+        </w:tc>
+        <w:tc>
+          <w:tcPr>
+            <w:tcW w:type="dxa" w:w="2160"/>
+          </w:tcPr>
+          <w:p>
+            <w:r>
+              <w:t>NULL</w:t>
+            </w:r>
+          </w:p>
+        </w:tc>
+        <w:tc>
+          <w:tcPr>
+            <w:tcW w:type="dxa" w:w="2160"/>
+          </w:tcPr>
+          <w:p>
+            <w:r>
+              <w:t>在线编辑器内容快照</w:t>
             </w:r>
           </w:p>
         </w:tc>
@@ -3117,7 +3138,7 @@
           </w:tcPr>
           <w:p>
             <w:r>
-              <w:t>CHECK(channel IN ('INBOX','EMAIL','WECOM'))</w:t>
+              <w:t>CHECK(channel IN ('INBOX','EMAIL','WECOM','SMS'))</w:t>
             </w:r>
           </w:p>
         </w:tc>
@@ -3258,6 +3279,447 @@
           </w:p>
         </w:tc>
       </w:tr>
+      <w:tr>
+        <w:tc>
+          <w:tcPr>
+            <w:tcW w:type="dxa" w:w="2160"/>
+          </w:tcPr>
+          <w:p>
+            <w:r>
+              <w:t>trace_id</w:t>
+            </w:r>
+          </w:p>
+        </w:tc>
+        <w:tc>
+          <w:tcPr>
+            <w:tcW w:type="dxa" w:w="2160"/>
+          </w:tcPr>
+          <w:p>
+            <w:r>
+              <w:t>VARCHAR(64)</w:t>
+            </w:r>
+          </w:p>
+        </w:tc>
+        <w:tc>
+          <w:tcPr>
+            <w:tcW w:type="dxa" w:w="2160"/>
+          </w:tcPr>
+          <w:p>
+            <w:r>
+              <w:t>NOT NULL</w:t>
+            </w:r>
+          </w:p>
+        </w:tc>
+        <w:tc>
+          <w:tcPr>
+            <w:tcW w:type="dxa" w:w="2160"/>
+          </w:tcPr>
+          <w:p>
+            <w:r>
+              <w:t>链路追踪 ID</w:t>
+            </w:r>
+          </w:p>
+        </w:tc>
+      </w:tr>
+    </w:tbl>
+    <w:p>
+      <w:pPr>
+        <w:pStyle w:val="Heading3"/>
+      </w:pPr>
+      <w:r>
+        <w:t>discussion_post 表</w:t>
+      </w:r>
+    </w:p>
+    <w:tbl>
+      <w:tblPr>
+        <w:tblStyle w:val="LightGrid-Accent1"/>
+        <w:tblW w:type="auto" w:w="0"/>
+        <w:tblLook w:firstColumn="1" w:firstRow="1" w:lastColumn="0" w:lastRow="0" w:noHBand="0" w:noVBand="1" w:val="04A0"/>
+      </w:tblPr>
+      <w:tblGrid>
+        <w:gridCol w:w="2160"/>
+        <w:gridCol w:w="2160"/>
+        <w:gridCol w:w="2160"/>
+        <w:gridCol w:w="2160"/>
+      </w:tblGrid>
+      <w:tr>
+        <w:tc>
+          <w:tcPr>
+            <w:tcW w:type="dxa" w:w="2160"/>
+          </w:tcPr>
+          <w:p>
+            <w:r>
+              <w:t>字段名</w:t>
+            </w:r>
+          </w:p>
+        </w:tc>
+        <w:tc>
+          <w:tcPr>
+            <w:tcW w:type="dxa" w:w="2160"/>
+          </w:tcPr>
+          <w:p>
+            <w:r>
+              <w:t>类型</w:t>
+            </w:r>
+          </w:p>
+        </w:tc>
+        <w:tc>
+          <w:tcPr>
+            <w:tcW w:type="dxa" w:w="2160"/>
+          </w:tcPr>
+          <w:p>
+            <w:r>
+              <w:t>约束</w:t>
+            </w:r>
+          </w:p>
+        </w:tc>
+        <w:tc>
+          <w:tcPr>
+            <w:tcW w:type="dxa" w:w="2160"/>
+          </w:tcPr>
+          <w:p>
+            <w:r>
+              <w:t>说明</w:t>
+            </w:r>
+          </w:p>
+        </w:tc>
+      </w:tr>
+      <w:tr>
+        <w:tc>
+          <w:tcPr>
+            <w:tcW w:type="dxa" w:w="2160"/>
+          </w:tcPr>
+          <w:p>
+            <w:r>
+              <w:t>id</w:t>
+            </w:r>
+          </w:p>
+        </w:tc>
+        <w:tc>
+          <w:tcPr>
+            <w:tcW w:type="dxa" w:w="2160"/>
+          </w:tcPr>
+          <w:p>
+            <w:r>
+              <w:t>UUID</w:t>
+            </w:r>
+          </w:p>
+        </w:tc>
+        <w:tc>
+          <w:tcPr>
+            <w:tcW w:type="dxa" w:w="2160"/>
+          </w:tcPr>
+          <w:p>
+            <w:r>
+              <w:t>PK</w:t>
+            </w:r>
+          </w:p>
+        </w:tc>
+        <w:tc>
+          <w:tcPr>
+            <w:tcW w:type="dxa" w:w="2160"/>
+          </w:tcPr>
+          <w:p>
+            <w:r>
+              <w:t>唯一标识</w:t>
+            </w:r>
+          </w:p>
+        </w:tc>
+      </w:tr>
+      <w:tr>
+        <w:tc>
+          <w:tcPr>
+            <w:tcW w:type="dxa" w:w="2160"/>
+          </w:tcPr>
+          <w:p>
+            <w:r>
+              <w:t>topic_id</w:t>
+            </w:r>
+          </w:p>
+        </w:tc>
+        <w:tc>
+          <w:tcPr>
+            <w:tcW w:type="dxa" w:w="2160"/>
+          </w:tcPr>
+          <w:p>
+            <w:r>
+              <w:t>UUID</w:t>
+            </w:r>
+          </w:p>
+        </w:tc>
+        <w:tc>
+          <w:tcPr>
+            <w:tcW w:type="dxa" w:w="2160"/>
+          </w:tcPr>
+          <w:p>
+            <w:r>
+              <w:t>FK -&gt; discussion_topic.id</w:t>
+            </w:r>
+          </w:p>
+        </w:tc>
+        <w:tc>
+          <w:tcPr>
+            <w:tcW w:type="dxa" w:w="2160"/>
+          </w:tcPr>
+          <w:p>
+            <w:r>
+              <w:t>所属话题</w:t>
+            </w:r>
+          </w:p>
+        </w:tc>
+      </w:tr>
+      <w:tr>
+        <w:tc>
+          <w:tcPr>
+            <w:tcW w:type="dxa" w:w="2160"/>
+          </w:tcPr>
+          <w:p>
+            <w:r>
+              <w:t>author_id</w:t>
+            </w:r>
+          </w:p>
+        </w:tc>
+        <w:tc>
+          <w:tcPr>
+            <w:tcW w:type="dxa" w:w="2160"/>
+          </w:tcPr>
+          <w:p>
+            <w:r>
+              <w:t>UUID</w:t>
+            </w:r>
+          </w:p>
+        </w:tc>
+        <w:tc>
+          <w:tcPr>
+            <w:tcW w:type="dxa" w:w="2160"/>
+          </w:tcPr>
+          <w:p>
+            <w:r>
+              <w:t>FK -&gt; user.id</w:t>
+            </w:r>
+          </w:p>
+        </w:tc>
+        <w:tc>
+          <w:tcPr>
+            <w:tcW w:type="dxa" w:w="2160"/>
+          </w:tcPr>
+          <w:p>
+            <w:r>
+              <w:t>作者</w:t>
+            </w:r>
+          </w:p>
+        </w:tc>
+      </w:tr>
+      <w:tr>
+        <w:tc>
+          <w:tcPr>
+            <w:tcW w:type="dxa" w:w="2160"/>
+          </w:tcPr>
+          <w:p>
+            <w:r>
+              <w:t>content</w:t>
+            </w:r>
+          </w:p>
+        </w:tc>
+        <w:tc>
+          <w:tcPr>
+            <w:tcW w:type="dxa" w:w="2160"/>
+          </w:tcPr>
+          <w:p>
+            <w:r>
+              <w:t>TEXT</w:t>
+            </w:r>
+          </w:p>
+        </w:tc>
+        <w:tc>
+          <w:tcPr>
+            <w:tcW w:type="dxa" w:w="2160"/>
+          </w:tcPr>
+          <w:p>
+            <w:r>
+              <w:t>NOT NULL</w:t>
+            </w:r>
+          </w:p>
+        </w:tc>
+        <w:tc>
+          <w:tcPr>
+            <w:tcW w:type="dxa" w:w="2160"/>
+          </w:tcPr>
+          <w:p>
+            <w:r>
+              <w:t>帖子内容</w:t>
+            </w:r>
+          </w:p>
+        </w:tc>
+      </w:tr>
+      <w:tr>
+        <w:tc>
+          <w:tcPr>
+            <w:tcW w:type="dxa" w:w="2160"/>
+          </w:tcPr>
+          <w:p>
+            <w:r>
+              <w:t>reply_to</w:t>
+            </w:r>
+          </w:p>
+        </w:tc>
+        <w:tc>
+          <w:tcPr>
+            <w:tcW w:type="dxa" w:w="2160"/>
+          </w:tcPr>
+          <w:p>
+            <w:r>
+              <w:t>UUID</w:t>
+            </w:r>
+          </w:p>
+        </w:tc>
+        <w:tc>
+          <w:tcPr>
+            <w:tcW w:type="dxa" w:w="2160"/>
+          </w:tcPr>
+          <w:p>
+            <w:r>
+              <w:t>FK -&gt; discussion_post.id</w:t>
+            </w:r>
+          </w:p>
+        </w:tc>
+        <w:tc>
+          <w:tcPr>
+            <w:tcW w:type="dxa" w:w="2160"/>
+          </w:tcPr>
+          <w:p>
+            <w:r>
+              <w:t>回复目标</w:t>
+            </w:r>
+          </w:p>
+        </w:tc>
+      </w:tr>
+      <w:tr>
+        <w:tc>
+          <w:tcPr>
+            <w:tcW w:type="dxa" w:w="2160"/>
+          </w:tcPr>
+          <w:p>
+            <w:r>
+              <w:t>is_pinned</w:t>
+            </w:r>
+          </w:p>
+        </w:tc>
+        <w:tc>
+          <w:tcPr>
+            <w:tcW w:type="dxa" w:w="2160"/>
+          </w:tcPr>
+          <w:p>
+            <w:r>
+              <w:t>BOOLEAN</w:t>
+            </w:r>
+          </w:p>
+        </w:tc>
+        <w:tc>
+          <w:tcPr>
+            <w:tcW w:type="dxa" w:w="2160"/>
+          </w:tcPr>
+          <w:p>
+            <w:r>
+              <w:t>DEFAULT FALSE</w:t>
+            </w:r>
+          </w:p>
+        </w:tc>
+        <w:tc>
+          <w:tcPr>
+            <w:tcW w:type="dxa" w:w="2160"/>
+          </w:tcPr>
+          <w:p>
+            <w:r>
+              <w:t>是否置顶</w:t>
+            </w:r>
+          </w:p>
+        </w:tc>
+      </w:tr>
+      <w:tr>
+        <w:tc>
+          <w:tcPr>
+            <w:tcW w:type="dxa" w:w="2160"/>
+          </w:tcPr>
+          <w:p>
+            <w:r>
+              <w:t>created_at</w:t>
+            </w:r>
+          </w:p>
+        </w:tc>
+        <w:tc>
+          <w:tcPr>
+            <w:tcW w:type="dxa" w:w="2160"/>
+          </w:tcPr>
+          <w:p>
+            <w:r>
+              <w:t>TIMESTAMP</w:t>
+            </w:r>
+          </w:p>
+        </w:tc>
+        <w:tc>
+          <w:tcPr>
+            <w:tcW w:type="dxa" w:w="2160"/>
+          </w:tcPr>
+          <w:p>
+            <w:r>
+              <w:t>NOT NULL</w:t>
+            </w:r>
+          </w:p>
+        </w:tc>
+        <w:tc>
+          <w:tcPr>
+            <w:tcW w:type="dxa" w:w="2160"/>
+          </w:tcPr>
+          <w:p>
+            <w:r>
+              <w:t>创建时间</w:t>
+            </w:r>
+          </w:p>
+        </w:tc>
+      </w:tr>
+      <w:tr>
+        <w:tc>
+          <w:tcPr>
+            <w:tcW w:type="dxa" w:w="2160"/>
+          </w:tcPr>
+          <w:p>
+            <w:r>
+              <w:t>updated_at</w:t>
+            </w:r>
+          </w:p>
+        </w:tc>
+        <w:tc>
+          <w:tcPr>
+            <w:tcW w:type="dxa" w:w="2160"/>
+          </w:tcPr>
+          <w:p>
+            <w:r>
+              <w:t>TIMESTAMP</w:t>
+            </w:r>
+          </w:p>
+        </w:tc>
+        <w:tc>
+          <w:tcPr>
+            <w:tcW w:type="dxa" w:w="2160"/>
+          </w:tcPr>
+          <w:p>
+            <w:r>
+              <w:t>NULL</w:t>
+            </w:r>
+          </w:p>
+        </w:tc>
+        <w:tc>
+          <w:tcPr>
+            <w:tcW w:type="dxa" w:w="2160"/>
+          </w:tcPr>
+          <w:p>
+            <w:r>
+              <w:t>更新时间</w:t>
+            </w:r>
+          </w:p>
+        </w:tc>
+      </w:tr>
     </w:tbl>
     <w:p>
       <w:pPr>
@@ -3272,7 +3734,7 @@
         <w:pStyle w:val="ListBullet"/>
       </w:pPr>
       <w:r>
-        <w:t>外键策略：课程删除触发层级逻辑检查，防止误删；成绩相关表禁止级联删除。</w:t>
+        <w:t>外键策略：课程删除需通过审批流程，成绩相关表禁止级联删除；审计记录独立存储。</w:t>
       </w:r>
     </w:p>
     <w:p>
@@ -3280,7 +3742,7 @@
         <w:pStyle w:val="ListBullet"/>
       </w:pPr>
       <w:r>
-        <w:t>索引策略：submission(assignment_id, student_id)、resource(course_id, type)、audit_log(trace_id)、notice(status, scheduled_at)。</w:t>
+        <w:t>索引策略：submission(assignment_id, student_id)、resource(course_id, type)、discussion_post(topic_id, created_at DESC)、audit_log(trace_id)。</w:t>
       </w:r>
     </w:p>
     <w:p>
@@ -3288,7 +3750,7 @@
         <w:pStyle w:val="ListBullet"/>
       </w:pPr>
       <w:r>
-        <w:t>分区策略：audit_log 按月分区，dashboard_metric 按课程与日期分区，支持快速归档。</w:t>
+        <w:t>分区策略：audit_log 按月分区，dashboard_metric 以课程+日期分区，notice 按发送月份分区。</w:t>
       </w:r>
     </w:p>
     <w:p>
@@ -3296,7 +3758,7 @@
         <w:pStyle w:val="ListBullet"/>
       </w:pPr>
       <w:r>
-        <w:t>缓存策略：用户权限与课程概览缓存在 Redis，采用双写失效模式。</w:t>
+        <w:t>缓存策略：用户权限、课程概览、热门资源、仪表盘使用 Redis，采用双写失效与异步刷新。</w:t>
       </w:r>
     </w:p>
     <w:p>
@@ -3304,7 +3766,7 @@
         <w:pStyle w:val="ListBullet"/>
       </w:pPr>
       <w:r>
-        <w:t>备份策略：PostgreSQL 使用 WAL + 每日全量快照，对象存储开启版本控制并复制到异地。</w:t>
+        <w:t>备份策略：PostgreSQL WAL + 每日全量，S3 对象存储开启版本控制并复制至异地桶。</w:t>
       </w:r>
     </w:p>
     <w:p>
@@ -3320,7 +3782,7 @@
         <w:pStyle w:val="ListBullet"/>
       </w:pPr>
       <w:r>
-        <w:t>Kubernetes 部署：各服务以 Deployment 形式部署 2 副本，使用 HPA 按 CPU/内存自动扩缩容。</w:t>
+        <w:t>Kubernetes：各服务以 Deployment 形式部署，默认 2 副本，启用 HPA 按 CPU/内存/自定义指标自动扩缩容。</w:t>
       </w:r>
     </w:p>
     <w:p>
@@ -3328,7 +3790,7 @@
         <w:pStyle w:val="ListBullet"/>
       </w:pPr>
       <w:r>
-        <w:t>CI/CD 流程：提交代码后触发单元测试、静态扫描、镜像构建，审批后自动部署至测试环境，再通过 Helm 升级到生产。</w:t>
+        <w:t>CI/CD：代码提交触发流水线，执行单元测试、静态扫描、镜像构建、Helm Chart 打包，审批通过后滚动升级。</w:t>
       </w:r>
     </w:p>
     <w:p>
@@ -3336,7 +3798,7 @@
         <w:pStyle w:val="ListBullet"/>
       </w:pPr>
       <w:r>
-        <w:t>环境配置：dev/test 共用 PostgreSQL 集群的不同 schema，prod 独立集群并启用主从复制。</w:t>
+        <w:t>环境配置：dev/test 共享集群不同命名空间，prod 独立集群并启用主从复制与只读实例。</w:t>
       </w:r>
     </w:p>
     <w:p>
@@ -3344,7 +3806,7 @@
         <w:pStyle w:val="ListBullet"/>
       </w:pPr>
       <w:r>
-        <w:t>监控告警：Prometheus 监控性能与业务指标，Grafana 设置告警规则，通过企业微信机器人推送。</w:t>
+        <w:t>监控告警：Prometheus 采集性能/业务指标，AlertManager 通过企业微信群机器人推送，Grafana Dashboard 持续可视化。</w:t>
       </w:r>
     </w:p>
     <w:p>
@@ -3360,7 +3822,7 @@
         <w:pStyle w:val="ListBullet"/>
       </w:pPr>
       <w:r>
-        <w:t>测试范围：覆盖认证、课程、作业、通知、分析模块，重点验证核心业务流程与异常场景。</w:t>
+        <w:t>测试范围：覆盖认证、课程、资源、作业、通知、讨论、分析模块，验证核心流程和异常场景。</w:t>
       </w:r>
     </w:p>
     <w:p>
@@ -3368,7 +3830,7 @@
         <w:pStyle w:val="ListBullet"/>
       </w:pPr>
       <w:r>
-        <w:t>测试类型：单元测试、接口测试、UI 自动化测试、性能测试、安全测试。</w:t>
+        <w:t>测试类型：单元测试、接口测试、UI 自动化、性能测试、安全测试（渗透、漏洞扫描）。</w:t>
       </w:r>
     </w:p>
     <w:p>
@@ -3376,7 +3838,7 @@
         <w:pStyle w:val="ListBullet"/>
       </w:pPr>
       <w:r>
-        <w:t>测试环境：与生产一致的 Kubernetes 集群，使用匿名脱敏数据。</w:t>
+        <w:t>测试环境：与生产一致的 Kubernetes 集群，使用脱敏数据与 Mock 服务。</w:t>
       </w:r>
     </w:p>
     <w:p>
@@ -3384,7 +3846,7 @@
         <w:pStyle w:val="ListBullet"/>
       </w:pPr>
       <w:r>
-        <w:t>测试指标：单元测试覆盖率≥70%，关键接口响应在 SLA 内，性能测试满足 500 并发指标，无高危安全漏洞。</w:t>
+        <w:t>测试指标：单元测试覆盖率≥70%，关键接口响应满足 SLA，无高危安全漏洞，性能测试达标。</w:t>
       </w:r>
     </w:p>
     <w:p>
@@ -3392,7 +3854,7 @@
         <w:pStyle w:val="ListBullet"/>
       </w:pPr>
       <w:r>
-        <w:t>交付物：测试计划、测试用例、测试报告、缺陷列表与修复记录。</w:t>
+        <w:t>交付物：测试计划、测试用例、测试报告、缺陷列表与修复记录、回归结果。</w:t>
       </w:r>
     </w:p>
     <w:p>
@@ -3494,7 +3956,7 @@
           </w:tcPr>
           <w:p>
             <w:r>
-              <w:t>与教务中心保持沟通，封装适配层并提前准备 Mock。</w:t>
+              <w:t>封装适配层，与教务中心建立变更通知机制，提供模拟接口。</w:t>
             </w:r>
           </w:p>
         </w:tc>
@@ -3536,7 +3998,7 @@
           </w:tcPr>
           <w:p>
             <w:r>
-              <w:t>使用缓存与队列，配置弹性扩容与性能压测。</w:t>
+              <w:t>启用缓存、限流、异步队列，提前进行压力测试与容量预估。</w:t>
             </w:r>
           </w:p>
         </w:tc>
@@ -3558,7 +4020,7 @@
           </w:tcPr>
           <w:p>
             <w:r>
-              <w:t>提醒未送达</w:t>
+              <w:t>提醒无法送达</w:t>
             </w:r>
           </w:p>
         </w:tc>
@@ -3578,7 +4040,7 @@
           </w:tcPr>
           <w:p>
             <w:r>
-              <w:t>多渠道冗余与失败重试，异常告警并人工补发。</w:t>
+              <w:t>多渠道冗余，失败重试与人工补发，监控发送成功率。</w:t>
             </w:r>
           </w:p>
         </w:tc>
@@ -3590,7 +4052,7 @@
           </w:tcPr>
           <w:p>
             <w:r>
-              <w:t>数据泄露风险</w:t>
+              <w:t>敏感数据泄露</w:t>
             </w:r>
           </w:p>
         </w:tc>
@@ -3600,7 +4062,7 @@
           </w:tcPr>
           <w:p>
             <w:r>
-              <w:t>敏感信息外泄</w:t>
+              <w:t>造成合规风险</w:t>
             </w:r>
           </w:p>
         </w:tc>
@@ -3620,7 +4082,49 @@
           </w:tcPr>
           <w:p>
             <w:r>
-              <w:t>加强权限审计、加密存储与入侵检测。</w:t>
+              <w:t>严格 RBAC、数据脱敏、加密存储、审计日志与入侵检测。</w:t>
+            </w:r>
+          </w:p>
+        </w:tc>
+      </w:tr>
+      <w:tr>
+        <w:tc>
+          <w:tcPr>
+            <w:tcW w:type="dxa" w:w="2160"/>
+          </w:tcPr>
+          <w:p>
+            <w:r>
+              <w:t>病毒文件上传</w:t>
+            </w:r>
+          </w:p>
+        </w:tc>
+        <w:tc>
+          <w:tcPr>
+            <w:tcW w:type="dxa" w:w="2160"/>
+          </w:tcPr>
+          <w:p>
+            <w:r>
+              <w:t>危害平台安全</w:t>
+            </w:r>
+          </w:p>
+        </w:tc>
+        <w:tc>
+          <w:tcPr>
+            <w:tcW w:type="dxa" w:w="2160"/>
+          </w:tcPr>
+          <w:p>
+            <w:r>
+              <w:t>低</w:t>
+            </w:r>
+          </w:p>
+        </w:tc>
+        <w:tc>
+          <w:tcPr>
+            <w:tcW w:type="dxa" w:w="2160"/>
+          </w:tcPr>
+          <w:p>
+            <w:r>
+              <w:t>上传阶段启用病毒扫描，隔离可疑文件并通知管理员。</w:t>
             </w:r>
           </w:p>
         </w:tc>
@@ -3647,7 +4151,7 @@
         <w:pStyle w:val="ListBullet"/>
       </w:pPr>
       <w:r>
-        <w:t>目标：验证登录、课程列表、作业流程等核心场景体验是否满足需求。</w:t>
+        <w:t>目标：验证登录、课程列表、作业流程、资源预览等核心场景体验是否满足需求。</w:t>
       </w:r>
     </w:p>
     <w:p>
@@ -3655,7 +4159,7 @@
         <w:pStyle w:val="ListBullet"/>
       </w:pPr>
       <w:r>
-        <w:t>参与者：产品负责人、交互设计师、开发代表、教师代表。</w:t>
+        <w:t>参与者：产品负责人、交互设计师、开发代表、教师代表、技术支持。</w:t>
       </w:r>
     </w:p>
     <w:p>
@@ -3663,7 +4167,7 @@
         <w:pStyle w:val="ListBullet"/>
       </w:pPr>
       <w:r>
-        <w:t>资料：高保真原型、操作说明、验收标准清单。</w:t>
+        <w:t>资料：高保真原型、操作说明、验收标准清单、可用性测试脚本。</w:t>
       </w:r>
     </w:p>
     <w:p>
@@ -3671,7 +4175,7 @@
         <w:pStyle w:val="ListBullet"/>
       </w:pPr>
       <w:r>
-        <w:t>流程：演示 -&gt; 角色体验 -&gt; 记录问题 -&gt; 输出《原型评审纪要》。</w:t>
+        <w:t>流程：原型演示 -&gt; 角色体验 -&gt; 问题记录 -&gt; 输出《原型评审纪要》。</w:t>
       </w:r>
     </w:p>
     <w:p>
@@ -3679,7 +4183,7 @@
         <w:pStyle w:val="ListBullet"/>
       </w:pPr>
       <w:r>
-        <w:t>成功标准：所有必备流程获得确认，问题分配责任人和解决时间。</w:t>
+        <w:t>成功标准：必备流程确认，问题分配责任人与解决期限。</w:t>
       </w:r>
     </w:p>
     <w:p>
@@ -3695,7 +4199,7 @@
         <w:pStyle w:val="ListBullet"/>
       </w:pPr>
       <w:r>
-        <w:t>目标：锁定 Sprint1 范围内的接口字段、错误码、鉴权策略与限流规范。</w:t>
+        <w:t>目标：锁定 Sprint1 范围内接口字段、错误码、鉴权策略、限流参数与审计要求。</w:t>
       </w:r>
     </w:p>
     <w:p>
@@ -3703,7 +4207,7 @@
         <w:pStyle w:val="ListBullet"/>
       </w:pPr>
       <w:r>
-        <w:t>参与者：前后端负责人、测试代表、运维代表。</w:t>
+        <w:t>参与者：前后端负责人、测试代表、运维代表、架构师。</w:t>
       </w:r>
     </w:p>
     <w:p>
@@ -3711,7 +4215,7 @@
         <w:pStyle w:val="ListBullet"/>
       </w:pPr>
       <w:r>
-        <w:t>资料：OpenAPI 规范、接口 Mock、鉴权方案、限流参数提案。</w:t>
+        <w:t>资料：OpenAPI 规范、接口 Mock、鉴权方案、限流配置、审计清单。</w:t>
       </w:r>
     </w:p>
     <w:p>
@@ -3719,7 +4223,7 @@
         <w:pStyle w:val="ListBullet"/>
       </w:pPr>
       <w:r>
-        <w:t>流程：逐条审阅 -&gt; 校验安全策略 -&gt; 记录改动 -&gt; 更新文档与 Mock。</w:t>
+        <w:t>流程：逐条审阅 -&gt; 校验安全策略 -&gt; 记录改动 -&gt; 更新文档与 Mock -&gt; 输出评审纪要。</w:t>
       </w:r>
     </w:p>
     <w:p>
@@ -3727,12 +4231,12 @@
         <w:pStyle w:val="ListBullet"/>
       </w:pPr>
       <w:r>
-        <w:t>成功标准：形成评审纪要，OpenAPI 文档版本 v1.0.0-sprint1 并归档。</w:t>
+        <w:t>成功标准：OpenAPI 文档版本 v1.0.0-sprint1 定稿并归档，相关问题进入待办。</w:t>
       </w:r>
     </w:p>
     <w:p>
       <w:r>
-        <w:t>完成原型走查与 API 评审后，即可进入 Sprint1 开发阶段，并依据本说明书进行设计实现。</w:t>
+        <w:t>完成原型走查与 API 评审后，可正式进入 Sprint1 开发，并以本说明书作为设计与评审依据。</w:t>
       </w:r>
     </w:p>
     <w:sectPr>

</xml_diff>